<commit_message>
Proje 2: SQL Agent eksikliği script yöntemiyle çözüldü ve rapora eklendi
</commit_message>
<xml_diff>
--- a/BLM4522_Proje2/Rapor1.docx
+++ b/BLM4522_Proje2/Rapor1.docx
@@ -50,6 +50,9 @@
     </w:p>
     <w:p>
       <w:r>
+        <w:rPr>
+          <w:noProof/>
+        </w:rPr>
         <w:drawing>
           <wp:inline distT="0" distB="0" distL="0" distR="0" wp14:anchorId="13AC36E0" wp14:editId="380C03AC">
             <wp:extent cx="1729890" cy="4541914"/>
@@ -113,14 +116,7 @@
           <w:b/>
           <w:bCs/>
         </w:rPr>
-        <w:t xml:space="preserve">Adım 2: </w:t>
-      </w:r>
-      <w:r>
-        <w:rPr>
-          <w:b/>
-          <w:bCs/>
-        </w:rPr>
-        <w:t xml:space="preserve">Manuel Tam Yedek (Full </w:t>
+        <w:t xml:space="preserve">Adım 2: Manuel Tam Yedek (Full </w:t>
       </w:r>
       <w:proofErr w:type="spellStart"/>
       <w:r>
@@ -160,6 +156,9 @@
         <w:t xml:space="preserve"> tam yedeğini manuel olarak aldım. Yedekleme dosyasının bütünlüğünü kontrol etmek için SSMS üzerinden doğrulama adımını da tamamladım. Şu an elimde sistem tarafından onaylanmış, hatasız bir yedek dosyası mevcut.</w:t>
       </w:r>
       <w:r>
+        <w:rPr>
+          <w:noProof/>
+        </w:rPr>
         <w:drawing>
           <wp:inline distT="0" distB="0" distL="0" distR="0" wp14:anchorId="49B21290" wp14:editId="25AD0D32">
             <wp:extent cx="5760720" cy="4797425"/>
@@ -198,11 +197,376 @@
       </w:r>
     </w:p>
     <w:p/>
+    <w:p>
+      <w:r>
+        <w:t>05.04.2026</w:t>
+      </w:r>
+    </w:p>
+    <w:p>
+      <w:pPr>
+        <w:rPr>
+          <w:b/>
+          <w:bCs/>
+        </w:rPr>
+      </w:pPr>
+      <w:r>
+        <w:rPr>
+          <w:b/>
+          <w:bCs/>
+        </w:rPr>
+        <w:t xml:space="preserve">Adım 3: </w:t>
+      </w:r>
+      <w:r>
+        <w:rPr>
+          <w:b/>
+          <w:bCs/>
+        </w:rPr>
+        <w:t>Fark (</w:t>
+      </w:r>
+      <w:proofErr w:type="spellStart"/>
+      <w:r>
+        <w:rPr>
+          <w:b/>
+          <w:bCs/>
+        </w:rPr>
+        <w:t>Differential</w:t>
+      </w:r>
+      <w:proofErr w:type="spellEnd"/>
+      <w:r>
+        <w:rPr>
+          <w:b/>
+          <w:bCs/>
+        </w:rPr>
+        <w:t>) Yedeği Alma ve Karşılaştığım Sorun</w:t>
+      </w:r>
+    </w:p>
+    <w:p>
+      <w:proofErr w:type="spellStart"/>
+      <w:r>
+        <w:t>Northwind</w:t>
+      </w:r>
+      <w:proofErr w:type="spellEnd"/>
+      <w:r>
+        <w:t xml:space="preserve"> </w:t>
+      </w:r>
+      <w:proofErr w:type="spellStart"/>
+      <w:r>
+        <w:t>veritabanı</w:t>
+      </w:r>
+      <w:proofErr w:type="spellEnd"/>
+      <w:r>
+        <w:t xml:space="preserve"> üzerinde ilk tam yedeğimi aldıktan sonra, sistemde bir değişiklik olması için </w:t>
+      </w:r>
+      <w:proofErr w:type="spellStart"/>
+      <w:r>
+        <w:t>Customers</w:t>
+      </w:r>
+      <w:proofErr w:type="spellEnd"/>
+      <w:r>
+        <w:t xml:space="preserve"> tablosundaki bir müşterinin ismini güncelledim</w:t>
+      </w:r>
+      <w:r>
+        <w:t>.</w:t>
+      </w:r>
+      <w:r>
+        <w:t xml:space="preserve"> </w:t>
+      </w:r>
+    </w:p>
+    <w:p>
+      <w:r>
+        <w:rPr>
+          <w:noProof/>
+        </w:rPr>
+        <w:lastRenderedPageBreak/>
+        <mc:AlternateContent>
+          <mc:Choice Requires="wps">
+            <w:drawing>
+              <wp:anchor distT="0" distB="0" distL="114300" distR="114300" simplePos="0" relativeHeight="251659264" behindDoc="0" locked="0" layoutInCell="1" allowOverlap="1" wp14:anchorId="7003FCE5" wp14:editId="43DAC26E">
+                <wp:simplePos x="0" y="0"/>
+                <wp:positionH relativeFrom="column">
+                  <wp:posOffset>2635885</wp:posOffset>
+                </wp:positionH>
+                <wp:positionV relativeFrom="paragraph">
+                  <wp:posOffset>860425</wp:posOffset>
+                </wp:positionV>
+                <wp:extent cx="929640" cy="144780"/>
+                <wp:effectExtent l="0" t="0" r="22860" b="26670"/>
+                <wp:wrapNone/>
+                <wp:docPr id="904371426" name="Dikdörtgen 1"/>
+                <wp:cNvGraphicFramePr/>
+                <a:graphic xmlns:a="http://schemas.openxmlformats.org/drawingml/2006/main">
+                  <a:graphicData uri="http://schemas.microsoft.com/office/word/2010/wordprocessingShape">
+                    <wps:wsp>
+                      <wps:cNvSpPr/>
+                      <wps:spPr>
+                        <a:xfrm>
+                          <a:off x="0" y="0"/>
+                          <a:ext cx="929640" cy="144780"/>
+                        </a:xfrm>
+                        <a:prstGeom prst="rect">
+                          <a:avLst/>
+                        </a:prstGeom>
+                        <a:noFill/>
+                        <a:ln>
+                          <a:solidFill>
+                            <a:srgbClr val="C00000"/>
+                          </a:solidFill>
+                        </a:ln>
+                      </wps:spPr>
+                      <wps:style>
+                        <a:lnRef idx="2">
+                          <a:schemeClr val="accent1">
+                            <a:shade val="15000"/>
+                          </a:schemeClr>
+                        </a:lnRef>
+                        <a:fillRef idx="1">
+                          <a:schemeClr val="accent1"/>
+                        </a:fillRef>
+                        <a:effectRef idx="0">
+                          <a:schemeClr val="accent1"/>
+                        </a:effectRef>
+                        <a:fontRef idx="minor">
+                          <a:schemeClr val="lt1"/>
+                        </a:fontRef>
+                      </wps:style>
+                      <wps:bodyPr rot="0" spcFirstLastPara="0" vertOverflow="overflow" horzOverflow="overflow" vert="horz" wrap="square" lIns="91440" tIns="45720" rIns="91440" bIns="45720" numCol="1" spcCol="0" rtlCol="0" fromWordArt="0" anchor="ctr" anchorCtr="0" forceAA="0" compatLnSpc="1">
+                        <a:prstTxWarp prst="textNoShape">
+                          <a:avLst/>
+                        </a:prstTxWarp>
+                        <a:noAutofit/>
+                      </wps:bodyPr>
+                    </wps:wsp>
+                  </a:graphicData>
+                </a:graphic>
+              </wp:anchor>
+            </w:drawing>
+          </mc:Choice>
+          <mc:Fallback>
+            <w:pict>
+              <v:rect w14:anchorId="70BE07A0" id="Dikdörtgen 1" o:spid="_x0000_s1026" style="position:absolute;margin-left:207.55pt;margin-top:67.75pt;width:73.2pt;height:11.4pt;z-index:251659264;visibility:visible;mso-wrap-style:square;mso-wrap-distance-left:9pt;mso-wrap-distance-top:0;mso-wrap-distance-right:9pt;mso-wrap-distance-bottom:0;mso-position-horizontal:absolute;mso-position-horizontal-relative:text;mso-position-vertical:absolute;mso-position-vertical-relative:text;v-text-anchor:middle" o:gfxdata="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" filled="f" strokecolor="#c00000" strokeweight="1.5pt"/>
+            </w:pict>
+          </mc:Fallback>
+        </mc:AlternateContent>
+      </w:r>
+      <w:r>
+        <w:drawing>
+          <wp:inline distT="0" distB="0" distL="0" distR="0" wp14:anchorId="308637D2" wp14:editId="7336BA6D">
+            <wp:extent cx="4549534" cy="1623201"/>
+            <wp:effectExtent l="0" t="0" r="3810" b="0"/>
+            <wp:docPr id="1894625078" name="Resim 1" descr="metin, ekran görüntüsü, yazı tipi, sayı, numara içeren bir resim&#10;&#10;Yapay zeka tarafından oluşturulmuş içerik yanlış olabilir."/>
+            <wp:cNvGraphicFramePr>
+              <a:graphicFrameLocks xmlns:a="http://schemas.openxmlformats.org/drawingml/2006/main" noChangeAspect="1"/>
+            </wp:cNvGraphicFramePr>
+            <a:graphic xmlns:a="http://schemas.openxmlformats.org/drawingml/2006/main">
+              <a:graphicData uri="http://schemas.openxmlformats.org/drawingml/2006/picture">
+                <pic:pic xmlns:pic="http://schemas.openxmlformats.org/drawingml/2006/picture">
+                  <pic:nvPicPr>
+                    <pic:cNvPr id="1894625078" name="Resim 1" descr="metin, ekran görüntüsü, yazı tipi, sayı, numara içeren bir resim&#10;&#10;Yapay zeka tarafından oluşturulmuş içerik yanlış olabilir."/>
+                    <pic:cNvPicPr/>
+                  </pic:nvPicPr>
+                  <pic:blipFill>
+                    <a:blip r:embed="rId6"/>
+                    <a:stretch>
+                      <a:fillRect/>
+                    </a:stretch>
+                  </pic:blipFill>
+                  <pic:spPr>
+                    <a:xfrm>
+                      <a:off x="0" y="0"/>
+                      <a:ext cx="4549534" cy="1623201"/>
+                    </a:xfrm>
+                    <a:prstGeom prst="rect">
+                      <a:avLst/>
+                    </a:prstGeom>
+                  </pic:spPr>
+                </pic:pic>
+              </a:graphicData>
+            </a:graphic>
+          </wp:inline>
+        </w:drawing>
+      </w:r>
+    </w:p>
+    <w:p>
+      <w:r>
+        <w:t>A</w:t>
+      </w:r>
+      <w:r>
+        <w:t>rdından sadece bu farkı kaydedecek olan Fark (</w:t>
+      </w:r>
+      <w:proofErr w:type="spellStart"/>
+      <w:r>
+        <w:t>Differential</w:t>
+      </w:r>
+      <w:proofErr w:type="spellEnd"/>
+      <w:r>
+        <w:t>) yedeği işlemini başlattım. İşlem sırasında başta '</w:t>
+      </w:r>
+      <w:proofErr w:type="spellStart"/>
+      <w:r>
+        <w:t>media</w:t>
+      </w:r>
+      <w:proofErr w:type="spellEnd"/>
+      <w:r>
+        <w:t xml:space="preserve"> </w:t>
+      </w:r>
+      <w:proofErr w:type="spellStart"/>
+      <w:r>
+        <w:t>families</w:t>
+      </w:r>
+      <w:proofErr w:type="spellEnd"/>
+      <w:r>
+        <w:t>' hatasıyla karşılaştım</w:t>
+      </w:r>
+      <w:r>
+        <w:t xml:space="preserve">. </w:t>
+      </w:r>
+      <w:r>
+        <w:t xml:space="preserve">Bu sorunu çözmek için </w:t>
+      </w:r>
+      <w:proofErr w:type="spellStart"/>
+      <w:r>
+        <w:t>Overwrite</w:t>
+      </w:r>
+      <w:proofErr w:type="spellEnd"/>
+      <w:r>
+        <w:t xml:space="preserve"> işlemi gerçekleştirdim</w:t>
+      </w:r>
+      <w:r>
+        <w:t xml:space="preserve"> ve görseldeki gibi başarı mesajını alarak işlemi tamamladım. Böylece </w:t>
+      </w:r>
+      <w:proofErr w:type="spellStart"/>
+      <w:r>
+        <w:t>veritabanındaki</w:t>
+      </w:r>
+      <w:proofErr w:type="spellEnd"/>
+      <w:r>
+        <w:t xml:space="preserve"> güncel değişiklikleri güvenli bir şekilde yedeklemeyi başardım.</w:t>
+      </w:r>
+    </w:p>
+    <w:p>
+      <w:r>
+        <w:drawing>
+          <wp:inline distT="0" distB="0" distL="0" distR="0" wp14:anchorId="0B061E99" wp14:editId="5E515999">
+            <wp:extent cx="5760720" cy="4980940"/>
+            <wp:effectExtent l="0" t="0" r="0" b="0"/>
+            <wp:docPr id="512965887" name="Resim 1" descr="metin, ekran görüntüsü, yazılım, bilgisayar simgesi içeren bir resim&#10;&#10;Yapay zeka tarafından oluşturulmuş içerik yanlış olabilir."/>
+            <wp:cNvGraphicFramePr>
+              <a:graphicFrameLocks xmlns:a="http://schemas.openxmlformats.org/drawingml/2006/main" noChangeAspect="1"/>
+            </wp:cNvGraphicFramePr>
+            <a:graphic xmlns:a="http://schemas.openxmlformats.org/drawingml/2006/main">
+              <a:graphicData uri="http://schemas.openxmlformats.org/drawingml/2006/picture">
+                <pic:pic xmlns:pic="http://schemas.openxmlformats.org/drawingml/2006/picture">
+                  <pic:nvPicPr>
+                    <pic:cNvPr id="512965887" name="Resim 1" descr="metin, ekran görüntüsü, yazılım, bilgisayar simgesi içeren bir resim&#10;&#10;Yapay zeka tarafından oluşturulmuş içerik yanlış olabilir."/>
+                    <pic:cNvPicPr/>
+                  </pic:nvPicPr>
+                  <pic:blipFill>
+                    <a:blip r:embed="rId7"/>
+                    <a:stretch>
+                      <a:fillRect/>
+                    </a:stretch>
+                  </pic:blipFill>
+                  <pic:spPr>
+                    <a:xfrm>
+                      <a:off x="0" y="0"/>
+                      <a:ext cx="5760720" cy="4980940"/>
+                    </a:xfrm>
+                    <a:prstGeom prst="rect">
+                      <a:avLst/>
+                    </a:prstGeom>
+                  </pic:spPr>
+                </pic:pic>
+              </a:graphicData>
+            </a:graphic>
+          </wp:inline>
+        </w:drawing>
+      </w:r>
+    </w:p>
     <w:p/>
     <w:p/>
     <w:p/>
-    <w:p/>
-    <w:p/>
+    <w:p>
+      <w:r>
+        <w:lastRenderedPageBreak/>
+        <w:t>05.04.2026</w:t>
+      </w:r>
+    </w:p>
+    <w:p>
+      <w:r>
+        <w:rPr>
+          <w:b/>
+          <w:bCs/>
+        </w:rPr>
+        <w:t xml:space="preserve">Adım 4: </w:t>
+      </w:r>
+      <w:r>
+        <w:rPr>
+          <w:b/>
+          <w:bCs/>
+        </w:rPr>
+        <w:t>Otomatik Yedekleme Stratejisi ve Alternatif Çözüm</w:t>
+      </w:r>
+    </w:p>
+    <w:p>
+      <w:r>
+        <w:t>Kullandığım SQL Server (</w:t>
+      </w:r>
+      <w:proofErr w:type="spellStart"/>
+      <w:r>
+        <w:t>LocalDB</w:t>
+      </w:r>
+      <w:proofErr w:type="spellEnd"/>
+      <w:r>
+        <w:t xml:space="preserve">) sürümü 'SQL Server Aracı' (Agent) hizmetini desteklemediği için, yedekleme işlemini otomatize etmek adına T-SQL </w:t>
+      </w:r>
+      <w:proofErr w:type="spellStart"/>
+      <w:r>
+        <w:t>script</w:t>
+      </w:r>
+      <w:proofErr w:type="spellEnd"/>
+      <w:r>
+        <w:t xml:space="preserve"> yöntemini tercih ettim. Manuel olarak arayüzden yapmak yerine, yukarıdaki SQL komutunu hazırlayarak yedekleme sürecini bir kod yapısına dönüştürdüm.</w:t>
+      </w:r>
+    </w:p>
+    <w:p>
+      <w:r>
+        <w:drawing>
+          <wp:inline distT="0" distB="0" distL="0" distR="0" wp14:anchorId="124CA6AA" wp14:editId="4B88D620">
+            <wp:extent cx="5760720" cy="3638550"/>
+            <wp:effectExtent l="0" t="0" r="0" b="0"/>
+            <wp:docPr id="578121008" name="Resim 1" descr="metin, ekran görüntüsü, yazılım, ekran, görüntüleme içeren bir resim&#10;&#10;Yapay zeka tarafından oluşturulmuş içerik yanlış olabilir."/>
+            <wp:cNvGraphicFramePr>
+              <a:graphicFrameLocks xmlns:a="http://schemas.openxmlformats.org/drawingml/2006/main" noChangeAspect="1"/>
+            </wp:cNvGraphicFramePr>
+            <a:graphic xmlns:a="http://schemas.openxmlformats.org/drawingml/2006/main">
+              <a:graphicData uri="http://schemas.openxmlformats.org/drawingml/2006/picture">
+                <pic:pic xmlns:pic="http://schemas.openxmlformats.org/drawingml/2006/picture">
+                  <pic:nvPicPr>
+                    <pic:cNvPr id="578121008" name="Resim 1" descr="metin, ekran görüntüsü, yazılım, ekran, görüntüleme içeren bir resim&#10;&#10;Yapay zeka tarafından oluşturulmuş içerik yanlış olabilir."/>
+                    <pic:cNvPicPr/>
+                  </pic:nvPicPr>
+                  <pic:blipFill>
+                    <a:blip r:embed="rId8"/>
+                    <a:stretch>
+                      <a:fillRect/>
+                    </a:stretch>
+                  </pic:blipFill>
+                  <pic:spPr>
+                    <a:xfrm>
+                      <a:off x="0" y="0"/>
+                      <a:ext cx="5760720" cy="3638550"/>
+                    </a:xfrm>
+                    <a:prstGeom prst="rect">
+                      <a:avLst/>
+                    </a:prstGeom>
+                  </pic:spPr>
+                </pic:pic>
+              </a:graphicData>
+            </a:graphic>
+          </wp:inline>
+        </w:drawing>
+      </w:r>
+    </w:p>
     <w:p/>
     <w:p/>
     <w:p/>

</xml_diff>

<commit_message>
Proje 2: Recovery model değişimi sonrası Log Backup hatası Full Backup ile çözüldü
</commit_message>
<xml_diff>
--- a/BLM4522_Proje2/Rapor1.docx
+++ b/BLM4522_Proje2/Rapor1.docx
@@ -214,14 +214,7 @@
           <w:b/>
           <w:bCs/>
         </w:rPr>
-        <w:t xml:space="preserve">Adım 3: </w:t>
-      </w:r>
-      <w:r>
-        <w:rPr>
-          <w:b/>
-          <w:bCs/>
-        </w:rPr>
-        <w:t>Fark (</w:t>
+        <w:t>Adım 3: Fark (</w:t>
       </w:r>
       <w:proofErr w:type="spellStart"/>
       <w:r>
@@ -349,6 +342,9 @@
         </mc:AlternateContent>
       </w:r>
       <w:r>
+        <w:rPr>
+          <w:noProof/>
+        </w:rPr>
         <w:drawing>
           <wp:inline distT="0" distB="0" distL="0" distR="0" wp14:anchorId="308637D2" wp14:editId="7336BA6D">
             <wp:extent cx="4549534" cy="1623201"/>
@@ -445,6 +441,9 @@
     </w:p>
     <w:p>
       <w:r>
+        <w:rPr>
+          <w:noProof/>
+        </w:rPr>
         <w:drawing>
           <wp:inline distT="0" distB="0" distL="0" distR="0" wp14:anchorId="0B061E99" wp14:editId="5E515999">
             <wp:extent cx="5760720" cy="4980940"/>
@@ -497,14 +496,7 @@
           <w:b/>
           <w:bCs/>
         </w:rPr>
-        <w:t xml:space="preserve">Adım 4: </w:t>
-      </w:r>
-      <w:r>
-        <w:rPr>
-          <w:b/>
-          <w:bCs/>
-        </w:rPr>
-        <w:t>Otomatik Yedekleme Stratejisi ve Alternatif Çözüm</w:t>
+        <w:t>Adım 4: Otomatik Yedekleme Stratejisi ve Alternatif Çözüm</w:t>
       </w:r>
     </w:p>
     <w:p>
@@ -530,6 +522,9 @@
     </w:p>
     <w:p>
       <w:r>
+        <w:rPr>
+          <w:noProof/>
+        </w:rPr>
         <w:drawing>
           <wp:inline distT="0" distB="0" distL="0" distR="0" wp14:anchorId="124CA6AA" wp14:editId="4B88D620">
             <wp:extent cx="5760720" cy="3638550"/>
@@ -570,6 +565,258 @@
     <w:p/>
     <w:p/>
     <w:p/>
+    <w:p/>
+    <w:p/>
+    <w:p/>
+    <w:p/>
+    <w:p/>
+    <w:p/>
+    <w:p/>
+    <w:p/>
+    <w:p>
+      <w:r>
+        <w:lastRenderedPageBreak/>
+        <w:t>06.04.2026</w:t>
+      </w:r>
+    </w:p>
+    <w:p>
+      <w:pPr>
+        <w:rPr>
+          <w:b/>
+          <w:bCs/>
+        </w:rPr>
+      </w:pPr>
+      <w:r>
+        <w:rPr>
+          <w:b/>
+          <w:bCs/>
+        </w:rPr>
+        <w:t xml:space="preserve">Adım 5: </w:t>
+      </w:r>
+      <w:r>
+        <w:rPr>
+          <w:b/>
+          <w:bCs/>
+        </w:rPr>
+        <w:t>Kurtarma Modu Değişimi ve Karşılaşılan Log Hatası</w:t>
+      </w:r>
+    </w:p>
+    <w:p>
+      <w:proofErr w:type="spellStart"/>
+      <w:r>
+        <w:t>Veritabanını</w:t>
+      </w:r>
+      <w:proofErr w:type="spellEnd"/>
+      <w:r>
+        <w:t xml:space="preserve"> 'Full' kurtarma moduna aldıktan sonra doğrudan Log yedeği almaya çalıştığımda </w:t>
+      </w:r>
+      <w:r>
+        <w:rPr>
+          <w:i/>
+          <w:iCs/>
+        </w:rPr>
+        <w:t xml:space="preserve">'BACKUP LOG </w:t>
+      </w:r>
+      <w:proofErr w:type="spellStart"/>
+      <w:r>
+        <w:rPr>
+          <w:i/>
+          <w:iCs/>
+        </w:rPr>
+        <w:t>cannot</w:t>
+      </w:r>
+      <w:proofErr w:type="spellEnd"/>
+      <w:r>
+        <w:rPr>
+          <w:i/>
+          <w:iCs/>
+        </w:rPr>
+        <w:t xml:space="preserve"> be </w:t>
+      </w:r>
+      <w:proofErr w:type="spellStart"/>
+      <w:r>
+        <w:rPr>
+          <w:i/>
+          <w:iCs/>
+        </w:rPr>
+        <w:t>performed</w:t>
+      </w:r>
+      <w:proofErr w:type="spellEnd"/>
+      <w:r>
+        <w:rPr>
+          <w:i/>
+          <w:iCs/>
+        </w:rPr>
+        <w:t xml:space="preserve"> </w:t>
+      </w:r>
+      <w:proofErr w:type="spellStart"/>
+      <w:r>
+        <w:rPr>
+          <w:i/>
+          <w:iCs/>
+        </w:rPr>
+        <w:t>because</w:t>
+      </w:r>
+      <w:proofErr w:type="spellEnd"/>
+      <w:r>
+        <w:rPr>
+          <w:i/>
+          <w:iCs/>
+        </w:rPr>
+        <w:t xml:space="preserve"> </w:t>
+      </w:r>
+      <w:proofErr w:type="spellStart"/>
+      <w:r>
+        <w:rPr>
+          <w:i/>
+          <w:iCs/>
+        </w:rPr>
+        <w:t>there</w:t>
+      </w:r>
+      <w:proofErr w:type="spellEnd"/>
+      <w:r>
+        <w:rPr>
+          <w:i/>
+          <w:iCs/>
+        </w:rPr>
+        <w:t xml:space="preserve"> is </w:t>
+      </w:r>
+      <w:proofErr w:type="spellStart"/>
+      <w:r>
+        <w:rPr>
+          <w:i/>
+          <w:iCs/>
+        </w:rPr>
+        <w:t>no</w:t>
+      </w:r>
+      <w:proofErr w:type="spellEnd"/>
+      <w:r>
+        <w:rPr>
+          <w:i/>
+          <w:iCs/>
+        </w:rPr>
+        <w:t xml:space="preserve"> </w:t>
+      </w:r>
+      <w:proofErr w:type="spellStart"/>
+      <w:r>
+        <w:rPr>
+          <w:i/>
+          <w:iCs/>
+        </w:rPr>
+        <w:t>current</w:t>
+      </w:r>
+      <w:proofErr w:type="spellEnd"/>
+      <w:r>
+        <w:rPr>
+          <w:i/>
+          <w:iCs/>
+        </w:rPr>
+        <w:t xml:space="preserve"> </w:t>
+      </w:r>
+      <w:proofErr w:type="spellStart"/>
+      <w:r>
+        <w:rPr>
+          <w:i/>
+          <w:iCs/>
+        </w:rPr>
+        <w:t>database</w:t>
+      </w:r>
+      <w:proofErr w:type="spellEnd"/>
+      <w:r>
+        <w:rPr>
+          <w:i/>
+          <w:iCs/>
+        </w:rPr>
+        <w:t xml:space="preserve"> </w:t>
+      </w:r>
+      <w:proofErr w:type="spellStart"/>
+      <w:r>
+        <w:rPr>
+          <w:i/>
+          <w:iCs/>
+        </w:rPr>
+        <w:t>backup</w:t>
+      </w:r>
+      <w:proofErr w:type="spellEnd"/>
+      <w:r>
+        <w:rPr>
+          <w:i/>
+          <w:iCs/>
+        </w:rPr>
+        <w:t xml:space="preserve">' </w:t>
+      </w:r>
+      <w:r>
+        <w:t xml:space="preserve">hatasıyla karşılaştım. Bu durumun sebebinin, mod değişikliği sonrası yeni bir Tam Yedek (Full </w:t>
+      </w:r>
+      <w:proofErr w:type="spellStart"/>
+      <w:r>
+        <w:t>Backup</w:t>
+      </w:r>
+      <w:proofErr w:type="spellEnd"/>
+      <w:r>
+        <w:t xml:space="preserve">) </w:t>
+      </w:r>
+      <w:proofErr w:type="gramStart"/>
+      <w:r>
+        <w:t>gere</w:t>
+      </w:r>
+      <w:r>
+        <w:t xml:space="preserve">ği </w:t>
+      </w:r>
+      <w:r>
+        <w:t xml:space="preserve"> olduğunu</w:t>
+      </w:r>
+      <w:proofErr w:type="gramEnd"/>
+      <w:r>
+        <w:t xml:space="preserve"> fark ettim. Önce 'Full' modda yeni bir tam yedek </w:t>
+      </w:r>
+      <w:r>
+        <w:t xml:space="preserve">aldım </w:t>
+      </w:r>
+      <w:r>
+        <w:t xml:space="preserve">ve ardından işlem günlüğü (Log) yedeğini başarıyla tamamladım. </w:t>
+      </w:r>
+    </w:p>
+    <w:p/>
+    <w:p>
+      <w:r>
+        <w:drawing>
+          <wp:inline distT="0" distB="0" distL="0" distR="0" wp14:anchorId="106910EF" wp14:editId="69FD69D5">
+            <wp:extent cx="5760720" cy="4909185"/>
+            <wp:effectExtent l="0" t="0" r="0" b="5715"/>
+            <wp:docPr id="1902260599" name="Resim 1" descr="metin, ekran görüntüsü, yazılım, bilgisayar simgesi içeren bir resim&#10;&#10;Yapay zeka tarafından oluşturulmuş içerik yanlış olabilir."/>
+            <wp:cNvGraphicFramePr>
+              <a:graphicFrameLocks xmlns:a="http://schemas.openxmlformats.org/drawingml/2006/main" noChangeAspect="1"/>
+            </wp:cNvGraphicFramePr>
+            <a:graphic xmlns:a="http://schemas.openxmlformats.org/drawingml/2006/main">
+              <a:graphicData uri="http://schemas.openxmlformats.org/drawingml/2006/picture">
+                <pic:pic xmlns:pic="http://schemas.openxmlformats.org/drawingml/2006/picture">
+                  <pic:nvPicPr>
+                    <pic:cNvPr id="1902260599" name="Resim 1" descr="metin, ekran görüntüsü, yazılım, bilgisayar simgesi içeren bir resim&#10;&#10;Yapay zeka tarafından oluşturulmuş içerik yanlış olabilir."/>
+                    <pic:cNvPicPr/>
+                  </pic:nvPicPr>
+                  <pic:blipFill>
+                    <a:blip r:embed="rId9"/>
+                    <a:stretch>
+                      <a:fillRect/>
+                    </a:stretch>
+                  </pic:blipFill>
+                  <pic:spPr>
+                    <a:xfrm>
+                      <a:off x="0" y="0"/>
+                      <a:ext cx="5760720" cy="4909185"/>
+                    </a:xfrm>
+                    <a:prstGeom prst="rect">
+                      <a:avLst/>
+                    </a:prstGeom>
+                  </pic:spPr>
+                </pic:pic>
+              </a:graphicData>
+            </a:graphic>
+          </wp:inline>
+        </w:drawing>
+      </w:r>
+    </w:p>
     <w:p/>
     <w:sectPr>
       <w:pgSz w:w="11906" w:h="16838"/>

</xml_diff>

<commit_message>
Proje 2: Geri yükleme erişim hatası çözüldü.
</commit_message>
<xml_diff>
--- a/BLM4522_Proje2/Rapor1.docx
+++ b/BLM4522_Proje2/Rapor1.docx
@@ -818,6 +818,235 @@
       </w:r>
     </w:p>
     <w:p/>
+    <w:p>
+      <w:r>
+        <w:t>06.04.2026</w:t>
+      </w:r>
+    </w:p>
+    <w:p>
+      <w:pPr>
+        <w:rPr>
+          <w:b/>
+          <w:bCs/>
+        </w:rPr>
+      </w:pPr>
+      <w:r>
+        <w:rPr>
+          <w:b/>
+          <w:bCs/>
+        </w:rPr>
+        <w:t xml:space="preserve">Adım 6: </w:t>
+      </w:r>
+      <w:r>
+        <w:rPr>
+          <w:b/>
+          <w:bCs/>
+        </w:rPr>
+        <w:t>Felaket Senaryosu ve Kurtarma İşlemi</w:t>
+      </w:r>
+    </w:p>
+    <w:p>
+      <w:r>
+        <w:t xml:space="preserve">Bu aşamada projenin en önemli kısmı olan 'Point-in-Time' kurtarma testini yaptım. Önce </w:t>
+      </w:r>
+      <w:proofErr w:type="spellStart"/>
+      <w:r>
+        <w:t>veritabanındaki</w:t>
+      </w:r>
+      <w:proofErr w:type="spellEnd"/>
+      <w:r>
+        <w:t xml:space="preserve"> tüm ürün fiyatlarını yanlış bir sorguyla sıfırlayarak yapay bir felaket senaryosu oluşturdum.</w:t>
+      </w:r>
+    </w:p>
+    <w:p>
+      <w:r>
+        <w:lastRenderedPageBreak/>
+        <w:drawing>
+          <wp:inline distT="0" distB="0" distL="0" distR="0" wp14:anchorId="3118AE11" wp14:editId="453A466F">
+            <wp:extent cx="5760720" cy="5292725"/>
+            <wp:effectExtent l="0" t="0" r="0" b="3175"/>
+            <wp:docPr id="2052640663" name="Resim 1" descr="metin, ekran görüntüsü, yazılım, ekran, görüntüleme içeren bir resim&#10;&#10;Yapay zeka tarafından oluşturulmuş içerik yanlış olabilir."/>
+            <wp:cNvGraphicFramePr>
+              <a:graphicFrameLocks xmlns:a="http://schemas.openxmlformats.org/drawingml/2006/main" noChangeAspect="1"/>
+            </wp:cNvGraphicFramePr>
+            <a:graphic xmlns:a="http://schemas.openxmlformats.org/drawingml/2006/main">
+              <a:graphicData uri="http://schemas.openxmlformats.org/drawingml/2006/picture">
+                <pic:pic xmlns:pic="http://schemas.openxmlformats.org/drawingml/2006/picture">
+                  <pic:nvPicPr>
+                    <pic:cNvPr id="2052640663" name="Resim 1" descr="metin, ekran görüntüsü, yazılım, ekran, görüntüleme içeren bir resim&#10;&#10;Yapay zeka tarafından oluşturulmuş içerik yanlış olabilir."/>
+                    <pic:cNvPicPr/>
+                  </pic:nvPicPr>
+                  <pic:blipFill>
+                    <a:blip r:embed="rId10"/>
+                    <a:stretch>
+                      <a:fillRect/>
+                    </a:stretch>
+                  </pic:blipFill>
+                  <pic:spPr>
+                    <a:xfrm>
+                      <a:off x="0" y="0"/>
+                      <a:ext cx="5760720" cy="5292725"/>
+                    </a:xfrm>
+                    <a:prstGeom prst="rect">
+                      <a:avLst/>
+                    </a:prstGeom>
+                  </pic:spPr>
+                </pic:pic>
+              </a:graphicData>
+            </a:graphic>
+          </wp:inline>
+        </w:drawing>
+      </w:r>
+    </w:p>
+    <w:p/>
+    <w:p/>
+    <w:p/>
+    <w:p/>
+    <w:p/>
+    <w:p/>
+    <w:p/>
+    <w:p/>
+    <w:p/>
+    <w:p/>
+    <w:p>
+      <w:r>
+        <w:lastRenderedPageBreak/>
+        <w:t xml:space="preserve">Ardından, daha önce yapılandırdığım Log yedeklerini kullanarak </w:t>
+      </w:r>
+      <w:proofErr w:type="spellStart"/>
+      <w:r>
+        <w:t>veritabanını</w:t>
+      </w:r>
+      <w:proofErr w:type="spellEnd"/>
+      <w:r>
+        <w:t xml:space="preserve"> bu hatanın yapıldığı andan tam 2 dakika öncesine geri döndürdüm.</w:t>
+      </w:r>
+    </w:p>
+    <w:p>
+      <w:r>
+        <w:drawing>
+          <wp:inline distT="0" distB="0" distL="0" distR="0" wp14:anchorId="27959E83" wp14:editId="6DB4481D">
+            <wp:extent cx="5791200" cy="3856971"/>
+            <wp:effectExtent l="0" t="0" r="0" b="0"/>
+            <wp:docPr id="231269235" name="Resim 1" descr="metin, elektronik donanım, ekran görüntüsü, yazılım içeren bir resim&#10;&#10;Yapay zeka tarafından oluşturulmuş içerik yanlış olabilir."/>
+            <wp:cNvGraphicFramePr>
+              <a:graphicFrameLocks xmlns:a="http://schemas.openxmlformats.org/drawingml/2006/main" noChangeAspect="1"/>
+            </wp:cNvGraphicFramePr>
+            <a:graphic xmlns:a="http://schemas.openxmlformats.org/drawingml/2006/main">
+              <a:graphicData uri="http://schemas.openxmlformats.org/drawingml/2006/picture">
+                <pic:pic xmlns:pic="http://schemas.openxmlformats.org/drawingml/2006/picture">
+                  <pic:nvPicPr>
+                    <pic:cNvPr id="231269235" name="Resim 1" descr="metin, elektronik donanım, ekran görüntüsü, yazılım içeren bir resim&#10;&#10;Yapay zeka tarafından oluşturulmuş içerik yanlış olabilir."/>
+                    <pic:cNvPicPr/>
+                  </pic:nvPicPr>
+                  <pic:blipFill>
+                    <a:blip r:embed="rId11"/>
+                    <a:stretch>
+                      <a:fillRect/>
+                    </a:stretch>
+                  </pic:blipFill>
+                  <pic:spPr>
+                    <a:xfrm>
+                      <a:off x="0" y="0"/>
+                      <a:ext cx="5828685" cy="3881936"/>
+                    </a:xfrm>
+                    <a:prstGeom prst="rect">
+                      <a:avLst/>
+                    </a:prstGeom>
+                  </pic:spPr>
+                </pic:pic>
+              </a:graphicData>
+            </a:graphic>
+          </wp:inline>
+        </w:drawing>
+      </w:r>
+    </w:p>
+    <w:p/>
+    <w:p>
+      <w:r>
+        <w:drawing>
+          <wp:inline distT="0" distB="0" distL="0" distR="0" wp14:anchorId="37C1624D" wp14:editId="72903600">
+            <wp:extent cx="5760720" cy="3799205"/>
+            <wp:effectExtent l="0" t="0" r="0" b="0"/>
+            <wp:docPr id="1197877095" name="Resim 1" descr="metin, ekran görüntüsü, yazılım, web sayfası içeren bir resim&#10;&#10;Yapay zeka tarafından oluşturulmuş içerik yanlış olabilir."/>
+            <wp:cNvGraphicFramePr>
+              <a:graphicFrameLocks xmlns:a="http://schemas.openxmlformats.org/drawingml/2006/main" noChangeAspect="1"/>
+            </wp:cNvGraphicFramePr>
+            <a:graphic xmlns:a="http://schemas.openxmlformats.org/drawingml/2006/main">
+              <a:graphicData uri="http://schemas.openxmlformats.org/drawingml/2006/picture">
+                <pic:pic xmlns:pic="http://schemas.openxmlformats.org/drawingml/2006/picture">
+                  <pic:nvPicPr>
+                    <pic:cNvPr id="1197877095" name="Resim 1" descr="metin, ekran görüntüsü, yazılım, web sayfası içeren bir resim&#10;&#10;Yapay zeka tarafından oluşturulmuş içerik yanlış olabilir."/>
+                    <pic:cNvPicPr/>
+                  </pic:nvPicPr>
+                  <pic:blipFill>
+                    <a:blip r:embed="rId12"/>
+                    <a:stretch>
+                      <a:fillRect/>
+                    </a:stretch>
+                  </pic:blipFill>
+                  <pic:spPr>
+                    <a:xfrm>
+                      <a:off x="0" y="0"/>
+                      <a:ext cx="5760720" cy="3799205"/>
+                    </a:xfrm>
+                    <a:prstGeom prst="rect">
+                      <a:avLst/>
+                    </a:prstGeom>
+                  </pic:spPr>
+                </pic:pic>
+              </a:graphicData>
+            </a:graphic>
+          </wp:inline>
+        </w:drawing>
+      </w:r>
+    </w:p>
+    <w:p>
+      <w:r>
+        <w:lastRenderedPageBreak/>
+        <w:t>Geri yükleme sonrası yaptığım kontrolde tüm fiyatların eski haline döndüğünü gördüm. Bu sayede sadece yedek almayı değil, veriyi saniyeler içinde kurtarmayı da başarmış oldum.</w:t>
+      </w:r>
+    </w:p>
+    <w:p/>
+    <w:p>
+      <w:r>
+        <w:drawing>
+          <wp:inline distT="0" distB="0" distL="0" distR="0" wp14:anchorId="49DB7E17" wp14:editId="121F8497">
+            <wp:extent cx="5760720" cy="4530090"/>
+            <wp:effectExtent l="0" t="0" r="0" b="3810"/>
+            <wp:docPr id="736790605" name="Resim 1" descr="metin, ekran görüntüsü, yazılım, ekran, görüntüleme içeren bir resim&#10;&#10;Yapay zeka tarafından oluşturulmuş içerik yanlış olabilir."/>
+            <wp:cNvGraphicFramePr>
+              <a:graphicFrameLocks xmlns:a="http://schemas.openxmlformats.org/drawingml/2006/main" noChangeAspect="1"/>
+            </wp:cNvGraphicFramePr>
+            <a:graphic xmlns:a="http://schemas.openxmlformats.org/drawingml/2006/main">
+              <a:graphicData uri="http://schemas.openxmlformats.org/drawingml/2006/picture">
+                <pic:pic xmlns:pic="http://schemas.openxmlformats.org/drawingml/2006/picture">
+                  <pic:nvPicPr>
+                    <pic:cNvPr id="736790605" name="Resim 1" descr="metin, ekran görüntüsü, yazılım, ekran, görüntüleme içeren bir resim&#10;&#10;Yapay zeka tarafından oluşturulmuş içerik yanlış olabilir."/>
+                    <pic:cNvPicPr/>
+                  </pic:nvPicPr>
+                  <pic:blipFill>
+                    <a:blip r:embed="rId13"/>
+                    <a:stretch>
+                      <a:fillRect/>
+                    </a:stretch>
+                  </pic:blipFill>
+                  <pic:spPr>
+                    <a:xfrm>
+                      <a:off x="0" y="0"/>
+                      <a:ext cx="5760720" cy="4530090"/>
+                    </a:xfrm>
+                    <a:prstGeom prst="rect">
+                      <a:avLst/>
+                    </a:prstGeom>
+                  </pic:spPr>
+                </pic:pic>
+              </a:graphicData>
+            </a:graphic>
+          </wp:inline>
+        </w:drawing>
+      </w:r>
+    </w:p>
     <w:sectPr>
       <w:pgSz w:w="11906" w:h="16838"/>
       <w:pgMar w:top="1417" w:right="1417" w:bottom="1417" w:left="1417" w:header="708" w:footer="708" w:gutter="0"/>

</xml_diff>

<commit_message>
Proje 2: Veritabanı silme ve Full Restore senaryosu başarıyla test edildi. Kanıtlar rapora eklendi.
</commit_message>
<xml_diff>
--- a/BLM4522_Proje2/Rapor1.docx
+++ b/BLM4522_Proje2/Rapor1.docx
@@ -591,14 +591,7 @@
           <w:b/>
           <w:bCs/>
         </w:rPr>
-        <w:t xml:space="preserve">Adım 5: </w:t>
-      </w:r>
-      <w:r>
-        <w:rPr>
-          <w:b/>
-          <w:bCs/>
-        </w:rPr>
-        <w:t>Kurtarma Modu Değişimi ve Karşılaşılan Log Hatası</w:t>
+        <w:t>Adım 5: Kurtarma Modu Değişimi ve Karşılaşılan Log Hatası</w:t>
       </w:r>
     </w:p>
     <w:p>
@@ -780,6 +773,9 @@
     <w:p/>
     <w:p>
       <w:r>
+        <w:rPr>
+          <w:noProof/>
+        </w:rPr>
         <w:drawing>
           <wp:inline distT="0" distB="0" distL="0" distR="0" wp14:anchorId="106910EF" wp14:editId="69FD69D5">
             <wp:extent cx="5760720" cy="4909185"/>
@@ -860,6 +856,9 @@
     </w:p>
     <w:p>
       <w:r>
+        <w:rPr>
+          <w:noProof/>
+        </w:rPr>
         <w:lastRenderedPageBreak/>
         <w:drawing>
           <wp:inline distT="0" distB="0" distL="0" distR="0" wp14:anchorId="3118AE11" wp14:editId="453A466F">
@@ -924,6 +923,9 @@
     </w:p>
     <w:p>
       <w:r>
+        <w:rPr>
+          <w:noProof/>
+        </w:rPr>
         <w:drawing>
           <wp:inline distT="0" distB="0" distL="0" distR="0" wp14:anchorId="27959E83" wp14:editId="6DB4481D">
             <wp:extent cx="5791200" cy="3856971"/>
@@ -964,6 +966,9 @@
     <w:p/>
     <w:p>
       <w:r>
+        <w:rPr>
+          <w:noProof/>
+        </w:rPr>
         <w:drawing>
           <wp:inline distT="0" distB="0" distL="0" distR="0" wp14:anchorId="37C1624D" wp14:editId="72903600">
             <wp:extent cx="5760720" cy="3799205"/>
@@ -1010,6 +1015,9 @@
     <w:p/>
     <w:p>
       <w:r>
+        <w:rPr>
+          <w:noProof/>
+        </w:rPr>
         <w:drawing>
           <wp:inline distT="0" distB="0" distL="0" distR="0" wp14:anchorId="49DB7E17" wp14:editId="121F8497">
             <wp:extent cx="5760720" cy="4530090"/>
@@ -1035,6 +1043,451 @@
                     <a:xfrm>
                       <a:off x="0" y="0"/>
                       <a:ext cx="5760720" cy="4530090"/>
+                    </a:xfrm>
+                    <a:prstGeom prst="rect">
+                      <a:avLst/>
+                    </a:prstGeom>
+                  </pic:spPr>
+                </pic:pic>
+              </a:graphicData>
+            </a:graphic>
+          </wp:inline>
+        </w:drawing>
+      </w:r>
+    </w:p>
+    <w:p/>
+    <w:p>
+      <w:r>
+        <w:t>06.04.2026</w:t>
+      </w:r>
+    </w:p>
+    <w:p>
+      <w:pPr>
+        <w:rPr>
+          <w:b/>
+          <w:bCs/>
+        </w:rPr>
+      </w:pPr>
+      <w:r>
+        <w:rPr>
+          <w:b/>
+          <w:bCs/>
+        </w:rPr>
+        <w:t>Adım 7: Yedekleme Planı Tablosu</w:t>
+      </w:r>
+    </w:p>
+    <w:tbl>
+      <w:tblPr>
+        <w:tblStyle w:val="DzTablo1"/>
+        <w:tblW w:w="0" w:type="auto"/>
+        <w:tblLook w:val="04A0" w:firstRow="1" w:lastRow="0" w:firstColumn="1" w:lastColumn="0" w:noHBand="0" w:noVBand="1"/>
+      </w:tblPr>
+      <w:tblGrid>
+        <w:gridCol w:w="2341"/>
+        <w:gridCol w:w="2612"/>
+        <w:gridCol w:w="4109"/>
+      </w:tblGrid>
+      <w:tr>
+        <w:trPr>
+          <w:cnfStyle w:val="100000000000" w:firstRow="1" w:lastRow="0" w:firstColumn="0" w:lastColumn="0" w:oddVBand="0" w:evenVBand="0" w:oddHBand="0" w:evenHBand="0" w:firstRowFirstColumn="0" w:firstRowLastColumn="0" w:lastRowFirstColumn="0" w:lastRowLastColumn="0"/>
+        </w:trPr>
+        <w:tc>
+          <w:tcPr>
+            <w:cnfStyle w:val="001000000000" w:firstRow="0" w:lastRow="0" w:firstColumn="1" w:lastColumn="0" w:oddVBand="0" w:evenVBand="0" w:oddHBand="0" w:evenHBand="0" w:firstRowFirstColumn="0" w:firstRowLastColumn="0" w:lastRowFirstColumn="0" w:lastRowLastColumn="0"/>
+            <w:tcW w:w="0" w:type="auto"/>
+            <w:hideMark/>
+          </w:tcPr>
+          <w:p>
+            <w:pPr>
+              <w:spacing w:after="160" w:line="278" w:lineRule="auto"/>
+            </w:pPr>
+            <w:r>
+              <w:t>Yedekleme Türü</w:t>
+            </w:r>
+          </w:p>
+        </w:tc>
+        <w:tc>
+          <w:tcPr>
+            <w:tcW w:w="0" w:type="auto"/>
+            <w:hideMark/>
+          </w:tcPr>
+          <w:p>
+            <w:pPr>
+              <w:spacing w:after="160" w:line="278" w:lineRule="auto"/>
+              <w:cnfStyle w:val="100000000000" w:firstRow="1" w:lastRow="0" w:firstColumn="0" w:lastColumn="0" w:oddVBand="0" w:evenVBand="0" w:oddHBand="0" w:evenHBand="0" w:firstRowFirstColumn="0" w:firstRowLastColumn="0" w:lastRowFirstColumn="0" w:lastRowLastColumn="0"/>
+            </w:pPr>
+            <w:r>
+              <w:t>Sıklık</w:t>
+            </w:r>
+          </w:p>
+        </w:tc>
+        <w:tc>
+          <w:tcPr>
+            <w:tcW w:w="0" w:type="auto"/>
+            <w:hideMark/>
+          </w:tcPr>
+          <w:p>
+            <w:pPr>
+              <w:spacing w:after="160" w:line="278" w:lineRule="auto"/>
+              <w:cnfStyle w:val="100000000000" w:firstRow="1" w:lastRow="0" w:firstColumn="0" w:lastColumn="0" w:oddVBand="0" w:evenVBand="0" w:oddHBand="0" w:evenHBand="0" w:firstRowFirstColumn="0" w:firstRowLastColumn="0" w:lastRowFirstColumn="0" w:lastRowLastColumn="0"/>
+            </w:pPr>
+            <w:r>
+              <w:t>Seçilme Nedeni (RPO/RTO)</w:t>
+            </w:r>
+          </w:p>
+        </w:tc>
+      </w:tr>
+      <w:tr>
+        <w:trPr>
+          <w:cnfStyle w:val="000000100000" w:firstRow="0" w:lastRow="0" w:firstColumn="0" w:lastColumn="0" w:oddVBand="0" w:evenVBand="0" w:oddHBand="1" w:evenHBand="0" w:firstRowFirstColumn="0" w:firstRowLastColumn="0" w:lastRowFirstColumn="0" w:lastRowLastColumn="0"/>
+        </w:trPr>
+        <w:tc>
+          <w:tcPr>
+            <w:cnfStyle w:val="001000000000" w:firstRow="0" w:lastRow="0" w:firstColumn="1" w:lastColumn="0" w:oddVBand="0" w:evenVBand="0" w:oddHBand="0" w:evenHBand="0" w:firstRowFirstColumn="0" w:firstRowLastColumn="0" w:lastRowFirstColumn="0" w:lastRowLastColumn="0"/>
+            <w:tcW w:w="0" w:type="auto"/>
+            <w:hideMark/>
+          </w:tcPr>
+          <w:p>
+            <w:pPr>
+              <w:spacing w:after="160" w:line="278" w:lineRule="auto"/>
+            </w:pPr>
+            <w:r>
+              <w:t>Full (Tam) Yedek</w:t>
+            </w:r>
+          </w:p>
+        </w:tc>
+        <w:tc>
+          <w:tcPr>
+            <w:tcW w:w="0" w:type="auto"/>
+            <w:hideMark/>
+          </w:tcPr>
+          <w:p>
+            <w:pPr>
+              <w:spacing w:after="160" w:line="278" w:lineRule="auto"/>
+              <w:cnfStyle w:val="000000100000" w:firstRow="0" w:lastRow="0" w:firstColumn="0" w:lastColumn="0" w:oddVBand="0" w:evenVBand="0" w:oddHBand="1" w:evenHBand="0" w:firstRowFirstColumn="0" w:firstRowLastColumn="0" w:lastRowFirstColumn="0" w:lastRowLastColumn="0"/>
+            </w:pPr>
+            <w:r>
+              <w:t>Haftada 1 (Pazar 00:00)</w:t>
+            </w:r>
+          </w:p>
+        </w:tc>
+        <w:tc>
+          <w:tcPr>
+            <w:tcW w:w="0" w:type="auto"/>
+            <w:hideMark/>
+          </w:tcPr>
+          <w:p>
+            <w:pPr>
+              <w:spacing w:after="160"/>
+              <w:cnfStyle w:val="000000100000" w:firstRow="0" w:lastRow="0" w:firstColumn="0" w:lastColumn="0" w:oddVBand="0" w:evenVBand="0" w:oddHBand="1" w:evenHBand="0" w:firstRowFirstColumn="0" w:firstRowLastColumn="0" w:lastRowFirstColumn="0" w:lastRowLastColumn="0"/>
+            </w:pPr>
+            <w:r>
+              <w:t>Sistemin ana omurgası</w:t>
+            </w:r>
+          </w:p>
+        </w:tc>
+      </w:tr>
+      <w:tr>
+        <w:tc>
+          <w:tcPr>
+            <w:cnfStyle w:val="001000000000" w:firstRow="0" w:lastRow="0" w:firstColumn="1" w:lastColumn="0" w:oddVBand="0" w:evenVBand="0" w:oddHBand="0" w:evenHBand="0" w:firstRowFirstColumn="0" w:firstRowLastColumn="0" w:lastRowFirstColumn="0" w:lastRowLastColumn="0"/>
+            <w:tcW w:w="0" w:type="auto"/>
+            <w:hideMark/>
+          </w:tcPr>
+          <w:p>
+            <w:pPr>
+              <w:spacing w:after="160" w:line="278" w:lineRule="auto"/>
+            </w:pPr>
+            <w:proofErr w:type="spellStart"/>
+            <w:r>
+              <w:t>Differential</w:t>
+            </w:r>
+            <w:proofErr w:type="spellEnd"/>
+            <w:r>
+              <w:t xml:space="preserve"> (Fark)</w:t>
+            </w:r>
+          </w:p>
+        </w:tc>
+        <w:tc>
+          <w:tcPr>
+            <w:tcW w:w="0" w:type="auto"/>
+            <w:hideMark/>
+          </w:tcPr>
+          <w:p>
+            <w:pPr>
+              <w:spacing w:after="160" w:line="278" w:lineRule="auto"/>
+              <w:cnfStyle w:val="000000000000" w:firstRow="0" w:lastRow="0" w:firstColumn="0" w:lastColumn="0" w:oddVBand="0" w:evenVBand="0" w:oddHBand="0" w:evenHBand="0" w:firstRowFirstColumn="0" w:firstRowLastColumn="0" w:lastRowFirstColumn="0" w:lastRowLastColumn="0"/>
+            </w:pPr>
+            <w:r>
+              <w:t>Her Gün (22:00)</w:t>
+            </w:r>
+          </w:p>
+        </w:tc>
+        <w:tc>
+          <w:tcPr>
+            <w:tcW w:w="0" w:type="auto"/>
+            <w:hideMark/>
+          </w:tcPr>
+          <w:p>
+            <w:pPr>
+              <w:spacing w:after="160" w:line="278" w:lineRule="auto"/>
+              <w:cnfStyle w:val="000000000000" w:firstRow="0" w:lastRow="0" w:firstColumn="0" w:lastColumn="0" w:oddVBand="0" w:evenVBand="0" w:oddHBand="0" w:evenHBand="0" w:firstRowFirstColumn="0" w:firstRowLastColumn="0" w:lastRowFirstColumn="0" w:lastRowLastColumn="0"/>
+            </w:pPr>
+            <w:r>
+              <w:t xml:space="preserve">Son tam yedekten beri değişenleri alır. </w:t>
+            </w:r>
+          </w:p>
+        </w:tc>
+      </w:tr>
+      <w:tr>
+        <w:trPr>
+          <w:cnfStyle w:val="000000100000" w:firstRow="0" w:lastRow="0" w:firstColumn="0" w:lastColumn="0" w:oddVBand="0" w:evenVBand="0" w:oddHBand="1" w:evenHBand="0" w:firstRowFirstColumn="0" w:firstRowLastColumn="0" w:lastRowFirstColumn="0" w:lastRowLastColumn="0"/>
+          <w:trHeight w:val="501"/>
+        </w:trPr>
+        <w:tc>
+          <w:tcPr>
+            <w:cnfStyle w:val="001000000000" w:firstRow="0" w:lastRow="0" w:firstColumn="1" w:lastColumn="0" w:oddVBand="0" w:evenVBand="0" w:oddHBand="0" w:evenHBand="0" w:firstRowFirstColumn="0" w:firstRowLastColumn="0" w:lastRowFirstColumn="0" w:lastRowLastColumn="0"/>
+            <w:tcW w:w="0" w:type="auto"/>
+            <w:hideMark/>
+          </w:tcPr>
+          <w:p>
+            <w:pPr>
+              <w:spacing w:after="160" w:line="278" w:lineRule="auto"/>
+            </w:pPr>
+            <w:r>
+              <w:t>Log (Günlük) Yedeği</w:t>
+            </w:r>
+          </w:p>
+        </w:tc>
+        <w:tc>
+          <w:tcPr>
+            <w:tcW w:w="0" w:type="auto"/>
+            <w:hideMark/>
+          </w:tcPr>
+          <w:p>
+            <w:pPr>
+              <w:spacing w:after="160" w:line="278" w:lineRule="auto"/>
+              <w:cnfStyle w:val="000000100000" w:firstRow="0" w:lastRow="0" w:firstColumn="0" w:lastColumn="0" w:oddVBand="0" w:evenVBand="0" w:oddHBand="1" w:evenHBand="0" w:firstRowFirstColumn="0" w:firstRowLastColumn="0" w:lastRowFirstColumn="0" w:lastRowLastColumn="0"/>
+            </w:pPr>
+            <w:r>
+              <w:t>15 Dakikada Bir</w:t>
+            </w:r>
+          </w:p>
+        </w:tc>
+        <w:tc>
+          <w:tcPr>
+            <w:tcW w:w="0" w:type="auto"/>
+            <w:hideMark/>
+          </w:tcPr>
+          <w:p>
+            <w:pPr>
+              <w:spacing w:after="160" w:line="278" w:lineRule="auto"/>
+              <w:cnfStyle w:val="000000100000" w:firstRow="0" w:lastRow="0" w:firstColumn="0" w:lastColumn="0" w:oddVBand="0" w:evenVBand="0" w:oddHBand="1" w:evenHBand="0" w:firstRowFirstColumn="0" w:firstRowLastColumn="0" w:lastRowFirstColumn="0" w:lastRowLastColumn="0"/>
+            </w:pPr>
+            <w:r>
+              <w:t xml:space="preserve">Veri kaybını (RPO) minimize eder. </w:t>
+            </w:r>
+          </w:p>
+        </w:tc>
+      </w:tr>
+    </w:tbl>
+    <w:p/>
+    <w:p>
+      <w:r>
+        <w:lastRenderedPageBreak/>
+        <w:t>06.04.2026</w:t>
+      </w:r>
+    </w:p>
+    <w:p>
+      <w:pPr>
+        <w:rPr>
+          <w:b/>
+          <w:bCs/>
+        </w:rPr>
+      </w:pPr>
+      <w:r>
+        <w:rPr>
+          <w:b/>
+          <w:bCs/>
+        </w:rPr>
+        <w:t xml:space="preserve">Adım 8: </w:t>
+      </w:r>
+      <w:r>
+        <w:rPr>
+          <w:b/>
+          <w:bCs/>
+        </w:rPr>
+        <w:t xml:space="preserve">Tam Felaket </w:t>
+      </w:r>
+      <w:proofErr w:type="gramStart"/>
+      <w:r>
+        <w:rPr>
+          <w:b/>
+          <w:bCs/>
+        </w:rPr>
+        <w:t>Senaryosu -</w:t>
+      </w:r>
+      <w:proofErr w:type="gramEnd"/>
+      <w:r>
+        <w:rPr>
+          <w:b/>
+          <w:bCs/>
+        </w:rPr>
+        <w:t xml:space="preserve"> </w:t>
+      </w:r>
+      <w:proofErr w:type="spellStart"/>
+      <w:r>
+        <w:rPr>
+          <w:b/>
+          <w:bCs/>
+        </w:rPr>
+        <w:t>Veritabanı</w:t>
+      </w:r>
+      <w:proofErr w:type="spellEnd"/>
+      <w:r>
+        <w:rPr>
+          <w:b/>
+          <w:bCs/>
+        </w:rPr>
+        <w:t xml:space="preserve"> Silme ve Full Restore</w:t>
+      </w:r>
+    </w:p>
+    <w:p>
+      <w:r>
+        <w:t xml:space="preserve">Projenin güvenilirliğini test etmek amacıyla </w:t>
+      </w:r>
+      <w:proofErr w:type="spellStart"/>
+      <w:r>
+        <w:t>Northwind</w:t>
+      </w:r>
+      <w:proofErr w:type="spellEnd"/>
+      <w:r>
+        <w:t xml:space="preserve"> </w:t>
+      </w:r>
+      <w:proofErr w:type="spellStart"/>
+      <w:r>
+        <w:t>veritabanını</w:t>
+      </w:r>
+      <w:proofErr w:type="spellEnd"/>
+      <w:r>
+        <w:t xml:space="preserve"> sistemden tamamen sildim (</w:t>
+      </w:r>
+      <w:proofErr w:type="spellStart"/>
+      <w:r>
+        <w:t>Delete</w:t>
+      </w:r>
+      <w:proofErr w:type="spellEnd"/>
+      <w:r>
+        <w:t xml:space="preserve">). Bu işlemle sunucu çökmesi veya </w:t>
+      </w:r>
+      <w:proofErr w:type="spellStart"/>
+      <w:r>
+        <w:t>veritabanının</w:t>
+      </w:r>
+      <w:proofErr w:type="spellEnd"/>
+      <w:r>
+        <w:t xml:space="preserve"> yanlışlıkla silinmesi gibi en kötü senaryoyu simüle ettim.</w:t>
+      </w:r>
+    </w:p>
+    <w:p>
+      <w:r>
+        <w:drawing>
+          <wp:inline distT="0" distB="0" distL="0" distR="0" wp14:anchorId="23654EF7" wp14:editId="24A7AE1A">
+            <wp:extent cx="2767067" cy="2598420"/>
+            <wp:effectExtent l="0" t="0" r="0" b="0"/>
+            <wp:docPr id="1142081402" name="Resim 1" descr="metin, elektronik donanım, ekran görüntüsü, yazılım içeren bir resim&#10;&#10;Yapay zeka tarafından oluşturulmuş içerik yanlış olabilir."/>
+            <wp:cNvGraphicFramePr>
+              <a:graphicFrameLocks xmlns:a="http://schemas.openxmlformats.org/drawingml/2006/main" noChangeAspect="1"/>
+            </wp:cNvGraphicFramePr>
+            <a:graphic xmlns:a="http://schemas.openxmlformats.org/drawingml/2006/main">
+              <a:graphicData uri="http://schemas.openxmlformats.org/drawingml/2006/picture">
+                <pic:pic xmlns:pic="http://schemas.openxmlformats.org/drawingml/2006/picture">
+                  <pic:nvPicPr>
+                    <pic:cNvPr id="1142081402" name="Resim 1" descr="metin, elektronik donanım, ekran görüntüsü, yazılım içeren bir resim&#10;&#10;Yapay zeka tarafından oluşturulmuş içerik yanlış olabilir."/>
+                    <pic:cNvPicPr/>
+                  </pic:nvPicPr>
+                  <pic:blipFill>
+                    <a:blip r:embed="rId14"/>
+                    <a:stretch>
+                      <a:fillRect/>
+                    </a:stretch>
+                  </pic:blipFill>
+                  <pic:spPr>
+                    <a:xfrm>
+                      <a:off x="0" y="0"/>
+                      <a:ext cx="2768988" cy="2600224"/>
+                    </a:xfrm>
+                    <a:prstGeom prst="rect">
+                      <a:avLst/>
+                    </a:prstGeom>
+                  </pic:spPr>
+                </pic:pic>
+              </a:graphicData>
+            </a:graphic>
+          </wp:inline>
+        </w:drawing>
+      </w:r>
+    </w:p>
+    <w:p/>
+    <w:p>
+      <w:r>
+        <w:t xml:space="preserve">Aşağıdaki görsellerde görüldüğü üzere, sistemde olmayan </w:t>
+      </w:r>
+      <w:proofErr w:type="spellStart"/>
+      <w:r>
+        <w:t>veritabanı</w:t>
+      </w:r>
+      <w:proofErr w:type="spellEnd"/>
+      <w:r>
+        <w:t xml:space="preserve"> aldığım </w:t>
+      </w:r>
+      <w:r>
+        <w:rPr>
+          <w:b/>
+          <w:bCs/>
+        </w:rPr>
+        <w:t xml:space="preserve">Full </w:t>
+      </w:r>
+      <w:proofErr w:type="spellStart"/>
+      <w:r>
+        <w:rPr>
+          <w:b/>
+          <w:bCs/>
+        </w:rPr>
+        <w:t>Backup</w:t>
+      </w:r>
+      <w:proofErr w:type="spellEnd"/>
+      <w:r>
+        <w:t xml:space="preserve"> sayesinde saniyeler içinde tüm tabloları ve verileriyle birlikte geri geldi. Ürün fiyatlarını kontrol ettiğimde, verilerin hatasız bir şekilde kurtarıldığını doğruladım. Bu test, hazırladığım yedekleme stratejisinin 'tam yıkım' anında bile sorunsuz çalıştığını kanıtladı.</w:t>
+      </w:r>
+    </w:p>
+    <w:p>
+      <w:r>
+        <w:drawing>
+          <wp:inline distT="0" distB="0" distL="0" distR="0" wp14:anchorId="47C5107F" wp14:editId="3545EC52">
+            <wp:extent cx="3649980" cy="3197353"/>
+            <wp:effectExtent l="0" t="0" r="7620" b="3175"/>
+            <wp:docPr id="27659193" name="Resim 1" descr="metin, ekran görüntüsü, yazılım, bilgisayar simgesi içeren bir resim&#10;&#10;Yapay zeka tarafından oluşturulmuş içerik yanlış olabilir."/>
+            <wp:cNvGraphicFramePr>
+              <a:graphicFrameLocks xmlns:a="http://schemas.openxmlformats.org/drawingml/2006/main" noChangeAspect="1"/>
+            </wp:cNvGraphicFramePr>
+            <a:graphic xmlns:a="http://schemas.openxmlformats.org/drawingml/2006/main">
+              <a:graphicData uri="http://schemas.openxmlformats.org/drawingml/2006/picture">
+                <pic:pic xmlns:pic="http://schemas.openxmlformats.org/drawingml/2006/picture">
+                  <pic:nvPicPr>
+                    <pic:cNvPr id="27659193" name="Resim 1" descr="metin, ekran görüntüsü, yazılım, bilgisayar simgesi içeren bir resim&#10;&#10;Yapay zeka tarafından oluşturulmuş içerik yanlış olabilir."/>
+                    <pic:cNvPicPr/>
+                  </pic:nvPicPr>
+                  <pic:blipFill>
+                    <a:blip r:embed="rId15"/>
+                    <a:stretch>
+                      <a:fillRect/>
+                    </a:stretch>
+                  </pic:blipFill>
+                  <pic:spPr>
+                    <a:xfrm>
+                      <a:off x="0" y="0"/>
+                      <a:ext cx="3657388" cy="3203842"/>
                     </a:xfrm>
                     <a:prstGeom prst="rect">
                       <a:avLst/>
@@ -1973,6 +2426,69 @@
       <w:spacing w:val="5"/>
     </w:rPr>
   </w:style>
+  <w:style w:type="table" w:styleId="DzTablo1">
+    <w:name w:val="Plain Table 1"/>
+    <w:basedOn w:val="NormalTablo"/>
+    <w:uiPriority w:val="41"/>
+    <w:rsid w:val="0010403B"/>
+    <w:pPr>
+      <w:spacing w:after="0" w:line="240" w:lineRule="auto"/>
+    </w:pPr>
+    <w:tblPr>
+      <w:tblStyleRowBandSize w:val="1"/>
+      <w:tblStyleColBandSize w:val="1"/>
+      <w:tblBorders>
+        <w:top w:val="single" w:sz="4" w:space="0" w:color="BFBFBF" w:themeColor="background1" w:themeShade="BF"/>
+        <w:left w:val="single" w:sz="4" w:space="0" w:color="BFBFBF" w:themeColor="background1" w:themeShade="BF"/>
+        <w:bottom w:val="single" w:sz="4" w:space="0" w:color="BFBFBF" w:themeColor="background1" w:themeShade="BF"/>
+        <w:right w:val="single" w:sz="4" w:space="0" w:color="BFBFBF" w:themeColor="background1" w:themeShade="BF"/>
+        <w:insideH w:val="single" w:sz="4" w:space="0" w:color="BFBFBF" w:themeColor="background1" w:themeShade="BF"/>
+        <w:insideV w:val="single" w:sz="4" w:space="0" w:color="BFBFBF" w:themeColor="background1" w:themeShade="BF"/>
+      </w:tblBorders>
+    </w:tblPr>
+    <w:tblStylePr w:type="firstRow">
+      <w:rPr>
+        <w:b/>
+        <w:bCs/>
+      </w:rPr>
+    </w:tblStylePr>
+    <w:tblStylePr w:type="lastRow">
+      <w:rPr>
+        <w:b/>
+        <w:bCs/>
+      </w:rPr>
+      <w:tblPr/>
+      <w:tcPr>
+        <w:tcBorders>
+          <w:top w:val="double" w:sz="4" w:space="0" w:color="BFBFBF" w:themeColor="background1" w:themeShade="BF"/>
+        </w:tcBorders>
+      </w:tcPr>
+    </w:tblStylePr>
+    <w:tblStylePr w:type="firstCol">
+      <w:rPr>
+        <w:b/>
+        <w:bCs/>
+      </w:rPr>
+    </w:tblStylePr>
+    <w:tblStylePr w:type="lastCol">
+      <w:rPr>
+        <w:b/>
+        <w:bCs/>
+      </w:rPr>
+    </w:tblStylePr>
+    <w:tblStylePr w:type="band1Vert">
+      <w:tblPr/>
+      <w:tcPr>
+        <w:shd w:val="clear" w:color="auto" w:fill="F2F2F2" w:themeFill="background1" w:themeFillShade="F2"/>
+      </w:tcPr>
+    </w:tblStylePr>
+    <w:tblStylePr w:type="band1Horz">
+      <w:tblPr/>
+      <w:tcPr>
+        <w:shd w:val="clear" w:color="auto" w:fill="F2F2F2" w:themeFill="background1" w:themeFillShade="F2"/>
+      </w:tcPr>
+    </w:tblStylePr>
+  </w:style>
 </w:styles>
 </file>
 

</xml_diff>

<commit_message>
Proje 2: Windows Task Scheduler otomasyonu ve batch script eklendi
</commit_message>
<xml_diff>
--- a/BLM4522_Proje2/Rapor1.docx
+++ b/BLM4522_Proje2/Rapor1.docx
@@ -39,13 +39,8 @@
       </w:r>
     </w:p>
     <w:p>
-      <w:proofErr w:type="spellStart"/>
-      <w:r>
-        <w:t>Northwind</w:t>
-      </w:r>
-      <w:proofErr w:type="spellEnd"/>
-      <w:r>
-        <w:t xml:space="preserve"> veri seti başarılı bir şekilde sisteme entegre edildi. Tablo yapıları kontrol edildi.</w:t>
+      <w:r>
+        <w:t>Northwind veri seti başarılı bir şekilde sisteme entegre edildi. Tablo yapıları kontrol edildi.</w:t>
       </w:r>
     </w:p>
     <w:p>
@@ -116,44 +111,12 @@
           <w:b/>
           <w:bCs/>
         </w:rPr>
-        <w:t xml:space="preserve">Adım 2: Manuel Tam Yedek (Full </w:t>
-      </w:r>
-      <w:proofErr w:type="spellStart"/>
-      <w:r>
-        <w:rPr>
-          <w:b/>
-          <w:bCs/>
-        </w:rPr>
-        <w:t>Backup</w:t>
-      </w:r>
-      <w:proofErr w:type="spellEnd"/>
-      <w:r>
-        <w:rPr>
-          <w:b/>
-          <w:bCs/>
-        </w:rPr>
-        <w:t>) ve Doğrulama Testi</w:t>
-      </w:r>
-    </w:p>
-    <w:p>
-      <w:r>
-        <w:t xml:space="preserve">Veri kaybı riskine karşı </w:t>
-      </w:r>
-      <w:proofErr w:type="spellStart"/>
-      <w:r>
-        <w:t>Northwind</w:t>
-      </w:r>
-      <w:proofErr w:type="spellEnd"/>
-      <w:r>
-        <w:t xml:space="preserve"> </w:t>
-      </w:r>
-      <w:proofErr w:type="spellStart"/>
-      <w:r>
-        <w:t>veritabanının</w:t>
-      </w:r>
-      <w:proofErr w:type="spellEnd"/>
-      <w:r>
-        <w:t xml:space="preserve"> tam yedeğini manuel olarak aldım. Yedekleme dosyasının bütünlüğünü kontrol etmek için SSMS üzerinden doğrulama adımını da tamamladım. Şu an elimde sistem tarafından onaylanmış, hatasız bir yedek dosyası mevcut.</w:t>
+        <w:t>Adım 2: Manuel Tam Yedek (Full Backup) ve Doğrulama Testi</w:t>
+      </w:r>
+    </w:p>
+    <w:p>
+      <w:r>
+        <w:t>Veri kaybı riskine karşı Northwind veritabanının tam yedeğini manuel olarak aldım. Yedekleme dosyasının bütünlüğünü kontrol etmek için SSMS üzerinden doğrulama adımını da tamamladım. Şu an elimde sistem tarafından onaylanmış, hatasız bir yedek dosyası mevcut.</w:t>
       </w:r>
       <w:r>
         <w:rPr>
@@ -214,49 +177,12 @@
           <w:b/>
           <w:bCs/>
         </w:rPr>
-        <w:t>Adım 3: Fark (</w:t>
-      </w:r>
-      <w:proofErr w:type="spellStart"/>
-      <w:r>
-        <w:rPr>
-          <w:b/>
-          <w:bCs/>
-        </w:rPr>
-        <w:t>Differential</w:t>
-      </w:r>
-      <w:proofErr w:type="spellEnd"/>
-      <w:r>
-        <w:rPr>
-          <w:b/>
-          <w:bCs/>
-        </w:rPr>
-        <w:t>) Yedeği Alma ve Karşılaştığım Sorun</w:t>
-      </w:r>
-    </w:p>
-    <w:p>
-      <w:proofErr w:type="spellStart"/>
-      <w:r>
-        <w:t>Northwind</w:t>
-      </w:r>
-      <w:proofErr w:type="spellEnd"/>
-      <w:r>
-        <w:t xml:space="preserve"> </w:t>
-      </w:r>
-      <w:proofErr w:type="spellStart"/>
-      <w:r>
-        <w:t>veritabanı</w:t>
-      </w:r>
-      <w:proofErr w:type="spellEnd"/>
-      <w:r>
-        <w:t xml:space="preserve"> üzerinde ilk tam yedeğimi aldıktan sonra, sistemde bir değişiklik olması için </w:t>
-      </w:r>
-      <w:proofErr w:type="spellStart"/>
-      <w:r>
-        <w:t>Customers</w:t>
-      </w:r>
-      <w:proofErr w:type="spellEnd"/>
-      <w:r>
-        <w:t xml:space="preserve"> tablosundaki bir müşterinin ismini güncelledim</w:t>
+        <w:t>Adım 3: Fark (Differential) Yedeği Alma ve Karşılaştığım Sorun</w:t>
+      </w:r>
+    </w:p>
+    <w:p>
+      <w:r>
+        <w:t>Northwind veritabanı üzerinde ilk tam yedeğimi aldıktan sonra, sistemde bir değişiklik olması için Customers tablosundaki bir müşterinin ismini güncelledim</w:t>
       </w:r>
       <w:r>
         <w:t>.</w:t>
@@ -387,31 +313,7 @@
         <w:t>A</w:t>
       </w:r>
       <w:r>
-        <w:t>rdından sadece bu farkı kaydedecek olan Fark (</w:t>
-      </w:r>
-      <w:proofErr w:type="spellStart"/>
-      <w:r>
-        <w:t>Differential</w:t>
-      </w:r>
-      <w:proofErr w:type="spellEnd"/>
-      <w:r>
-        <w:t>) yedeği işlemini başlattım. İşlem sırasında başta '</w:t>
-      </w:r>
-      <w:proofErr w:type="spellStart"/>
-      <w:r>
-        <w:t>media</w:t>
-      </w:r>
-      <w:proofErr w:type="spellEnd"/>
-      <w:r>
-        <w:t xml:space="preserve"> </w:t>
-      </w:r>
-      <w:proofErr w:type="spellStart"/>
-      <w:r>
-        <w:t>families</w:t>
-      </w:r>
-      <w:proofErr w:type="spellEnd"/>
-      <w:r>
-        <w:t>' hatasıyla karşılaştım</w:t>
+        <w:t>rdından sadece bu farkı kaydedecek olan Fark (Differential) yedeği işlemini başlattım. İşlem sırasında başta 'media families' hatasıyla karşılaştım</w:t>
       </w:r>
       <w:r>
         <w:t xml:space="preserve">. </w:t>
@@ -419,24 +321,11 @@
       <w:r>
         <w:t xml:space="preserve">Bu sorunu çözmek için </w:t>
       </w:r>
-      <w:proofErr w:type="spellStart"/>
-      <w:r>
-        <w:t>Overwrite</w:t>
-      </w:r>
-      <w:proofErr w:type="spellEnd"/>
-      <w:r>
-        <w:t xml:space="preserve"> işlemi gerçekleştirdim</w:t>
-      </w:r>
-      <w:r>
-        <w:t xml:space="preserve"> ve görseldeki gibi başarı mesajını alarak işlemi tamamladım. Böylece </w:t>
-      </w:r>
-      <w:proofErr w:type="spellStart"/>
-      <w:r>
-        <w:t>veritabanındaki</w:t>
-      </w:r>
-      <w:proofErr w:type="spellEnd"/>
-      <w:r>
-        <w:t xml:space="preserve"> güncel değişiklikleri güvenli bir şekilde yedeklemeyi başardım.</w:t>
+      <w:r>
+        <w:t>Overwrite işlemi gerçekleştirdim</w:t>
+      </w:r>
+      <w:r>
+        <w:t xml:space="preserve"> ve görseldeki gibi başarı mesajını alarak işlemi tamamladım. Böylece veritabanındaki güncel değişiklikleri güvenli bir şekilde yedeklemeyi başardım.</w:t>
       </w:r>
     </w:p>
     <w:p>
@@ -501,23 +390,7 @@
     </w:p>
     <w:p>
       <w:r>
-        <w:t>Kullandığım SQL Server (</w:t>
-      </w:r>
-      <w:proofErr w:type="spellStart"/>
-      <w:r>
-        <w:t>LocalDB</w:t>
-      </w:r>
-      <w:proofErr w:type="spellEnd"/>
-      <w:r>
-        <w:t xml:space="preserve">) sürümü 'SQL Server Aracı' (Agent) hizmetini desteklemediği için, yedekleme işlemini otomatize etmek adına T-SQL </w:t>
-      </w:r>
-      <w:proofErr w:type="spellStart"/>
-      <w:r>
-        <w:t>script</w:t>
-      </w:r>
-      <w:proofErr w:type="spellEnd"/>
-      <w:r>
-        <w:t xml:space="preserve"> yöntemini tercih ettim. Manuel olarak arayüzden yapmak yerine, yukarıdaki SQL komutunu hazırlayarak yedekleme sürecini bir kod yapısına dönüştürdüm.</w:t>
+        <w:t>Kullandığım SQL Server (LocalDB) sürümü 'SQL Server Aracı' (Agent) hizmetini desteklemediği için, yedekleme işlemini otomatize etmek adına T-SQL script yöntemini tercih ettim. Manuel olarak arayüzden yapmak yerine, yukarıdaki SQL komutunu hazırlayarak yedekleme sürecini bir kod yapısına dönüştürdüm.</w:t>
       </w:r>
     </w:p>
     <w:p>
@@ -595,173 +468,24 @@
       </w:r>
     </w:p>
     <w:p>
-      <w:proofErr w:type="spellStart"/>
-      <w:r>
-        <w:t>Veritabanını</w:t>
-      </w:r>
-      <w:proofErr w:type="spellEnd"/>
-      <w:r>
-        <w:t xml:space="preserve"> 'Full' kurtarma moduna aldıktan sonra doğrudan Log yedeği almaya çalıştığımda </w:t>
+      <w:r>
+        <w:t xml:space="preserve">Veritabanını 'Full' kurtarma moduna aldıktan sonra doğrudan Log yedeği almaya çalıştığımda </w:t>
       </w:r>
       <w:r>
         <w:rPr>
           <w:i/>
           <w:iCs/>
         </w:rPr>
-        <w:t xml:space="preserve">'BACKUP LOG </w:t>
-      </w:r>
-      <w:proofErr w:type="spellStart"/>
-      <w:r>
-        <w:rPr>
-          <w:i/>
-          <w:iCs/>
-        </w:rPr>
-        <w:t>cannot</w:t>
-      </w:r>
-      <w:proofErr w:type="spellEnd"/>
-      <w:r>
-        <w:rPr>
-          <w:i/>
-          <w:iCs/>
-        </w:rPr>
-        <w:t xml:space="preserve"> be </w:t>
-      </w:r>
-      <w:proofErr w:type="spellStart"/>
-      <w:r>
-        <w:rPr>
-          <w:i/>
-          <w:iCs/>
-        </w:rPr>
-        <w:t>performed</w:t>
-      </w:r>
-      <w:proofErr w:type="spellEnd"/>
-      <w:r>
-        <w:rPr>
-          <w:i/>
-          <w:iCs/>
-        </w:rPr>
-        <w:t xml:space="preserve"> </w:t>
-      </w:r>
-      <w:proofErr w:type="spellStart"/>
-      <w:r>
-        <w:rPr>
-          <w:i/>
-          <w:iCs/>
-        </w:rPr>
-        <w:t>because</w:t>
-      </w:r>
-      <w:proofErr w:type="spellEnd"/>
-      <w:r>
-        <w:rPr>
-          <w:i/>
-          <w:iCs/>
-        </w:rPr>
-        <w:t xml:space="preserve"> </w:t>
-      </w:r>
-      <w:proofErr w:type="spellStart"/>
-      <w:r>
-        <w:rPr>
-          <w:i/>
-          <w:iCs/>
-        </w:rPr>
-        <w:t>there</w:t>
-      </w:r>
-      <w:proofErr w:type="spellEnd"/>
-      <w:r>
-        <w:rPr>
-          <w:i/>
-          <w:iCs/>
-        </w:rPr>
-        <w:t xml:space="preserve"> is </w:t>
-      </w:r>
-      <w:proofErr w:type="spellStart"/>
-      <w:r>
-        <w:rPr>
-          <w:i/>
-          <w:iCs/>
-        </w:rPr>
-        <w:t>no</w:t>
-      </w:r>
-      <w:proofErr w:type="spellEnd"/>
-      <w:r>
-        <w:rPr>
-          <w:i/>
-          <w:iCs/>
-        </w:rPr>
-        <w:t xml:space="preserve"> </w:t>
-      </w:r>
-      <w:proofErr w:type="spellStart"/>
-      <w:r>
-        <w:rPr>
-          <w:i/>
-          <w:iCs/>
-        </w:rPr>
-        <w:t>current</w:t>
-      </w:r>
-      <w:proofErr w:type="spellEnd"/>
-      <w:r>
-        <w:rPr>
-          <w:i/>
-          <w:iCs/>
-        </w:rPr>
-        <w:t xml:space="preserve"> </w:t>
-      </w:r>
-      <w:proofErr w:type="spellStart"/>
-      <w:r>
-        <w:rPr>
-          <w:i/>
-          <w:iCs/>
-        </w:rPr>
-        <w:t>database</w:t>
-      </w:r>
-      <w:proofErr w:type="spellEnd"/>
-      <w:r>
-        <w:rPr>
-          <w:i/>
-          <w:iCs/>
-        </w:rPr>
-        <w:t xml:space="preserve"> </w:t>
-      </w:r>
-      <w:proofErr w:type="spellStart"/>
-      <w:r>
-        <w:rPr>
-          <w:i/>
-          <w:iCs/>
-        </w:rPr>
-        <w:t>backup</w:t>
-      </w:r>
-      <w:proofErr w:type="spellEnd"/>
-      <w:r>
-        <w:rPr>
-          <w:i/>
-          <w:iCs/>
-        </w:rPr>
-        <w:t xml:space="preserve">' </w:t>
-      </w:r>
-      <w:r>
-        <w:t xml:space="preserve">hatasıyla karşılaştım. Bu durumun sebebinin, mod değişikliği sonrası yeni bir Tam Yedek (Full </w:t>
-      </w:r>
-      <w:proofErr w:type="spellStart"/>
-      <w:r>
-        <w:t>Backup</w:t>
-      </w:r>
-      <w:proofErr w:type="spellEnd"/>
-      <w:r>
-        <w:t xml:space="preserve">) </w:t>
-      </w:r>
-      <w:proofErr w:type="gramStart"/>
-      <w:r>
-        <w:t>gere</w:t>
+        <w:t xml:space="preserve">'BACKUP LOG cannot be performed because there is no current database backup' </w:t>
+      </w:r>
+      <w:r>
+        <w:t>hatasıyla karşılaştım. Bu durumun sebebinin, mod değişikliği sonrası yeni bir Tam Yedek (Full Backup) gere</w:t>
       </w:r>
       <w:r>
         <w:t xml:space="preserve">ği </w:t>
       </w:r>
       <w:r>
-        <w:t xml:space="preserve"> olduğunu</w:t>
-      </w:r>
-      <w:proofErr w:type="gramEnd"/>
-      <w:r>
-        <w:t xml:space="preserve"> fark ettim. Önce 'Full' modda yeni bir tam yedek </w:t>
+        <w:t xml:space="preserve"> olduğunu fark ettim. Önce 'Full' modda yeni bir tam yedek </w:t>
       </w:r>
       <w:r>
         <w:t xml:space="preserve">aldım </w:t>
@@ -843,15 +567,7 @@
     </w:p>
     <w:p>
       <w:r>
-        <w:t xml:space="preserve">Bu aşamada projenin en önemli kısmı olan 'Point-in-Time' kurtarma testini yaptım. Önce </w:t>
-      </w:r>
-      <w:proofErr w:type="spellStart"/>
-      <w:r>
-        <w:t>veritabanındaki</w:t>
-      </w:r>
-      <w:proofErr w:type="spellEnd"/>
-      <w:r>
-        <w:t xml:space="preserve"> tüm ürün fiyatlarını yanlış bir sorguyla sıfırlayarak yapay bir felaket senaryosu oluşturdum.</w:t>
+        <w:t>Bu aşamada projenin en önemli kısmı olan 'Point-in-Time' kurtarma testini yaptım. Önce veritabanındaki tüm ürün fiyatlarını yanlış bir sorguyla sıfırlayarak yapay bir felaket senaryosu oluşturdum.</w:t>
       </w:r>
     </w:p>
     <w:p>
@@ -910,15 +626,7 @@
     <w:p>
       <w:r>
         <w:lastRenderedPageBreak/>
-        <w:t xml:space="preserve">Ardından, daha önce yapılandırdığım Log yedeklerini kullanarak </w:t>
-      </w:r>
-      <w:proofErr w:type="spellStart"/>
-      <w:r>
-        <w:t>veritabanını</w:t>
-      </w:r>
-      <w:proofErr w:type="spellEnd"/>
-      <w:r>
-        <w:t xml:space="preserve"> bu hatanın yapıldığı andan tam 2 dakika öncesine geri döndürdüm.</w:t>
+        <w:t>Ardından, daha önce yapılandırdığım Log yedeklerini kullanarak veritabanını bu hatanın yapıldığı andan tam 2 dakika öncesine geri döndürdüm.</w:t>
       </w:r>
     </w:p>
     <w:p>
@@ -1198,13 +906,8 @@
             <w:pPr>
               <w:spacing w:after="160" w:line="278" w:lineRule="auto"/>
             </w:pPr>
-            <w:proofErr w:type="spellStart"/>
             <w:r>
-              <w:t>Differential</w:t>
-            </w:r>
-            <w:proofErr w:type="spellEnd"/>
-            <w:r>
-              <w:t xml:space="preserve"> (Fark)</w:t>
+              <w:t>Differential (Fark)</w:t>
             </w:r>
           </w:p>
         </w:tc>
@@ -1317,80 +1020,19 @@
           <w:b/>
           <w:bCs/>
         </w:rPr>
-        <w:t xml:space="preserve">Tam Felaket </w:t>
-      </w:r>
-      <w:proofErr w:type="gramStart"/>
-      <w:r>
-        <w:rPr>
-          <w:b/>
-          <w:bCs/>
-        </w:rPr>
-        <w:t>Senaryosu -</w:t>
-      </w:r>
-      <w:proofErr w:type="gramEnd"/>
-      <w:r>
-        <w:rPr>
-          <w:b/>
-          <w:bCs/>
-        </w:rPr>
-        <w:t xml:space="preserve"> </w:t>
-      </w:r>
-      <w:proofErr w:type="spellStart"/>
-      <w:r>
-        <w:rPr>
-          <w:b/>
-          <w:bCs/>
-        </w:rPr>
-        <w:t>Veritabanı</w:t>
-      </w:r>
-      <w:proofErr w:type="spellEnd"/>
-      <w:r>
-        <w:rPr>
-          <w:b/>
-          <w:bCs/>
-        </w:rPr>
-        <w:t xml:space="preserve"> Silme ve Full Restore</w:t>
-      </w:r>
-    </w:p>
-    <w:p>
-      <w:r>
-        <w:t xml:space="preserve">Projenin güvenilirliğini test etmek amacıyla </w:t>
-      </w:r>
-      <w:proofErr w:type="spellStart"/>
-      <w:r>
-        <w:t>Northwind</w:t>
-      </w:r>
-      <w:proofErr w:type="spellEnd"/>
-      <w:r>
-        <w:t xml:space="preserve"> </w:t>
-      </w:r>
-      <w:proofErr w:type="spellStart"/>
-      <w:r>
-        <w:t>veritabanını</w:t>
-      </w:r>
-      <w:proofErr w:type="spellEnd"/>
-      <w:r>
-        <w:t xml:space="preserve"> sistemden tamamen sildim (</w:t>
-      </w:r>
-      <w:proofErr w:type="spellStart"/>
-      <w:r>
-        <w:t>Delete</w:t>
-      </w:r>
-      <w:proofErr w:type="spellEnd"/>
-      <w:r>
-        <w:t xml:space="preserve">). Bu işlemle sunucu çökmesi veya </w:t>
-      </w:r>
-      <w:proofErr w:type="spellStart"/>
-      <w:r>
-        <w:t>veritabanının</w:t>
-      </w:r>
-      <w:proofErr w:type="spellEnd"/>
-      <w:r>
-        <w:t xml:space="preserve"> yanlışlıkla silinmesi gibi en kötü senaryoyu simüle ettim.</w:t>
-      </w:r>
-    </w:p>
-    <w:p>
-      <w:r>
+        <w:t>Tam Felaket Senaryosu - Veritabanı Silme ve Full Restore</w:t>
+      </w:r>
+    </w:p>
+    <w:p>
+      <w:r>
+        <w:t>Projenin güvenilirliğini test etmek amacıyla Northwind veritabanını sistemden tamamen sildim (Delete). Bu işlemle sunucu çökmesi veya veritabanının yanlışlıkla silinmesi gibi en kötü senaryoyu simüle ettim.</w:t>
+      </w:r>
+    </w:p>
+    <w:p>
+      <w:r>
+        <w:rPr>
+          <w:noProof/>
+        </w:rPr>
         <w:drawing>
           <wp:inline distT="0" distB="0" distL="0" distR="0" wp14:anchorId="23654EF7" wp14:editId="24A7AE1A">
             <wp:extent cx="2767067" cy="2598420"/>
@@ -1431,38 +1073,24 @@
     <w:p/>
     <w:p>
       <w:r>
-        <w:t xml:space="preserve">Aşağıdaki görsellerde görüldüğü üzere, sistemde olmayan </w:t>
-      </w:r>
-      <w:proofErr w:type="spellStart"/>
-      <w:r>
-        <w:t>veritabanı</w:t>
-      </w:r>
-      <w:proofErr w:type="spellEnd"/>
-      <w:r>
-        <w:t xml:space="preserve"> aldığım </w:t>
+        <w:t xml:space="preserve">Aşağıdaki görsellerde görüldüğü üzere, sistemde olmayan veritabanı aldığım </w:t>
       </w:r>
       <w:r>
         <w:rPr>
           <w:b/>
           <w:bCs/>
         </w:rPr>
-        <w:t xml:space="preserve">Full </w:t>
-      </w:r>
-      <w:proofErr w:type="spellStart"/>
-      <w:r>
-        <w:rPr>
-          <w:b/>
-          <w:bCs/>
-        </w:rPr>
-        <w:t>Backup</w:t>
-      </w:r>
-      <w:proofErr w:type="spellEnd"/>
+        <w:t>Full Backup</w:t>
+      </w:r>
       <w:r>
         <w:t xml:space="preserve"> sayesinde saniyeler içinde tüm tabloları ve verileriyle birlikte geri geldi. Ürün fiyatlarını kontrol ettiğimde, verilerin hatasız bir şekilde kurtarıldığını doğruladım. Bu test, hazırladığım yedekleme stratejisinin 'tam yıkım' anında bile sorunsuz çalıştığını kanıtladı.</w:t>
       </w:r>
     </w:p>
     <w:p>
       <w:r>
+        <w:rPr>
+          <w:noProof/>
+        </w:rPr>
         <w:drawing>
           <wp:inline distT="0" distB="0" distL="0" distR="0" wp14:anchorId="47C5107F" wp14:editId="3545EC52">
             <wp:extent cx="3649980" cy="3197353"/>
@@ -1488,6 +1116,192 @@
                     <a:xfrm>
                       <a:off x="0" y="0"/>
                       <a:ext cx="3657388" cy="3203842"/>
+                    </a:xfrm>
+                    <a:prstGeom prst="rect">
+                      <a:avLst/>
+                    </a:prstGeom>
+                  </pic:spPr>
+                </pic:pic>
+              </a:graphicData>
+            </a:graphic>
+          </wp:inline>
+        </w:drawing>
+      </w:r>
+    </w:p>
+    <w:p>
+      <w:r>
+        <w:lastRenderedPageBreak/>
+        <w:t>07.04.2026</w:t>
+      </w:r>
+    </w:p>
+    <w:p>
+      <w:pPr>
+        <w:rPr>
+          <w:b/>
+          <w:bCs/>
+        </w:rPr>
+      </w:pPr>
+      <w:r>
+        <w:rPr>
+          <w:b/>
+          <w:bCs/>
+        </w:rPr>
+        <w:t xml:space="preserve">Adım 9: </w:t>
+      </w:r>
+      <w:r>
+        <w:rPr>
+          <w:b/>
+          <w:bCs/>
+        </w:rPr>
+        <w:t xml:space="preserve"> </w:t>
+      </w:r>
+      <w:r>
+        <w:rPr>
+          <w:b/>
+          <w:bCs/>
+        </w:rPr>
+        <w:t>SQL Server Agent Alternatifi Olarak Görev Zamanlayıcı Yapılandırması</w:t>
+      </w:r>
+    </w:p>
+    <w:p>
+      <w:r>
+        <w:t>Projemde kullandığım SQL Server LocalDB sürümünde, yedekleme işlerini otomatiğe bağlaya</w:t>
+      </w:r>
+      <w:r>
+        <w:t>bileceğim</w:t>
+      </w:r>
+      <w:r>
+        <w:t xml:space="preserve"> SQL Server Agent özelliği bulunm</w:t>
+      </w:r>
+      <w:r>
+        <w:t>amakta</w:t>
+      </w:r>
+      <w:r>
+        <w:t>. Bu sorunu aşmak için Windows'un kendi içinde bulunan Görev Zamanlayıcı aracın</w:t>
+      </w:r>
+      <w:r>
+        <w:t>dan faydalandım</w:t>
+      </w:r>
+      <w:r>
+        <w:t xml:space="preserve">. </w:t>
+      </w:r>
+      <w:r>
+        <w:t>Öncelikle</w:t>
+      </w:r>
+      <w:r>
+        <w:t xml:space="preserve">, yazdığım yedekleme kodlarını tek tıkla çalıştıracak bir .bat (toplu iş dosyası) hazırladım. </w:t>
+      </w:r>
+      <w:r>
+        <w:t>Ardından,</w:t>
+      </w:r>
+      <w:r>
+        <w:t xml:space="preserve"> "SQL_Northwind_Yedekleme" adında bir görev oluşturdum ve bu görevin her gece tam 00:00'da kendi kendine çalışmasını sağladım.</w:t>
+      </w:r>
+    </w:p>
+    <w:p>
+      <w:r>
+        <w:drawing>
+          <wp:inline distT="0" distB="0" distL="0" distR="0" wp14:anchorId="0FCA1F79" wp14:editId="6C00346A">
+            <wp:extent cx="5760720" cy="4128770"/>
+            <wp:effectExtent l="0" t="0" r="0" b="5080"/>
+            <wp:docPr id="1930893071" name="Resim 1" descr="metin, yazılım, bilgisayar simgesi, web sayfası içeren bir resim&#10;&#10;Yapay zeka tarafından oluşturulmuş içerik yanlış olabilir."/>
+            <wp:cNvGraphicFramePr>
+              <a:graphicFrameLocks xmlns:a="http://schemas.openxmlformats.org/drawingml/2006/main" noChangeAspect="1"/>
+            </wp:cNvGraphicFramePr>
+            <a:graphic xmlns:a="http://schemas.openxmlformats.org/drawingml/2006/main">
+              <a:graphicData uri="http://schemas.openxmlformats.org/drawingml/2006/picture">
+                <pic:pic xmlns:pic="http://schemas.openxmlformats.org/drawingml/2006/picture">
+                  <pic:nvPicPr>
+                    <pic:cNvPr id="1930893071" name="Resim 1" descr="metin, yazılım, bilgisayar simgesi, web sayfası içeren bir resim&#10;&#10;Yapay zeka tarafından oluşturulmuş içerik yanlış olabilir."/>
+                    <pic:cNvPicPr/>
+                  </pic:nvPicPr>
+                  <pic:blipFill>
+                    <a:blip r:embed="rId16"/>
+                    <a:stretch>
+                      <a:fillRect/>
+                    </a:stretch>
+                  </pic:blipFill>
+                  <pic:spPr>
+                    <a:xfrm>
+                      <a:off x="0" y="0"/>
+                      <a:ext cx="5760720" cy="4128770"/>
+                    </a:xfrm>
+                    <a:prstGeom prst="rect">
+                      <a:avLst/>
+                    </a:prstGeom>
+                  </pic:spPr>
+                </pic:pic>
+              </a:graphicData>
+            </a:graphic>
+          </wp:inline>
+        </w:drawing>
+      </w:r>
+    </w:p>
+    <w:p/>
+    <w:p/>
+    <w:p/>
+    <w:p/>
+    <w:p/>
+    <w:p/>
+    <w:p/>
+    <w:p>
+      <w:r>
+        <w:lastRenderedPageBreak/>
+        <w:t>Oluşturduğum bu görev</w:t>
+      </w:r>
+      <w:r>
+        <w:t>e</w:t>
+      </w:r>
+      <w:r>
+        <w:t xml:space="preserve"> ise hazırladığım OtoYedek.bat dosyasını tanıttım. </w:t>
+      </w:r>
+      <w:r>
+        <w:t>Ö</w:t>
+      </w:r>
+      <w:r>
+        <w:t>zet ekranında da görüldüğü üzere; sistem artık her gece ben bilgisayar başında olmasam bile otomatik olarak tetiklenecek ve SQLCMD komutu sayesinde veritaban</w:t>
+      </w:r>
+      <w:r>
+        <w:t>ının</w:t>
+      </w:r>
+      <w:r>
+        <w:t xml:space="preserve"> güncel yedeği</w:t>
+      </w:r>
+      <w:r>
+        <w:t xml:space="preserve"> alınacaktır.</w:t>
+      </w:r>
+      <w:r>
+        <w:t xml:space="preserve"> </w:t>
+      </w:r>
+    </w:p>
+    <w:p/>
+    <w:p>
+      <w:r>
+        <w:drawing>
+          <wp:inline distT="0" distB="0" distL="0" distR="0" wp14:anchorId="0E6A25AB" wp14:editId="05BCB03A">
+            <wp:extent cx="5760720" cy="4113530"/>
+            <wp:effectExtent l="0" t="0" r="0" b="1270"/>
+            <wp:docPr id="230906411" name="Resim 1" descr="metin, yazılım, web sayfası, bilgisayar simgesi içeren bir resim&#10;&#10;Yapay zeka tarafından oluşturulmuş içerik yanlış olabilir."/>
+            <wp:cNvGraphicFramePr>
+              <a:graphicFrameLocks xmlns:a="http://schemas.openxmlformats.org/drawingml/2006/main" noChangeAspect="1"/>
+            </wp:cNvGraphicFramePr>
+            <a:graphic xmlns:a="http://schemas.openxmlformats.org/drawingml/2006/main">
+              <a:graphicData uri="http://schemas.openxmlformats.org/drawingml/2006/picture">
+                <pic:pic xmlns:pic="http://schemas.openxmlformats.org/drawingml/2006/picture">
+                  <pic:nvPicPr>
+                    <pic:cNvPr id="230906411" name="Resim 1" descr="metin, yazılım, web sayfası, bilgisayar simgesi içeren bir resim&#10;&#10;Yapay zeka tarafından oluşturulmuş içerik yanlış olabilir."/>
+                    <pic:cNvPicPr/>
+                  </pic:nvPicPr>
+                  <pic:blipFill>
+                    <a:blip r:embed="rId17"/>
+                    <a:stretch>
+                      <a:fillRect/>
+                    </a:stretch>
+                  </pic:blipFill>
+                  <pic:spPr>
+                    <a:xfrm>
+                      <a:off x="0" y="0"/>
+                      <a:ext cx="5760720" cy="4113530"/>
                     </a:xfrm>
                     <a:prstGeom prst="rect">
                       <a:avLst/>

</xml_diff>

<commit_message>
Proje 2: Yedekleme stratejisi ve teknik kısıt analizi rapora eklendi.
</commit_message>
<xml_diff>
--- a/BLM4522_Proje2/Rapor1.docx
+++ b/BLM4522_Proje2/Rapor1.docx
@@ -64,7 +64,7 @@
                     <pic:cNvPicPr/>
                   </pic:nvPicPr>
                   <pic:blipFill>
-                    <a:blip r:embed="rId4"/>
+                    <a:blip r:embed="rId5"/>
                     <a:stretch>
                       <a:fillRect/>
                     </a:stretch>
@@ -138,7 +138,7 @@
                     <pic:cNvPicPr/>
                   </pic:nvPicPr>
                   <pic:blipFill>
-                    <a:blip r:embed="rId5"/>
+                    <a:blip r:embed="rId6"/>
                     <a:stretch>
                       <a:fillRect/>
                     </a:stretch>
@@ -287,7 +287,7 @@
                     <pic:cNvPicPr/>
                   </pic:nvPicPr>
                   <pic:blipFill>
-                    <a:blip r:embed="rId6"/>
+                    <a:blip r:embed="rId7"/>
                     <a:stretch>
                       <a:fillRect/>
                     </a:stretch>
@@ -349,7 +349,7 @@
                     <pic:cNvPicPr/>
                   </pic:nvPicPr>
                   <pic:blipFill>
-                    <a:blip r:embed="rId7"/>
+                    <a:blip r:embed="rId8"/>
                     <a:stretch>
                       <a:fillRect/>
                     </a:stretch>
@@ -414,7 +414,7 @@
                     <pic:cNvPicPr/>
                   </pic:nvPicPr>
                   <pic:blipFill>
-                    <a:blip r:embed="rId8"/>
+                    <a:blip r:embed="rId9"/>
                     <a:stretch>
                       <a:fillRect/>
                     </a:stretch>
@@ -516,7 +516,7 @@
                     <pic:cNvPicPr/>
                   </pic:nvPicPr>
                   <pic:blipFill>
-                    <a:blip r:embed="rId9"/>
+                    <a:blip r:embed="rId10"/>
                     <a:stretch>
                       <a:fillRect/>
                     </a:stretch>
@@ -592,7 +592,7 @@
                     <pic:cNvPicPr/>
                   </pic:nvPicPr>
                   <pic:blipFill>
-                    <a:blip r:embed="rId10"/>
+                    <a:blip r:embed="rId11"/>
                     <a:stretch>
                       <a:fillRect/>
                     </a:stretch>
@@ -650,7 +650,7 @@
                     <pic:cNvPicPr/>
                   </pic:nvPicPr>
                   <pic:blipFill>
-                    <a:blip r:embed="rId11"/>
+                    <a:blip r:embed="rId12"/>
                     <a:stretch>
                       <a:fillRect/>
                     </a:stretch>
@@ -693,7 +693,7 @@
                     <pic:cNvPicPr/>
                   </pic:nvPicPr>
                   <pic:blipFill>
-                    <a:blip r:embed="rId12"/>
+                    <a:blip r:embed="rId13"/>
                     <a:stretch>
                       <a:fillRect/>
                     </a:stretch>
@@ -742,7 +742,7 @@
                     <pic:cNvPicPr/>
                   </pic:nvPicPr>
                   <pic:blipFill>
-                    <a:blip r:embed="rId13"/>
+                    <a:blip r:embed="rId14"/>
                     <a:stretch>
                       <a:fillRect/>
                     </a:stretch>
@@ -1049,7 +1049,7 @@
                     <pic:cNvPicPr/>
                   </pic:nvPicPr>
                   <pic:blipFill>
-                    <a:blip r:embed="rId14"/>
+                    <a:blip r:embed="rId15"/>
                     <a:stretch>
                       <a:fillRect/>
                     </a:stretch>
@@ -1107,7 +1107,7 @@
                     <pic:cNvPicPr/>
                   </pic:nvPicPr>
                   <pic:blipFill>
-                    <a:blip r:embed="rId15"/>
+                    <a:blip r:embed="rId16"/>
                     <a:stretch>
                       <a:fillRect/>
                     </a:stretch>
@@ -1153,14 +1153,7 @@
           <w:b/>
           <w:bCs/>
         </w:rPr>
-        <w:t xml:space="preserve"> </w:t>
-      </w:r>
-      <w:r>
-        <w:rPr>
-          <w:b/>
-          <w:bCs/>
-        </w:rPr>
-        <w:t>SQL Server Agent Alternatifi Olarak Görev Zamanlayıcı Yapılandırması</w:t>
+        <w:t xml:space="preserve"> SQL Server Agent Alternatifi Olarak Görev Zamanlayıcı Yapılandırması</w:t>
       </w:r>
     </w:p>
     <w:p>
@@ -1200,6 +1193,9 @@
     </w:p>
     <w:p>
       <w:r>
+        <w:rPr>
+          <w:noProof/>
+        </w:rPr>
         <w:drawing>
           <wp:inline distT="0" distB="0" distL="0" distR="0" wp14:anchorId="0FCA1F79" wp14:editId="6C00346A">
             <wp:extent cx="5760720" cy="4128770"/>
@@ -1216,7 +1212,7 @@
                     <pic:cNvPicPr/>
                   </pic:nvPicPr>
                   <pic:blipFill>
-                    <a:blip r:embed="rId16"/>
+                    <a:blip r:embed="rId17"/>
                     <a:stretch>
                       <a:fillRect/>
                     </a:stretch>
@@ -1277,6 +1273,9 @@
     <w:p/>
     <w:p>
       <w:r>
+        <w:rPr>
+          <w:noProof/>
+        </w:rPr>
         <w:drawing>
           <wp:inline distT="0" distB="0" distL="0" distR="0" wp14:anchorId="0E6A25AB" wp14:editId="05BCB03A">
             <wp:extent cx="5760720" cy="4113530"/>
@@ -1293,7 +1292,7 @@
                     <pic:cNvPicPr/>
                   </pic:nvPicPr>
                   <pic:blipFill>
-                    <a:blip r:embed="rId17"/>
+                    <a:blip r:embed="rId18"/>
                     <a:stretch>
                       <a:fillRect/>
                     </a:stretch>
@@ -1314,6 +1313,216 @@
         </w:drawing>
       </w:r>
     </w:p>
+    <w:p/>
+    <w:p>
+      <w:r>
+        <w:t>07.04.2026</w:t>
+      </w:r>
+    </w:p>
+    <w:p>
+      <w:pPr>
+        <w:rPr>
+          <w:b/>
+          <w:bCs/>
+        </w:rPr>
+      </w:pPr>
+      <w:r>
+        <w:rPr>
+          <w:b/>
+          <w:bCs/>
+        </w:rPr>
+        <w:t>Adım 10: Yedekleme Stratejisi ve Verimlilik Analizi</w:t>
+      </w:r>
+    </w:p>
+    <w:p>
+      <w:r>
+        <w:t xml:space="preserve">Projenin son aşamasında, Full (Tam) + Differential (Fark) yedekleme döngüsünü </w:t>
+      </w:r>
+      <w:r>
+        <w:t>hazırladım</w:t>
+      </w:r>
+      <w:r>
+        <w:t xml:space="preserve">. Yazdığım T-SQL scripti ile önce sistemin tam bir yedeğini, ardından sadece değişen verileri içeren fark yedeğini aldım. </w:t>
+      </w:r>
+      <w:r>
+        <w:t>G</w:t>
+      </w:r>
+      <w:r>
+        <w:t>örselde, her iki yedekleme türünün de sorunsuz tamamlandığı görülmektedir.</w:t>
+      </w:r>
+    </w:p>
+    <w:p>
+      <w:r>
+        <w:t>Süreç sırasında disk tasarrufu için WITH COMPRESSION (Sıkıştırma) komutunu denedim; ancak kullandığım SQL Server Express/LocalDB sürümün</w:t>
+      </w:r>
+      <w:r>
+        <w:t xml:space="preserve">de bu </w:t>
+      </w:r>
+      <w:r>
+        <w:t>özelliği</w:t>
+      </w:r>
+      <w:r>
+        <w:t xml:space="preserve">n </w:t>
+      </w:r>
+      <w:r>
+        <w:t xml:space="preserve">desteklemediğini </w:t>
+      </w:r>
+      <w:r>
+        <w:t>fark ettim</w:t>
+      </w:r>
+      <w:r>
+        <w:t xml:space="preserve">. </w:t>
+      </w:r>
+      <w:r>
+        <w:t xml:space="preserve">Bu nedenle, </w:t>
+      </w:r>
+      <w:r>
+        <w:t xml:space="preserve">veri güvenliğini sağlamak </w:t>
+      </w:r>
+      <w:r>
+        <w:t>için</w:t>
+      </w:r>
+      <w:r>
+        <w:t xml:space="preserve"> sistemi şu plan</w:t>
+      </w:r>
+      <w:r>
+        <w:t>la tamamladım:</w:t>
+      </w:r>
+      <w:r>
+        <w:t xml:space="preserve"> </w:t>
+      </w:r>
+    </w:p>
+    <w:p>
+      <w:pPr>
+        <w:numPr>
+          <w:ilvl w:val="0"/>
+          <w:numId w:val="1"/>
+        </w:numPr>
+      </w:pPr>
+      <w:r>
+        <w:t>Haftalık Full Backup: Ana yedekleme noktası.</w:t>
+      </w:r>
+    </w:p>
+    <w:p>
+      <w:pPr>
+        <w:numPr>
+          <w:ilvl w:val="0"/>
+          <w:numId w:val="1"/>
+        </w:numPr>
+      </w:pPr>
+      <w:r>
+        <w:lastRenderedPageBreak/>
+        <w:t>Günlük Differential Backup: Günlük hızlı veri koruması.</w:t>
+      </w:r>
+    </w:p>
+    <w:p>
+      <w:pPr>
+        <w:numPr>
+          <w:ilvl w:val="0"/>
+          <w:numId w:val="1"/>
+        </w:numPr>
+      </w:pPr>
+      <w:r>
+        <w:t>15 Dakikada Bir Log Backup: Anlık (Point-in-time) geri dönüş imkanı.</w:t>
+      </w:r>
+    </w:p>
+    <w:p>
+      <w:pPr>
+        <w:ind w:left="360"/>
+      </w:pPr>
+    </w:p>
+    <w:p>
+      <w:r>
+        <w:rPr>
+          <w:noProof/>
+        </w:rPr>
+        <w:drawing>
+          <wp:inline distT="0" distB="0" distL="0" distR="0" wp14:anchorId="31F0FF3B" wp14:editId="5AEDF034">
+            <wp:extent cx="6264660" cy="3840480"/>
+            <wp:effectExtent l="0" t="0" r="3175" b="7620"/>
+            <wp:docPr id="985323101" name="Resim 2"/>
+            <wp:cNvGraphicFramePr>
+              <a:graphicFrameLocks xmlns:a="http://schemas.openxmlformats.org/drawingml/2006/main" noChangeAspect="1"/>
+            </wp:cNvGraphicFramePr>
+            <a:graphic xmlns:a="http://schemas.openxmlformats.org/drawingml/2006/main">
+              <a:graphicData uri="http://schemas.openxmlformats.org/drawingml/2006/picture">
+                <pic:pic xmlns:pic="http://schemas.openxmlformats.org/drawingml/2006/picture">
+                  <pic:nvPicPr>
+                    <pic:cNvPr id="0" name="Picture 2"/>
+                    <pic:cNvPicPr>
+                      <a:picLocks noChangeAspect="1" noChangeArrowheads="1"/>
+                    </pic:cNvPicPr>
+                  </pic:nvPicPr>
+                  <pic:blipFill>
+                    <a:blip r:embed="rId19">
+                      <a:extLst>
+                        <a:ext uri="{28A0092B-C50C-407E-A947-70E740481C1C}">
+                          <a14:useLocalDpi xmlns:a14="http://schemas.microsoft.com/office/drawing/2010/main" val="0"/>
+                        </a:ext>
+                      </a:extLst>
+                    </a:blip>
+                    <a:srcRect/>
+                    <a:stretch>
+                      <a:fillRect/>
+                    </a:stretch>
+                  </pic:blipFill>
+                  <pic:spPr bwMode="auto">
+                    <a:xfrm>
+                      <a:off x="0" y="0"/>
+                      <a:ext cx="6279914" cy="3849831"/>
+                    </a:xfrm>
+                    <a:prstGeom prst="rect">
+                      <a:avLst/>
+                    </a:prstGeom>
+                    <a:noFill/>
+                  </pic:spPr>
+                </pic:pic>
+              </a:graphicData>
+            </a:graphic>
+          </wp:inline>
+        </w:drawing>
+      </w:r>
+    </w:p>
+    <w:p/>
+    <w:p>
+      <w:r>
+        <w:drawing>
+          <wp:inline distT="0" distB="0" distL="0" distR="0" wp14:anchorId="0AC2FDE0" wp14:editId="75922A1A">
+            <wp:extent cx="2133785" cy="823031"/>
+            <wp:effectExtent l="0" t="0" r="0" b="0"/>
+            <wp:docPr id="1910935882" name="Resim 1"/>
+            <wp:cNvGraphicFramePr>
+              <a:graphicFrameLocks xmlns:a="http://schemas.openxmlformats.org/drawingml/2006/main" noChangeAspect="1"/>
+            </wp:cNvGraphicFramePr>
+            <a:graphic xmlns:a="http://schemas.openxmlformats.org/drawingml/2006/main">
+              <a:graphicData uri="http://schemas.openxmlformats.org/drawingml/2006/picture">
+                <pic:pic xmlns:pic="http://schemas.openxmlformats.org/drawingml/2006/picture">
+                  <pic:nvPicPr>
+                    <pic:cNvPr id="1910935882" name=""/>
+                    <pic:cNvPicPr/>
+                  </pic:nvPicPr>
+                  <pic:blipFill>
+                    <a:blip r:embed="rId20"/>
+                    <a:stretch>
+                      <a:fillRect/>
+                    </a:stretch>
+                  </pic:blipFill>
+                  <pic:spPr>
+                    <a:xfrm>
+                      <a:off x="0" y="0"/>
+                      <a:ext cx="2133785" cy="823031"/>
+                    </a:xfrm>
+                    <a:prstGeom prst="rect">
+                      <a:avLst/>
+                    </a:prstGeom>
+                  </pic:spPr>
+                </pic:pic>
+              </a:graphicData>
+            </a:graphic>
+          </wp:inline>
+        </w:drawing>
+      </w:r>
+    </w:p>
     <w:sectPr>
       <w:pgSz w:w="11906" w:h="16838"/>
       <w:pgMar w:top="1417" w:right="1417" w:bottom="1417" w:left="1417" w:header="708" w:footer="708" w:gutter="0"/>
@@ -1322,6 +1531,163 @@
     </w:sectPr>
   </w:body>
 </w:document>
+</file>
+
+<file path=word/numbering.xml><?xml version="1.0" encoding="utf-8"?>
+<w:numbering xmlns:wpc="http://schemas.microsoft.com/office/word/2010/wordprocessingCanvas" xmlns:cx="http://schemas.microsoft.com/office/drawing/2014/chartex" xmlns:cx1="http://schemas.microsoft.com/office/drawing/2015/9/8/chartex" xmlns:cx2="http://schemas.microsoft.com/office/drawing/2015/10/21/chartex" xmlns:cx3="http://schemas.microsoft.com/office/drawing/2016/5/9/chartex" xmlns:cx4="http://schemas.microsoft.com/office/drawing/2016/5/10/chartex" xmlns:cx5="http://schemas.microsoft.com/office/drawing/2016/5/11/chartex" xmlns:cx6="http://schemas.microsoft.com/office/drawing/2016/5/12/chartex" xmlns:cx7="http://schemas.microsoft.com/office/drawing/2016/5/13/chartex" xmlns:cx8="http://schemas.microsoft.com/office/drawing/2016/5/14/chartex" xmlns:mc="http://schemas.openxmlformats.org/markup-compatibility/2006" xmlns:aink="http://schemas.microsoft.com/office/drawing/2016/ink" xmlns:am3d="http://schemas.microsoft.com/office/drawing/2017/model3d" xmlns:o="urn:schemas-microsoft-com:office:office" xmlns:oel="http://schemas.microsoft.com/office/2019/extlst" xmlns:r="http://schemas.openxmlformats.org/officeDocument/2006/relationships" xmlns:m="http://schemas.openxmlformats.org/officeDocument/2006/math" xmlns:v="urn:schemas-microsoft-com:vml" xmlns:wp14="http://schemas.microsoft.com/office/word/2010/wordprocessingDrawing" xmlns:wp="http://schemas.openxmlformats.org/drawingml/2006/wordprocessingDrawing" xmlns:w10="urn:schemas-microsoft-com:office:word" xmlns:w="http://schemas.openxmlformats.org/wordprocessingml/2006/main" xmlns:w14="http://schemas.microsoft.com/office/word/2010/wordml" xmlns:w15="http://schemas.microsoft.com/office/word/2012/wordml" xmlns:w16cex="http://schemas.microsoft.com/office/word/2018/wordml/cex" xmlns:w16cid="http://schemas.microsoft.com/office/word/2016/wordml/cid" xmlns:w16="http://schemas.microsoft.com/office/word/2018/wordml" xmlns:w16du="http://schemas.microsoft.com/office/word/2023/wordml/word16du" xmlns:w16sdtdh="http://schemas.microsoft.com/office/word/2020/wordml/sdtdatahash" xmlns:w16sdtfl="http://schemas.microsoft.com/office/word/2024/wordml/sdtformatlock" xmlns:w16se="http://schemas.microsoft.com/office/word/2015/wordml/symex" xmlns:wpg="http://schemas.microsoft.com/office/word/2010/wordprocessingGroup" xmlns:wpi="http://schemas.microsoft.com/office/word/2010/wordprocessingInk" xmlns:wne="http://schemas.microsoft.com/office/word/2006/wordml" xmlns:wps="http://schemas.microsoft.com/office/word/2010/wordprocessingShape" mc:Ignorable="w14 w15 w16se w16cid w16 w16cex w16sdtdh w16sdtfl w16du wp14">
+  <w:abstractNum w:abstractNumId="0" w15:restartNumberingAfterBreak="0">
+    <w:nsid w:val="5D107CFF"/>
+    <w:multiLevelType w:val="multilevel"/>
+    <w:tmpl w:val="254E7076"/>
+    <w:lvl w:ilvl="0">
+      <w:start w:val="1"/>
+      <w:numFmt w:val="bullet"/>
+      <w:lvlText w:val=""/>
+      <w:lvlJc w:val="left"/>
+      <w:pPr>
+        <w:tabs>
+          <w:tab w:val="num" w:pos="720"/>
+        </w:tabs>
+        <w:ind w:left="720" w:hanging="360"/>
+      </w:pPr>
+      <w:rPr>
+        <w:rFonts w:ascii="Symbol" w:hAnsi="Symbol" w:hint="default"/>
+        <w:sz w:val="20"/>
+      </w:rPr>
+    </w:lvl>
+    <w:lvl w:ilvl="1" w:tentative="1">
+      <w:start w:val="1"/>
+      <w:numFmt w:val="bullet"/>
+      <w:lvlText w:val="o"/>
+      <w:lvlJc w:val="left"/>
+      <w:pPr>
+        <w:tabs>
+          <w:tab w:val="num" w:pos="1440"/>
+        </w:tabs>
+        <w:ind w:left="1440" w:hanging="360"/>
+      </w:pPr>
+      <w:rPr>
+        <w:rFonts w:ascii="Courier New" w:hAnsi="Courier New" w:hint="default"/>
+        <w:sz w:val="20"/>
+      </w:rPr>
+    </w:lvl>
+    <w:lvl w:ilvl="2" w:tentative="1">
+      <w:start w:val="1"/>
+      <w:numFmt w:val="bullet"/>
+      <w:lvlText w:val=""/>
+      <w:lvlJc w:val="left"/>
+      <w:pPr>
+        <w:tabs>
+          <w:tab w:val="num" w:pos="2160"/>
+        </w:tabs>
+        <w:ind w:left="2160" w:hanging="360"/>
+      </w:pPr>
+      <w:rPr>
+        <w:rFonts w:ascii="Wingdings" w:hAnsi="Wingdings" w:hint="default"/>
+        <w:sz w:val="20"/>
+      </w:rPr>
+    </w:lvl>
+    <w:lvl w:ilvl="3" w:tentative="1">
+      <w:start w:val="1"/>
+      <w:numFmt w:val="bullet"/>
+      <w:lvlText w:val=""/>
+      <w:lvlJc w:val="left"/>
+      <w:pPr>
+        <w:tabs>
+          <w:tab w:val="num" w:pos="2880"/>
+        </w:tabs>
+        <w:ind w:left="2880" w:hanging="360"/>
+      </w:pPr>
+      <w:rPr>
+        <w:rFonts w:ascii="Wingdings" w:hAnsi="Wingdings" w:hint="default"/>
+        <w:sz w:val="20"/>
+      </w:rPr>
+    </w:lvl>
+    <w:lvl w:ilvl="4" w:tentative="1">
+      <w:start w:val="1"/>
+      <w:numFmt w:val="bullet"/>
+      <w:lvlText w:val=""/>
+      <w:lvlJc w:val="left"/>
+      <w:pPr>
+        <w:tabs>
+          <w:tab w:val="num" w:pos="3600"/>
+        </w:tabs>
+        <w:ind w:left="3600" w:hanging="360"/>
+      </w:pPr>
+      <w:rPr>
+        <w:rFonts w:ascii="Wingdings" w:hAnsi="Wingdings" w:hint="default"/>
+        <w:sz w:val="20"/>
+      </w:rPr>
+    </w:lvl>
+    <w:lvl w:ilvl="5" w:tentative="1">
+      <w:start w:val="1"/>
+      <w:numFmt w:val="bullet"/>
+      <w:lvlText w:val=""/>
+      <w:lvlJc w:val="left"/>
+      <w:pPr>
+        <w:tabs>
+          <w:tab w:val="num" w:pos="4320"/>
+        </w:tabs>
+        <w:ind w:left="4320" w:hanging="360"/>
+      </w:pPr>
+      <w:rPr>
+        <w:rFonts w:ascii="Wingdings" w:hAnsi="Wingdings" w:hint="default"/>
+        <w:sz w:val="20"/>
+      </w:rPr>
+    </w:lvl>
+    <w:lvl w:ilvl="6" w:tentative="1">
+      <w:start w:val="1"/>
+      <w:numFmt w:val="bullet"/>
+      <w:lvlText w:val=""/>
+      <w:lvlJc w:val="left"/>
+      <w:pPr>
+        <w:tabs>
+          <w:tab w:val="num" w:pos="5040"/>
+        </w:tabs>
+        <w:ind w:left="5040" w:hanging="360"/>
+      </w:pPr>
+      <w:rPr>
+        <w:rFonts w:ascii="Wingdings" w:hAnsi="Wingdings" w:hint="default"/>
+        <w:sz w:val="20"/>
+      </w:rPr>
+    </w:lvl>
+    <w:lvl w:ilvl="7" w:tentative="1">
+      <w:start w:val="1"/>
+      <w:numFmt w:val="bullet"/>
+      <w:lvlText w:val=""/>
+      <w:lvlJc w:val="left"/>
+      <w:pPr>
+        <w:tabs>
+          <w:tab w:val="num" w:pos="5760"/>
+        </w:tabs>
+        <w:ind w:left="5760" w:hanging="360"/>
+      </w:pPr>
+      <w:rPr>
+        <w:rFonts w:ascii="Wingdings" w:hAnsi="Wingdings" w:hint="default"/>
+        <w:sz w:val="20"/>
+      </w:rPr>
+    </w:lvl>
+    <w:lvl w:ilvl="8" w:tentative="1">
+      <w:start w:val="1"/>
+      <w:numFmt w:val="bullet"/>
+      <w:lvlText w:val=""/>
+      <w:lvlJc w:val="left"/>
+      <w:pPr>
+        <w:tabs>
+          <w:tab w:val="num" w:pos="6480"/>
+        </w:tabs>
+        <w:ind w:left="6480" w:hanging="360"/>
+      </w:pPr>
+      <w:rPr>
+        <w:rFonts w:ascii="Wingdings" w:hAnsi="Wingdings" w:hint="default"/>
+        <w:sz w:val="20"/>
+      </w:rPr>
+    </w:lvl>
+  </w:abstractNum>
+  <w:num w:numId="1" w16cid:durableId="1751384593">
+    <w:abstractNumId w:val="0"/>
+  </w:num>
+</w:numbering>
 </file>
 
 <file path=word/styles.xml><?xml version="1.0" encoding="utf-8"?>
@@ -1927,6 +2293,7 @@
   <w:style w:type="character" w:default="1" w:styleId="VarsaylanParagrafYazTipi">
     <w:name w:val="Default Paragraph Font"/>
     <w:uiPriority w:val="1"/>
+    <w:semiHidden/>
     <w:unhideWhenUsed/>
   </w:style>
   <w:style w:type="table" w:default="1" w:styleId="NormalTablo">

</xml_diff>

<commit_message>
Proje 2: Kapak sayfası eklendi ve rapor son haliyle güncellendi
</commit_message>
<xml_diff>
--- a/BLM4522_Proje2/Rapor1.docx
+++ b/BLM4522_Proje2/Rapor1.docx
@@ -4,10 +4,425 @@
   <w:body>
     <w:p>
       <w:pPr>
+        <w:spacing w:after="0" w:line="360" w:lineRule="auto"/>
+        <w:jc w:val="center"/>
+        <w:rPr>
+          <w:rFonts w:cs="Arial"/>
+          <w:b/>
+          <w:sz w:val="28"/>
+          <w:szCs w:val="28"/>
+        </w:rPr>
+      </w:pPr>
+      <w:r>
+        <w:rPr>
+          <w:rFonts w:cs="Arial"/>
+          <w:b/>
+          <w:sz w:val="28"/>
+          <w:szCs w:val="28"/>
+        </w:rPr>
+        <w:t xml:space="preserve">ANKARA ÜNİVERSİTESİ </w:t>
+      </w:r>
+    </w:p>
+    <w:p>
+      <w:pPr>
+        <w:spacing w:after="0" w:line="360" w:lineRule="auto"/>
+        <w:jc w:val="center"/>
+        <w:rPr>
+          <w:rFonts w:cs="Arial"/>
+          <w:b/>
+          <w:sz w:val="28"/>
+          <w:szCs w:val="28"/>
+        </w:rPr>
+      </w:pPr>
+      <w:r>
+        <w:rPr>
+          <w:rFonts w:cs="Arial"/>
+          <w:b/>
+          <w:sz w:val="28"/>
+          <w:szCs w:val="28"/>
+        </w:rPr>
+        <w:t xml:space="preserve">MÜHENDİSLİK FAKÜLTESİ </w:t>
+      </w:r>
+    </w:p>
+    <w:p>
+      <w:pPr>
+        <w:spacing w:after="360" w:line="360" w:lineRule="auto"/>
+        <w:jc w:val="center"/>
+        <w:rPr>
+          <w:rFonts w:cs="Arial"/>
+          <w:b/>
+          <w:sz w:val="28"/>
+          <w:szCs w:val="28"/>
+        </w:rPr>
+      </w:pPr>
+      <w:r>
+        <w:rPr>
+          <w:rFonts w:cs="Arial"/>
+          <w:b/>
+          <w:sz w:val="28"/>
+          <w:szCs w:val="28"/>
+        </w:rPr>
+        <w:t xml:space="preserve">BİLGİSAYAR MÜHENDİSLİĞİ BÖLÜMÜ </w:t>
+      </w:r>
+    </w:p>
+    <w:p>
+      <w:pPr>
+        <w:spacing w:after="360" w:line="360" w:lineRule="auto"/>
+        <w:jc w:val="center"/>
+        <w:rPr>
+          <w:rFonts w:cs="Arial"/>
+          <w:b/>
+          <w:sz w:val="28"/>
+          <w:szCs w:val="28"/>
+        </w:rPr>
+      </w:pPr>
+      <w:r>
+        <w:rPr>
+          <w:rFonts w:cs="Arial"/>
+          <w:b/>
+          <w:noProof/>
+          <w:sz w:val="28"/>
+          <w:szCs w:val="28"/>
+        </w:rPr>
+        <w:drawing>
+          <wp:inline distT="0" distB="0" distL="0" distR="0" wp14:anchorId="0603129B" wp14:editId="3EED8A84">
+            <wp:extent cx="1800225" cy="1800225"/>
+            <wp:effectExtent l="19050" t="0" r="9525" b="0"/>
+            <wp:docPr id="1" name="Resim 1" descr="amblem, daire, logo, simge, sembol içeren bir resim&#10;&#10;Yapay zeka tarafından oluşturulmuş içerik yanlış olabilir."/>
+            <wp:cNvGraphicFramePr>
+              <a:graphicFrameLocks xmlns:a="http://schemas.openxmlformats.org/drawingml/2006/main" noChangeAspect="1"/>
+            </wp:cNvGraphicFramePr>
+            <a:graphic xmlns:a="http://schemas.openxmlformats.org/drawingml/2006/main">
+              <a:graphicData uri="http://schemas.openxmlformats.org/drawingml/2006/picture">
+                <pic:pic xmlns:pic="http://schemas.openxmlformats.org/drawingml/2006/picture">
+                  <pic:nvPicPr>
+                    <pic:cNvPr id="1" name="Resim 1" descr="amblem, daire, logo, simge, sembol içeren bir resim&#10;&#10;Yapay zeka tarafından oluşturulmuş içerik yanlış olabilir."/>
+                    <pic:cNvPicPr>
+                      <a:picLocks noChangeAspect="1" noChangeArrowheads="1"/>
+                    </pic:cNvPicPr>
+                  </pic:nvPicPr>
+                  <pic:blipFill>
+                    <a:blip r:embed="rId5" cstate="print"/>
+                    <a:srcRect/>
+                    <a:stretch>
+                      <a:fillRect/>
+                    </a:stretch>
+                  </pic:blipFill>
+                  <pic:spPr bwMode="auto">
+                    <a:xfrm>
+                      <a:off x="0" y="0"/>
+                      <a:ext cx="1800225" cy="1800225"/>
+                    </a:xfrm>
+                    <a:prstGeom prst="rect">
+                      <a:avLst/>
+                    </a:prstGeom>
+                    <a:noFill/>
+                    <a:ln w="9525">
+                      <a:noFill/>
+                      <a:miter lim="800000"/>
+                      <a:headEnd/>
+                      <a:tailEnd/>
+                    </a:ln>
+                  </pic:spPr>
+                </pic:pic>
+              </a:graphicData>
+            </a:graphic>
+          </wp:inline>
+        </w:drawing>
+      </w:r>
+    </w:p>
+    <w:p>
+      <w:pPr>
+        <w:spacing w:after="360" w:line="360" w:lineRule="auto"/>
+        <w:jc w:val="center"/>
+        <w:rPr>
+          <w:rFonts w:cs="Arial"/>
+          <w:b/>
+          <w:sz w:val="28"/>
+          <w:szCs w:val="28"/>
+        </w:rPr>
+      </w:pPr>
+    </w:p>
+    <w:p>
+      <w:pPr>
+        <w:spacing w:after="360" w:line="360" w:lineRule="auto"/>
+        <w:jc w:val="center"/>
+        <w:rPr>
+          <w:rFonts w:cs="Arial"/>
+          <w:b/>
+          <w:bCs/>
+          <w:sz w:val="28"/>
+          <w:szCs w:val="28"/>
+        </w:rPr>
+      </w:pPr>
+      <w:r>
+        <w:rPr>
+          <w:rFonts w:cs="Arial"/>
+          <w:b/>
+          <w:bCs/>
+          <w:sz w:val="28"/>
+          <w:szCs w:val="28"/>
+        </w:rPr>
+        <w:t xml:space="preserve">BLM 4522 – Proje </w:t>
+      </w:r>
+      <w:r>
+        <w:rPr>
+          <w:rFonts w:cs="Arial"/>
+          <w:b/>
+          <w:bCs/>
+          <w:sz w:val="28"/>
+          <w:szCs w:val="28"/>
+        </w:rPr>
+        <w:t>2</w:t>
+      </w:r>
+      <w:r>
+        <w:rPr>
+          <w:rFonts w:cs="Arial"/>
+          <w:b/>
+          <w:bCs/>
+          <w:sz w:val="28"/>
+          <w:szCs w:val="28"/>
+        </w:rPr>
+        <w:t xml:space="preserve">: </w:t>
+      </w:r>
+      <w:r>
+        <w:rPr>
+          <w:rFonts w:cs="Arial"/>
+          <w:b/>
+          <w:bCs/>
+          <w:sz w:val="28"/>
+          <w:szCs w:val="28"/>
+        </w:rPr>
+        <w:t>Yedekleme ve Felaketten Kurtarma</w:t>
+      </w:r>
+    </w:p>
+    <w:p>
+      <w:pPr>
+        <w:spacing w:after="360" w:line="360" w:lineRule="auto"/>
+        <w:jc w:val="center"/>
+        <w:rPr>
+          <w:rFonts w:cs="Arial"/>
+          <w:b/>
+          <w:bCs/>
+          <w:sz w:val="28"/>
+          <w:szCs w:val="28"/>
+        </w:rPr>
+      </w:pPr>
+      <w:r>
+        <w:rPr>
+          <w:rFonts w:cs="Arial"/>
+          <w:b/>
+          <w:bCs/>
+          <w:sz w:val="28"/>
+          <w:szCs w:val="28"/>
+        </w:rPr>
+        <w:t xml:space="preserve"> </w:t>
+      </w:r>
+      <w:proofErr w:type="gramStart"/>
+      <w:r>
+        <w:rPr>
+          <w:rFonts w:cs="Arial"/>
+          <w:b/>
+          <w:bCs/>
+          <w:sz w:val="28"/>
+          <w:szCs w:val="28"/>
+        </w:rPr>
+        <w:t>ve</w:t>
+      </w:r>
+      <w:proofErr w:type="gramEnd"/>
+      <w:r>
+        <w:rPr>
+          <w:rFonts w:cs="Arial"/>
+          <w:b/>
+          <w:bCs/>
+          <w:sz w:val="28"/>
+          <w:szCs w:val="28"/>
+        </w:rPr>
+        <w:t xml:space="preserve"> Erişim Kontrolü</w:t>
+      </w:r>
+      <w:r>
+        <w:rPr>
+          <w:rFonts w:cs="Arial"/>
+          <w:b/>
+          <w:bCs/>
+          <w:sz w:val="28"/>
+          <w:szCs w:val="28"/>
+        </w:rPr>
+        <w:t xml:space="preserve"> Raporu</w:t>
+      </w:r>
+    </w:p>
+    <w:p>
+      <w:pPr>
+        <w:spacing w:after="360" w:line="360" w:lineRule="auto"/>
+        <w:jc w:val="center"/>
+        <w:rPr>
+          <w:rFonts w:cs="Arial"/>
+          <w:b/>
+          <w:color w:val="000000" w:themeColor="text1"/>
+        </w:rPr>
+      </w:pPr>
+      <w:r>
+        <w:rPr>
+          <w:rFonts w:cs="Arial"/>
+          <w:b/>
+          <w:color w:val="000000" w:themeColor="text1"/>
+        </w:rPr>
+        <w:t xml:space="preserve">Senem Arıcı </w:t>
+      </w:r>
+    </w:p>
+    <w:p>
+      <w:pPr>
+        <w:spacing w:after="360" w:line="360" w:lineRule="auto"/>
+        <w:jc w:val="center"/>
+        <w:rPr>
+          <w:rFonts w:cs="Arial"/>
+          <w:b/>
+          <w:color w:val="000000" w:themeColor="text1"/>
+        </w:rPr>
+      </w:pPr>
+      <w:r>
+        <w:rPr>
+          <w:rFonts w:cs="Arial"/>
+          <w:b/>
+          <w:color w:val="000000" w:themeColor="text1"/>
+        </w:rPr>
+        <w:t>22290619</w:t>
+      </w:r>
+    </w:p>
+    <w:p>
+      <w:pPr>
+        <w:spacing w:after="360" w:line="360" w:lineRule="auto"/>
+        <w:jc w:val="center"/>
+        <w:rPr>
+          <w:rFonts w:cs="Arial"/>
+          <w:b/>
+          <w:color w:val="000000" w:themeColor="text1"/>
+        </w:rPr>
+      </w:pPr>
+      <w:r>
+        <w:rPr>
+          <w:rFonts w:cs="Arial"/>
+          <w:b/>
+          <w:color w:val="000000" w:themeColor="text1"/>
+        </w:rPr>
+        <w:t>20.04</w:t>
+      </w:r>
+      <w:r>
+        <w:rPr>
+          <w:rFonts w:cs="Arial"/>
+          <w:b/>
+          <w:color w:val="000000" w:themeColor="text1"/>
+        </w:rPr>
+        <w:t xml:space="preserve">.2026 </w:t>
+      </w:r>
+    </w:p>
+    <w:p>
+      <w:pPr>
         <w:pStyle w:val="Balk1"/>
         <w:jc w:val="center"/>
       </w:pPr>
       <w:r>
+        <w:rPr>
+          <w:rFonts w:asciiTheme="minorHAnsi" w:eastAsiaTheme="minorHAnsi" w:hAnsiTheme="minorHAnsi" w:cs="Arial"/>
+          <w:b/>
+          <w:color w:val="auto"/>
+          <w:sz w:val="24"/>
+          <w:szCs w:val="24"/>
+        </w:rPr>
+        <w:t>https://github.com/senemarici/BLM4522--</w:t>
+      </w:r>
+      <w:proofErr w:type="spellStart"/>
+      <w:r>
+        <w:rPr>
+          <w:rFonts w:asciiTheme="minorHAnsi" w:eastAsiaTheme="minorHAnsi" w:hAnsiTheme="minorHAnsi" w:cs="Arial"/>
+          <w:b/>
+          <w:color w:val="auto"/>
+          <w:sz w:val="24"/>
+          <w:szCs w:val="24"/>
+        </w:rPr>
+        <w:t>Ag</w:t>
+      </w:r>
+      <w:proofErr w:type="spellEnd"/>
+      <w:r>
+        <w:rPr>
+          <w:rFonts w:asciiTheme="minorHAnsi" w:eastAsiaTheme="minorHAnsi" w:hAnsiTheme="minorHAnsi" w:cs="Arial"/>
+          <w:b/>
+          <w:color w:val="auto"/>
+          <w:sz w:val="24"/>
+          <w:szCs w:val="24"/>
+        </w:rPr>
+        <w:t>-</w:t>
+      </w:r>
+      <w:proofErr w:type="spellStart"/>
+      <w:r>
+        <w:rPr>
+          <w:rFonts w:asciiTheme="minorHAnsi" w:eastAsiaTheme="minorHAnsi" w:hAnsiTheme="minorHAnsi" w:cs="Arial"/>
+          <w:b/>
+          <w:color w:val="auto"/>
+          <w:sz w:val="24"/>
+          <w:szCs w:val="24"/>
+        </w:rPr>
+        <w:t>Tabanli</w:t>
+      </w:r>
+      <w:proofErr w:type="spellEnd"/>
+      <w:r>
+        <w:rPr>
+          <w:rFonts w:asciiTheme="minorHAnsi" w:eastAsiaTheme="minorHAnsi" w:hAnsiTheme="minorHAnsi" w:cs="Arial"/>
+          <w:b/>
+          <w:color w:val="auto"/>
+          <w:sz w:val="24"/>
+          <w:szCs w:val="24"/>
+        </w:rPr>
+        <w:t>-Paralel-</w:t>
+      </w:r>
+      <w:proofErr w:type="spellStart"/>
+      <w:r>
+        <w:rPr>
+          <w:rFonts w:asciiTheme="minorHAnsi" w:eastAsiaTheme="minorHAnsi" w:hAnsiTheme="minorHAnsi" w:cs="Arial"/>
+          <w:b/>
+          <w:color w:val="auto"/>
+          <w:sz w:val="24"/>
+          <w:szCs w:val="24"/>
+        </w:rPr>
+        <w:t>Dagitim</w:t>
+      </w:r>
+      <w:proofErr w:type="spellEnd"/>
+      <w:r>
+        <w:rPr>
+          <w:rFonts w:asciiTheme="minorHAnsi" w:eastAsiaTheme="minorHAnsi" w:hAnsiTheme="minorHAnsi" w:cs="Arial"/>
+          <w:b/>
+          <w:color w:val="auto"/>
+          <w:sz w:val="24"/>
+          <w:szCs w:val="24"/>
+        </w:rPr>
+        <w:t>-Sistemleri-Projeleri</w:t>
+      </w:r>
+    </w:p>
+    <w:p>
+      <w:pPr>
+        <w:pStyle w:val="Balk1"/>
+        <w:jc w:val="center"/>
+      </w:pPr>
+    </w:p>
+    <w:p/>
+    <w:p/>
+    <w:p>
+      <w:pPr>
+        <w:pStyle w:val="Balk1"/>
+        <w:jc w:val="center"/>
+        <w:rPr>
+          <w:b/>
+          <w:bCs/>
+          <w:color w:val="000000" w:themeColor="text1"/>
+        </w:rPr>
+      </w:pPr>
+      <w:r>
+        <w:rPr>
+          <w:b/>
+          <w:bCs/>
+          <w:color w:val="000000" w:themeColor="text1"/>
+        </w:rPr>
+        <w:lastRenderedPageBreak/>
         <w:t>Proje 2: Yedekleme ve Felaketten Kurtarma</w:t>
       </w:r>
     </w:p>
@@ -39,8 +454,13 @@
       </w:r>
     </w:p>
     <w:p>
-      <w:r>
-        <w:t>Northwind veri seti başarılı bir şekilde sisteme entegre edildi. Tablo yapıları kontrol edildi.</w:t>
+      <w:proofErr w:type="spellStart"/>
+      <w:r>
+        <w:t>Northwind</w:t>
+      </w:r>
+      <w:proofErr w:type="spellEnd"/>
+      <w:r>
+        <w:t xml:space="preserve"> veri seti başarılı bir şekilde sisteme entegre edildi. Tablo yapıları kontrol edildi.</w:t>
       </w:r>
     </w:p>
     <w:p>
@@ -64,7 +484,7 @@
                     <pic:cNvPicPr/>
                   </pic:nvPicPr>
                   <pic:blipFill>
-                    <a:blip r:embed="rId5"/>
+                    <a:blip r:embed="rId6"/>
                     <a:stretch>
                       <a:fillRect/>
                     </a:stretch>
@@ -111,12 +531,44 @@
           <w:b/>
           <w:bCs/>
         </w:rPr>
-        <w:t>Adım 2: Manuel Tam Yedek (Full Backup) ve Doğrulama Testi</w:t>
-      </w:r>
-    </w:p>
-    <w:p>
-      <w:r>
-        <w:t>Veri kaybı riskine karşı Northwind veritabanının tam yedeğini manuel olarak aldım. Yedekleme dosyasının bütünlüğünü kontrol etmek için SSMS üzerinden doğrulama adımını da tamamladım. Şu an elimde sistem tarafından onaylanmış, hatasız bir yedek dosyası mevcut.</w:t>
+        <w:t xml:space="preserve">Adım 2: Manuel Tam Yedek (Full </w:t>
+      </w:r>
+      <w:proofErr w:type="spellStart"/>
+      <w:r>
+        <w:rPr>
+          <w:b/>
+          <w:bCs/>
+        </w:rPr>
+        <w:t>Backup</w:t>
+      </w:r>
+      <w:proofErr w:type="spellEnd"/>
+      <w:r>
+        <w:rPr>
+          <w:b/>
+          <w:bCs/>
+        </w:rPr>
+        <w:t>) ve Doğrulama Testi</w:t>
+      </w:r>
+    </w:p>
+    <w:p>
+      <w:r>
+        <w:t xml:space="preserve">Veri kaybı riskine karşı </w:t>
+      </w:r>
+      <w:proofErr w:type="spellStart"/>
+      <w:r>
+        <w:t>Northwind</w:t>
+      </w:r>
+      <w:proofErr w:type="spellEnd"/>
+      <w:r>
+        <w:t xml:space="preserve"> </w:t>
+      </w:r>
+      <w:proofErr w:type="spellStart"/>
+      <w:r>
+        <w:t>veritabanının</w:t>
+      </w:r>
+      <w:proofErr w:type="spellEnd"/>
+      <w:r>
+        <w:t xml:space="preserve"> tam yedeğini manuel olarak aldım. Yedekleme dosyasının bütünlüğünü kontrol etmek için SSMS üzerinden doğrulama adımını da tamamladım. Şu an elimde sistem tarafından onaylanmış, hatasız bir yedek dosyası mevcut.</w:t>
       </w:r>
       <w:r>
         <w:rPr>
@@ -138,7 +590,7 @@
                     <pic:cNvPicPr/>
                   </pic:nvPicPr>
                   <pic:blipFill>
-                    <a:blip r:embed="rId6"/>
+                    <a:blip r:embed="rId7"/>
                     <a:stretch>
                       <a:fillRect/>
                     </a:stretch>
@@ -177,12 +629,49 @@
           <w:b/>
           <w:bCs/>
         </w:rPr>
-        <w:t>Adım 3: Fark (Differential) Yedeği Alma ve Karşılaştığım Sorun</w:t>
-      </w:r>
-    </w:p>
-    <w:p>
-      <w:r>
-        <w:t>Northwind veritabanı üzerinde ilk tam yedeğimi aldıktan sonra, sistemde bir değişiklik olması için Customers tablosundaki bir müşterinin ismini güncelledim</w:t>
+        <w:t>Adım 3: Fark (</w:t>
+      </w:r>
+      <w:proofErr w:type="spellStart"/>
+      <w:r>
+        <w:rPr>
+          <w:b/>
+          <w:bCs/>
+        </w:rPr>
+        <w:t>Differential</w:t>
+      </w:r>
+      <w:proofErr w:type="spellEnd"/>
+      <w:r>
+        <w:rPr>
+          <w:b/>
+          <w:bCs/>
+        </w:rPr>
+        <w:t>) Yedeği Alma ve Karşılaştığım Sorun</w:t>
+      </w:r>
+    </w:p>
+    <w:p>
+      <w:proofErr w:type="spellStart"/>
+      <w:r>
+        <w:t>Northwind</w:t>
+      </w:r>
+      <w:proofErr w:type="spellEnd"/>
+      <w:r>
+        <w:t xml:space="preserve"> </w:t>
+      </w:r>
+      <w:proofErr w:type="spellStart"/>
+      <w:r>
+        <w:t>veritabanı</w:t>
+      </w:r>
+      <w:proofErr w:type="spellEnd"/>
+      <w:r>
+        <w:t xml:space="preserve"> üzerinde ilk tam yedeğimi aldıktan sonra, sistemde bir değişiklik olması için </w:t>
+      </w:r>
+      <w:proofErr w:type="spellStart"/>
+      <w:r>
+        <w:t>Customers</w:t>
+      </w:r>
+      <w:proofErr w:type="spellEnd"/>
+      <w:r>
+        <w:t xml:space="preserve"> tablosundaki bir müşterinin ismini güncelledim</w:t>
       </w:r>
       <w:r>
         <w:t>.</w:t>
@@ -287,7 +776,7 @@
                     <pic:cNvPicPr/>
                   </pic:nvPicPr>
                   <pic:blipFill>
-                    <a:blip r:embed="rId7"/>
+                    <a:blip r:embed="rId8"/>
                     <a:stretch>
                       <a:fillRect/>
                     </a:stretch>
@@ -313,7 +802,31 @@
         <w:t>A</w:t>
       </w:r>
       <w:r>
-        <w:t>rdından sadece bu farkı kaydedecek olan Fark (Differential) yedeği işlemini başlattım. İşlem sırasında başta 'media families' hatasıyla karşılaştım</w:t>
+        <w:t>rdından sadece bu farkı kaydedecek olan Fark (</w:t>
+      </w:r>
+      <w:proofErr w:type="spellStart"/>
+      <w:r>
+        <w:t>Differential</w:t>
+      </w:r>
+      <w:proofErr w:type="spellEnd"/>
+      <w:r>
+        <w:t>) yedeği işlemini başlattım. İşlem sırasında başta '</w:t>
+      </w:r>
+      <w:proofErr w:type="spellStart"/>
+      <w:r>
+        <w:t>media</w:t>
+      </w:r>
+      <w:proofErr w:type="spellEnd"/>
+      <w:r>
+        <w:t xml:space="preserve"> </w:t>
+      </w:r>
+      <w:proofErr w:type="spellStart"/>
+      <w:r>
+        <w:t>families</w:t>
+      </w:r>
+      <w:proofErr w:type="spellEnd"/>
+      <w:r>
+        <w:t>' hatasıyla karşılaştım</w:t>
       </w:r>
       <w:r>
         <w:t xml:space="preserve">. </w:t>
@@ -321,11 +834,24 @@
       <w:r>
         <w:t xml:space="preserve">Bu sorunu çözmek için </w:t>
       </w:r>
-      <w:r>
-        <w:t>Overwrite işlemi gerçekleştirdim</w:t>
-      </w:r>
-      <w:r>
-        <w:t xml:space="preserve"> ve görseldeki gibi başarı mesajını alarak işlemi tamamladım. Böylece veritabanındaki güncel değişiklikleri güvenli bir şekilde yedeklemeyi başardım.</w:t>
+      <w:proofErr w:type="spellStart"/>
+      <w:r>
+        <w:t>Overwrite</w:t>
+      </w:r>
+      <w:proofErr w:type="spellEnd"/>
+      <w:r>
+        <w:t xml:space="preserve"> işlemi gerçekleştirdim</w:t>
+      </w:r>
+      <w:r>
+        <w:t xml:space="preserve"> ve görseldeki gibi başarı mesajını alarak işlemi tamamladım. Böylece </w:t>
+      </w:r>
+      <w:proofErr w:type="spellStart"/>
+      <w:r>
+        <w:t>veritabanındaki</w:t>
+      </w:r>
+      <w:proofErr w:type="spellEnd"/>
+      <w:r>
+        <w:t xml:space="preserve"> güncel değişiklikleri güvenli bir şekilde yedeklemeyi başardım.</w:t>
       </w:r>
     </w:p>
     <w:p>
@@ -349,7 +875,7 @@
                     <pic:cNvPicPr/>
                   </pic:nvPicPr>
                   <pic:blipFill>
-                    <a:blip r:embed="rId8"/>
+                    <a:blip r:embed="rId9"/>
                     <a:stretch>
                       <a:fillRect/>
                     </a:stretch>
@@ -390,7 +916,23 @@
     </w:p>
     <w:p>
       <w:r>
-        <w:t>Kullandığım SQL Server (LocalDB) sürümü 'SQL Server Aracı' (Agent) hizmetini desteklemediği için, yedekleme işlemini otomatize etmek adına T-SQL script yöntemini tercih ettim. Manuel olarak arayüzden yapmak yerine, yukarıdaki SQL komutunu hazırlayarak yedekleme sürecini bir kod yapısına dönüştürdüm.</w:t>
+        <w:t>Kullandığım SQL Server (</w:t>
+      </w:r>
+      <w:proofErr w:type="spellStart"/>
+      <w:r>
+        <w:t>LocalDB</w:t>
+      </w:r>
+      <w:proofErr w:type="spellEnd"/>
+      <w:r>
+        <w:t xml:space="preserve">) sürümü 'SQL Server Aracı' (Agent) hizmetini desteklemediği için, yedekleme işlemini otomatize etmek adına T-SQL </w:t>
+      </w:r>
+      <w:proofErr w:type="spellStart"/>
+      <w:r>
+        <w:t>script</w:t>
+      </w:r>
+      <w:proofErr w:type="spellEnd"/>
+      <w:r>
+        <w:t xml:space="preserve"> yöntemini tercih ettim. Manuel olarak arayüzden yapmak yerine, yukarıdaki SQL komutunu hazırlayarak yedekleme sürecini bir kod yapısına dönüştürdüm.</w:t>
       </w:r>
     </w:p>
     <w:p>
@@ -414,7 +956,7 @@
                     <pic:cNvPicPr/>
                   </pic:nvPicPr>
                   <pic:blipFill>
-                    <a:blip r:embed="rId9"/>
+                    <a:blip r:embed="rId10"/>
                     <a:stretch>
                       <a:fillRect/>
                     </a:stretch>
@@ -468,24 +1010,173 @@
       </w:r>
     </w:p>
     <w:p>
-      <w:r>
-        <w:t xml:space="preserve">Veritabanını 'Full' kurtarma moduna aldıktan sonra doğrudan Log yedeği almaya çalıştığımda </w:t>
+      <w:proofErr w:type="spellStart"/>
+      <w:r>
+        <w:t>Veritabanını</w:t>
+      </w:r>
+      <w:proofErr w:type="spellEnd"/>
+      <w:r>
+        <w:t xml:space="preserve"> 'Full' kurtarma moduna aldıktan sonra doğrudan Log yedeği almaya çalıştığımda </w:t>
       </w:r>
       <w:r>
         <w:rPr>
           <w:i/>
           <w:iCs/>
         </w:rPr>
-        <w:t xml:space="preserve">'BACKUP LOG cannot be performed because there is no current database backup' </w:t>
-      </w:r>
-      <w:r>
-        <w:t>hatasıyla karşılaştım. Bu durumun sebebinin, mod değişikliği sonrası yeni bir Tam Yedek (Full Backup) gere</w:t>
+        <w:t xml:space="preserve">'BACKUP LOG </w:t>
+      </w:r>
+      <w:proofErr w:type="spellStart"/>
+      <w:r>
+        <w:rPr>
+          <w:i/>
+          <w:iCs/>
+        </w:rPr>
+        <w:t>cannot</w:t>
+      </w:r>
+      <w:proofErr w:type="spellEnd"/>
+      <w:r>
+        <w:rPr>
+          <w:i/>
+          <w:iCs/>
+        </w:rPr>
+        <w:t xml:space="preserve"> be </w:t>
+      </w:r>
+      <w:proofErr w:type="spellStart"/>
+      <w:r>
+        <w:rPr>
+          <w:i/>
+          <w:iCs/>
+        </w:rPr>
+        <w:t>performed</w:t>
+      </w:r>
+      <w:proofErr w:type="spellEnd"/>
+      <w:r>
+        <w:rPr>
+          <w:i/>
+          <w:iCs/>
+        </w:rPr>
+        <w:t xml:space="preserve"> </w:t>
+      </w:r>
+      <w:proofErr w:type="spellStart"/>
+      <w:r>
+        <w:rPr>
+          <w:i/>
+          <w:iCs/>
+        </w:rPr>
+        <w:t>because</w:t>
+      </w:r>
+      <w:proofErr w:type="spellEnd"/>
+      <w:r>
+        <w:rPr>
+          <w:i/>
+          <w:iCs/>
+        </w:rPr>
+        <w:t xml:space="preserve"> </w:t>
+      </w:r>
+      <w:proofErr w:type="spellStart"/>
+      <w:r>
+        <w:rPr>
+          <w:i/>
+          <w:iCs/>
+        </w:rPr>
+        <w:t>there</w:t>
+      </w:r>
+      <w:proofErr w:type="spellEnd"/>
+      <w:r>
+        <w:rPr>
+          <w:i/>
+          <w:iCs/>
+        </w:rPr>
+        <w:t xml:space="preserve"> is </w:t>
+      </w:r>
+      <w:proofErr w:type="spellStart"/>
+      <w:r>
+        <w:rPr>
+          <w:i/>
+          <w:iCs/>
+        </w:rPr>
+        <w:t>no</w:t>
+      </w:r>
+      <w:proofErr w:type="spellEnd"/>
+      <w:r>
+        <w:rPr>
+          <w:i/>
+          <w:iCs/>
+        </w:rPr>
+        <w:t xml:space="preserve"> </w:t>
+      </w:r>
+      <w:proofErr w:type="spellStart"/>
+      <w:r>
+        <w:rPr>
+          <w:i/>
+          <w:iCs/>
+        </w:rPr>
+        <w:t>current</w:t>
+      </w:r>
+      <w:proofErr w:type="spellEnd"/>
+      <w:r>
+        <w:rPr>
+          <w:i/>
+          <w:iCs/>
+        </w:rPr>
+        <w:t xml:space="preserve"> </w:t>
+      </w:r>
+      <w:proofErr w:type="spellStart"/>
+      <w:r>
+        <w:rPr>
+          <w:i/>
+          <w:iCs/>
+        </w:rPr>
+        <w:t>database</w:t>
+      </w:r>
+      <w:proofErr w:type="spellEnd"/>
+      <w:r>
+        <w:rPr>
+          <w:i/>
+          <w:iCs/>
+        </w:rPr>
+        <w:t xml:space="preserve"> </w:t>
+      </w:r>
+      <w:proofErr w:type="spellStart"/>
+      <w:r>
+        <w:rPr>
+          <w:i/>
+          <w:iCs/>
+        </w:rPr>
+        <w:t>backup</w:t>
+      </w:r>
+      <w:proofErr w:type="spellEnd"/>
+      <w:r>
+        <w:rPr>
+          <w:i/>
+          <w:iCs/>
+        </w:rPr>
+        <w:t xml:space="preserve">' </w:t>
+      </w:r>
+      <w:r>
+        <w:t xml:space="preserve">hatasıyla karşılaştım. Bu durumun sebebinin, mod değişikliği sonrası yeni bir Tam Yedek (Full </w:t>
+      </w:r>
+      <w:proofErr w:type="spellStart"/>
+      <w:r>
+        <w:t>Backup</w:t>
+      </w:r>
+      <w:proofErr w:type="spellEnd"/>
+      <w:r>
+        <w:t xml:space="preserve">) </w:t>
+      </w:r>
+      <w:proofErr w:type="gramStart"/>
+      <w:r>
+        <w:t>gere</w:t>
       </w:r>
       <w:r>
         <w:t xml:space="preserve">ği </w:t>
       </w:r>
       <w:r>
-        <w:t xml:space="preserve"> olduğunu fark ettim. Önce 'Full' modda yeni bir tam yedek </w:t>
+        <w:t xml:space="preserve"> olduğunu</w:t>
+      </w:r>
+      <w:proofErr w:type="gramEnd"/>
+      <w:r>
+        <w:t xml:space="preserve"> fark ettim. Önce 'Full' modda yeni bir tam yedek </w:t>
       </w:r>
       <w:r>
         <w:t xml:space="preserve">aldım </w:t>
@@ -516,7 +1207,7 @@
                     <pic:cNvPicPr/>
                   </pic:nvPicPr>
                   <pic:blipFill>
-                    <a:blip r:embed="rId10"/>
+                    <a:blip r:embed="rId11"/>
                     <a:stretch>
                       <a:fillRect/>
                     </a:stretch>
@@ -567,7 +1258,15 @@
     </w:p>
     <w:p>
       <w:r>
-        <w:t>Bu aşamada projenin en önemli kısmı olan 'Point-in-Time' kurtarma testini yaptım. Önce veritabanındaki tüm ürün fiyatlarını yanlış bir sorguyla sıfırlayarak yapay bir felaket senaryosu oluşturdum.</w:t>
+        <w:t xml:space="preserve">Bu aşamada projenin en önemli kısmı olan 'Point-in-Time' kurtarma testini yaptım. Önce </w:t>
+      </w:r>
+      <w:proofErr w:type="spellStart"/>
+      <w:r>
+        <w:t>veritabanındaki</w:t>
+      </w:r>
+      <w:proofErr w:type="spellEnd"/>
+      <w:r>
+        <w:t xml:space="preserve"> tüm ürün fiyatlarını yanlış bir sorguyla sıfırlayarak yapay bir felaket senaryosu oluşturdum.</w:t>
       </w:r>
     </w:p>
     <w:p>
@@ -592,7 +1291,7 @@
                     <pic:cNvPicPr/>
                   </pic:nvPicPr>
                   <pic:blipFill>
-                    <a:blip r:embed="rId11"/>
+                    <a:blip r:embed="rId12"/>
                     <a:stretch>
                       <a:fillRect/>
                     </a:stretch>
@@ -626,7 +1325,15 @@
     <w:p>
       <w:r>
         <w:lastRenderedPageBreak/>
-        <w:t>Ardından, daha önce yapılandırdığım Log yedeklerini kullanarak veritabanını bu hatanın yapıldığı andan tam 2 dakika öncesine geri döndürdüm.</w:t>
+        <w:t xml:space="preserve">Ardından, daha önce yapılandırdığım Log yedeklerini kullanarak </w:t>
+      </w:r>
+      <w:proofErr w:type="spellStart"/>
+      <w:r>
+        <w:t>veritabanını</w:t>
+      </w:r>
+      <w:proofErr w:type="spellEnd"/>
+      <w:r>
+        <w:t xml:space="preserve"> bu hatanın yapıldığı andan tam 2 dakika öncesine geri döndürdüm.</w:t>
       </w:r>
     </w:p>
     <w:p>
@@ -650,7 +1357,7 @@
                     <pic:cNvPicPr/>
                   </pic:nvPicPr>
                   <pic:blipFill>
-                    <a:blip r:embed="rId12"/>
+                    <a:blip r:embed="rId13"/>
                     <a:stretch>
                       <a:fillRect/>
                     </a:stretch>
@@ -693,7 +1400,7 @@
                     <pic:cNvPicPr/>
                   </pic:nvPicPr>
                   <pic:blipFill>
-                    <a:blip r:embed="rId13"/>
+                    <a:blip r:embed="rId14"/>
                     <a:stretch>
                       <a:fillRect/>
                     </a:stretch>
@@ -742,7 +1449,7 @@
                     <pic:cNvPicPr/>
                   </pic:nvPicPr>
                   <pic:blipFill>
-                    <a:blip r:embed="rId14"/>
+                    <a:blip r:embed="rId15"/>
                     <a:stretch>
                       <a:fillRect/>
                     </a:stretch>
@@ -906,8 +1613,13 @@
             <w:pPr>
               <w:spacing w:after="160" w:line="278" w:lineRule="auto"/>
             </w:pPr>
+            <w:proofErr w:type="spellStart"/>
             <w:r>
-              <w:t>Differential (Fark)</w:t>
+              <w:t>Differential</w:t>
+            </w:r>
+            <w:proofErr w:type="spellEnd"/>
+            <w:r>
+              <w:t xml:space="preserve"> (Fark)</w:t>
             </w:r>
           </w:p>
         </w:tc>
@@ -1020,12 +1732,76 @@
           <w:b/>
           <w:bCs/>
         </w:rPr>
-        <w:t>Tam Felaket Senaryosu - Veritabanı Silme ve Full Restore</w:t>
-      </w:r>
-    </w:p>
-    <w:p>
-      <w:r>
-        <w:t>Projenin güvenilirliğini test etmek amacıyla Northwind veritabanını sistemden tamamen sildim (Delete). Bu işlemle sunucu çökmesi veya veritabanının yanlışlıkla silinmesi gibi en kötü senaryoyu simüle ettim.</w:t>
+        <w:t xml:space="preserve">Tam Felaket </w:t>
+      </w:r>
+      <w:proofErr w:type="gramStart"/>
+      <w:r>
+        <w:rPr>
+          <w:b/>
+          <w:bCs/>
+        </w:rPr>
+        <w:t>Senaryosu -</w:t>
+      </w:r>
+      <w:proofErr w:type="gramEnd"/>
+      <w:r>
+        <w:rPr>
+          <w:b/>
+          <w:bCs/>
+        </w:rPr>
+        <w:t xml:space="preserve"> </w:t>
+      </w:r>
+      <w:proofErr w:type="spellStart"/>
+      <w:r>
+        <w:rPr>
+          <w:b/>
+          <w:bCs/>
+        </w:rPr>
+        <w:t>Veritabanı</w:t>
+      </w:r>
+      <w:proofErr w:type="spellEnd"/>
+      <w:r>
+        <w:rPr>
+          <w:b/>
+          <w:bCs/>
+        </w:rPr>
+        <w:t xml:space="preserve"> Silme ve Full Restore</w:t>
+      </w:r>
+    </w:p>
+    <w:p>
+      <w:r>
+        <w:t xml:space="preserve">Projenin güvenilirliğini test etmek amacıyla </w:t>
+      </w:r>
+      <w:proofErr w:type="spellStart"/>
+      <w:r>
+        <w:t>Northwind</w:t>
+      </w:r>
+      <w:proofErr w:type="spellEnd"/>
+      <w:r>
+        <w:t xml:space="preserve"> </w:t>
+      </w:r>
+      <w:proofErr w:type="spellStart"/>
+      <w:r>
+        <w:t>veritabanını</w:t>
+      </w:r>
+      <w:proofErr w:type="spellEnd"/>
+      <w:r>
+        <w:t xml:space="preserve"> sistemden tamamen sildim (</w:t>
+      </w:r>
+      <w:proofErr w:type="spellStart"/>
+      <w:r>
+        <w:t>Delete</w:t>
+      </w:r>
+      <w:proofErr w:type="spellEnd"/>
+      <w:r>
+        <w:t xml:space="preserve">). Bu işlemle sunucu çökmesi veya </w:t>
+      </w:r>
+      <w:proofErr w:type="spellStart"/>
+      <w:r>
+        <w:t>veritabanının</w:t>
+      </w:r>
+      <w:proofErr w:type="spellEnd"/>
+      <w:r>
+        <w:t xml:space="preserve"> yanlışlıkla silinmesi gibi en kötü senaryoyu simüle ettim.</w:t>
       </w:r>
     </w:p>
     <w:p>
@@ -1049,7 +1825,7 @@
                     <pic:cNvPicPr/>
                   </pic:nvPicPr>
                   <pic:blipFill>
-                    <a:blip r:embed="rId15"/>
+                    <a:blip r:embed="rId16"/>
                     <a:stretch>
                       <a:fillRect/>
                     </a:stretch>
@@ -1073,15 +1849,32 @@
     <w:p/>
     <w:p>
       <w:r>
-        <w:t xml:space="preserve">Aşağıdaki görsellerde görüldüğü üzere, sistemde olmayan veritabanı aldığım </w:t>
-      </w:r>
-      <w:r>
-        <w:rPr>
-          <w:b/>
-          <w:bCs/>
-        </w:rPr>
-        <w:t>Full Backup</w:t>
-      </w:r>
+        <w:t xml:space="preserve">Aşağıdaki görsellerde görüldüğü üzere, sistemde olmayan </w:t>
+      </w:r>
+      <w:proofErr w:type="spellStart"/>
+      <w:r>
+        <w:t>veritabanı</w:t>
+      </w:r>
+      <w:proofErr w:type="spellEnd"/>
+      <w:r>
+        <w:t xml:space="preserve"> aldığım </w:t>
+      </w:r>
+      <w:r>
+        <w:rPr>
+          <w:b/>
+          <w:bCs/>
+        </w:rPr>
+        <w:t xml:space="preserve">Full </w:t>
+      </w:r>
+      <w:proofErr w:type="spellStart"/>
+      <w:r>
+        <w:rPr>
+          <w:b/>
+          <w:bCs/>
+        </w:rPr>
+        <w:t>Backup</w:t>
+      </w:r>
+      <w:proofErr w:type="spellEnd"/>
       <w:r>
         <w:t xml:space="preserve"> sayesinde saniyeler içinde tüm tabloları ve verileriyle birlikte geri geldi. Ürün fiyatlarını kontrol ettiğimde, verilerin hatasız bir şekilde kurtarıldığını doğruladım. Bu test, hazırladığım yedekleme stratejisinin 'tam yıkım' anında bile sorunsuz çalıştığını kanıtladı.</w:t>
       </w:r>
@@ -1107,7 +1900,7 @@
                     <pic:cNvPicPr/>
                   </pic:nvPicPr>
                   <pic:blipFill>
-                    <a:blip r:embed="rId16"/>
+                    <a:blip r:embed="rId17"/>
                     <a:stretch>
                       <a:fillRect/>
                     </a:stretch>
@@ -1146,19 +1939,43 @@
           <w:b/>
           <w:bCs/>
         </w:rPr>
-        <w:t xml:space="preserve">Adım 9: </w:t>
-      </w:r>
-      <w:r>
-        <w:rPr>
-          <w:b/>
-          <w:bCs/>
-        </w:rPr>
-        <w:t xml:space="preserve"> SQL Server Agent Alternatifi Olarak Görev Zamanlayıcı Yapılandırması</w:t>
-      </w:r>
-    </w:p>
-    <w:p>
-      <w:r>
-        <w:t>Projemde kullandığım SQL Server LocalDB sürümünde, yedekleme işlerini otomatiğe bağlaya</w:t>
+        <w:t xml:space="preserve">Adım </w:t>
+      </w:r>
+      <w:proofErr w:type="gramStart"/>
+      <w:r>
+        <w:rPr>
+          <w:b/>
+          <w:bCs/>
+        </w:rPr>
+        <w:t xml:space="preserve">9: </w:t>
+      </w:r>
+      <w:r>
+        <w:rPr>
+          <w:b/>
+          <w:bCs/>
+        </w:rPr>
+        <w:t xml:space="preserve"> SQL</w:t>
+      </w:r>
+      <w:proofErr w:type="gramEnd"/>
+      <w:r>
+        <w:rPr>
+          <w:b/>
+          <w:bCs/>
+        </w:rPr>
+        <w:t xml:space="preserve"> Server Agent Alternatifi Olarak Görev Zamanlayıcı Yapılandırması</w:t>
+      </w:r>
+    </w:p>
+    <w:p>
+      <w:r>
+        <w:t xml:space="preserve">Projemde kullandığım SQL Server </w:t>
+      </w:r>
+      <w:proofErr w:type="spellStart"/>
+      <w:r>
+        <w:t>LocalDB</w:t>
+      </w:r>
+      <w:proofErr w:type="spellEnd"/>
+      <w:r>
+        <w:t xml:space="preserve"> sürümünde, yedekleme işlerini otomatiğe bağlaya</w:t>
       </w:r>
       <w:r>
         <w:t>bileceğim</w:t>
@@ -1188,7 +2005,15 @@
         <w:t>Ardından,</w:t>
       </w:r>
       <w:r>
-        <w:t xml:space="preserve"> "SQL_Northwind_Yedekleme" adında bir görev oluşturdum ve bu görevin her gece tam 00:00'da kendi kendine çalışmasını sağladım.</w:t>
+        <w:t xml:space="preserve"> "</w:t>
+      </w:r>
+      <w:proofErr w:type="spellStart"/>
+      <w:r>
+        <w:t>SQL_Northwind_Yedekleme</w:t>
+      </w:r>
+      <w:proofErr w:type="spellEnd"/>
+      <w:r>
+        <w:t>" adında bir görev oluşturdum ve bu görevin her gece tam 00:00'da kendi kendine çalışmasını sağladım.</w:t>
       </w:r>
     </w:p>
     <w:p>
@@ -1212,7 +2037,7 @@
                     <pic:cNvPicPr/>
                   </pic:nvPicPr>
                   <pic:blipFill>
-                    <a:blip r:embed="rId17"/>
+                    <a:blip r:embed="rId18"/>
                     <a:stretch>
                       <a:fillRect/>
                     </a:stretch>
@@ -1234,48 +2059,47 @@
       </w:r>
     </w:p>
     <w:p/>
-    <w:p/>
-    <w:p/>
-    <w:p/>
-    <w:p/>
-    <w:p/>
-    <w:p/>
-    <w:p>
-      <w:r>
+    <w:p>
+      <w:r>
+        <w:t>Oluşturduğum bu görev</w:t>
+      </w:r>
+      <w:r>
+        <w:t>e</w:t>
+      </w:r>
+      <w:r>
+        <w:t xml:space="preserve"> ise hazırladığım OtoYedek.bat dosyasını tanıttım. </w:t>
+      </w:r>
+      <w:r>
+        <w:t>Ö</w:t>
+      </w:r>
+      <w:r>
+        <w:t xml:space="preserve">zet ekranında da görüldüğü üzere; sistem artık her gece ben bilgisayar başında olmasam bile otomatik olarak tetiklenecek ve SQLCMD komutu sayesinde </w:t>
+      </w:r>
+      <w:proofErr w:type="spellStart"/>
+      <w:r>
+        <w:t>veritaban</w:t>
+      </w:r>
+      <w:r>
+        <w:t>ının</w:t>
+      </w:r>
+      <w:proofErr w:type="spellEnd"/>
+      <w:r>
+        <w:t xml:space="preserve"> güncel yedeği</w:t>
+      </w:r>
+      <w:r>
+        <w:t xml:space="preserve"> alınacaktır.</w:t>
+      </w:r>
+      <w:r>
+        <w:t xml:space="preserve"> </w:t>
+      </w:r>
+    </w:p>
+    <w:p/>
+    <w:p>
+      <w:r>
+        <w:rPr>
+          <w:noProof/>
+        </w:rPr>
         <w:lastRenderedPageBreak/>
-        <w:t>Oluşturduğum bu görev</w:t>
-      </w:r>
-      <w:r>
-        <w:t>e</w:t>
-      </w:r>
-      <w:r>
-        <w:t xml:space="preserve"> ise hazırladığım OtoYedek.bat dosyasını tanıttım. </w:t>
-      </w:r>
-      <w:r>
-        <w:t>Ö</w:t>
-      </w:r>
-      <w:r>
-        <w:t>zet ekranında da görüldüğü üzere; sistem artık her gece ben bilgisayar başında olmasam bile otomatik olarak tetiklenecek ve SQLCMD komutu sayesinde veritaban</w:t>
-      </w:r>
-      <w:r>
-        <w:t>ının</w:t>
-      </w:r>
-      <w:r>
-        <w:t xml:space="preserve"> güncel yedeği</w:t>
-      </w:r>
-      <w:r>
-        <w:t xml:space="preserve"> alınacaktır.</w:t>
-      </w:r>
-      <w:r>
-        <w:t xml:space="preserve"> </w:t>
-      </w:r>
-    </w:p>
-    <w:p/>
-    <w:p>
-      <w:r>
-        <w:rPr>
-          <w:noProof/>
-        </w:rPr>
         <w:drawing>
           <wp:inline distT="0" distB="0" distL="0" distR="0" wp14:anchorId="0E6A25AB" wp14:editId="05BCB03A">
             <wp:extent cx="5760720" cy="4113530"/>
@@ -1292,7 +2116,7 @@
                     <pic:cNvPicPr/>
                   </pic:nvPicPr>
                   <pic:blipFill>
-                    <a:blip r:embed="rId18"/>
+                    <a:blip r:embed="rId19"/>
                     <a:stretch>
                       <a:fillRect/>
                     </a:stretch>
@@ -1336,13 +2160,29 @@
     </w:p>
     <w:p>
       <w:r>
-        <w:t xml:space="preserve">Projenin son aşamasında, Full (Tam) + Differential (Fark) yedekleme döngüsünü </w:t>
+        <w:t xml:space="preserve">Projenin son aşamasında, Full (Tam) + </w:t>
+      </w:r>
+      <w:proofErr w:type="spellStart"/>
+      <w:r>
+        <w:t>Differential</w:t>
+      </w:r>
+      <w:proofErr w:type="spellEnd"/>
+      <w:r>
+        <w:t xml:space="preserve"> (Fark) yedekleme döngüsünü </w:t>
       </w:r>
       <w:r>
         <w:t>hazırladım</w:t>
       </w:r>
       <w:r>
-        <w:t xml:space="preserve">. Yazdığım T-SQL scripti ile önce sistemin tam bir yedeğini, ardından sadece değişen verileri içeren fark yedeğini aldım. </w:t>
+        <w:t xml:space="preserve">. Yazdığım T-SQL </w:t>
+      </w:r>
+      <w:proofErr w:type="spellStart"/>
+      <w:r>
+        <w:t>scripti</w:t>
+      </w:r>
+      <w:proofErr w:type="spellEnd"/>
+      <w:r>
+        <w:t xml:space="preserve"> ile önce sistemin tam bir yedeğini, ardından sadece değişen verileri içeren fark yedeğini aldım. </w:t>
       </w:r>
       <w:r>
         <w:t>G</w:t>
@@ -1353,7 +2193,15 @@
     </w:p>
     <w:p>
       <w:r>
-        <w:t>Süreç sırasında disk tasarrufu için WITH COMPRESSION (Sıkıştırma) komutunu denedim; ancak kullandığım SQL Server Express/LocalDB sürümün</w:t>
+        <w:t>Süreç sırasında disk tasarrufu için WITH COMPRESSION (Sıkıştırma) komutunu denedim; ancak kullandığım SQL Server Express/</w:t>
+      </w:r>
+      <w:proofErr w:type="spellStart"/>
+      <w:r>
+        <w:t>LocalDB</w:t>
+      </w:r>
+      <w:proofErr w:type="spellEnd"/>
+      <w:r>
+        <w:t xml:space="preserve"> sürümün</w:t>
       </w:r>
       <w:r>
         <w:t xml:space="preserve">de bu </w:t>
@@ -1400,7 +2248,15 @@
         </w:numPr>
       </w:pPr>
       <w:r>
-        <w:t>Haftalık Full Backup: Ana yedekleme noktası.</w:t>
+        <w:t xml:space="preserve">Haftalık Full </w:t>
+      </w:r>
+      <w:proofErr w:type="spellStart"/>
+      <w:r>
+        <w:t>Backup</w:t>
+      </w:r>
+      <w:proofErr w:type="spellEnd"/>
+      <w:r>
+        <w:t>: Ana yedekleme noktası.</w:t>
       </w:r>
     </w:p>
     <w:p>
@@ -1411,8 +2267,23 @@
         </w:numPr>
       </w:pPr>
       <w:r>
-        <w:lastRenderedPageBreak/>
-        <w:t>Günlük Differential Backup: Günlük hızlı veri koruması.</w:t>
+        <w:t xml:space="preserve">Günlük </w:t>
+      </w:r>
+      <w:proofErr w:type="spellStart"/>
+      <w:r>
+        <w:t>Differential</w:t>
+      </w:r>
+      <w:proofErr w:type="spellEnd"/>
+      <w:r>
+        <w:t xml:space="preserve"> </w:t>
+      </w:r>
+      <w:proofErr w:type="spellStart"/>
+      <w:r>
+        <w:t>Backup</w:t>
+      </w:r>
+      <w:proofErr w:type="spellEnd"/>
+      <w:r>
+        <w:t>: Günlük hızlı veri koruması.</w:t>
       </w:r>
     </w:p>
     <w:p>
@@ -1423,7 +2294,23 @@
         </w:numPr>
       </w:pPr>
       <w:r>
-        <w:t>15 Dakikada Bir Log Backup: Anlık (Point-in-time) geri dönüş imkanı.</w:t>
+        <w:t xml:space="preserve">15 Dakikada Bir Log </w:t>
+      </w:r>
+      <w:proofErr w:type="spellStart"/>
+      <w:r>
+        <w:t>Backup</w:t>
+      </w:r>
+      <w:proofErr w:type="spellEnd"/>
+      <w:r>
+        <w:t xml:space="preserve">: Anlık (Point-in-time) geri dönüş </w:t>
+      </w:r>
+      <w:proofErr w:type="gramStart"/>
+      <w:r>
+        <w:t>imkanı</w:t>
+      </w:r>
+      <w:proofErr w:type="gramEnd"/>
+      <w:r>
+        <w:t>.</w:t>
       </w:r>
     </w:p>
     <w:p>
@@ -1436,6 +2323,7 @@
         <w:rPr>
           <w:noProof/>
         </w:rPr>
+        <w:lastRenderedPageBreak/>
         <w:drawing>
           <wp:inline distT="0" distB="0" distL="0" distR="0" wp14:anchorId="31F0FF3B" wp14:editId="5AEDF034">
             <wp:extent cx="6264660" cy="3840480"/>
@@ -1454,7 +2342,7 @@
                     </pic:cNvPicPr>
                   </pic:nvPicPr>
                   <pic:blipFill>
-                    <a:blip r:embed="rId19">
+                    <a:blip r:embed="rId20">
                       <a:extLst>
                         <a:ext uri="{28A0092B-C50C-407E-A947-70E740481C1C}">
                           <a14:useLocalDpi xmlns:a14="http://schemas.microsoft.com/office/drawing/2010/main" val="0"/>
@@ -1486,6 +2374,9 @@
     <w:p/>
     <w:p>
       <w:r>
+        <w:rPr>
+          <w:noProof/>
+        </w:rPr>
         <w:drawing>
           <wp:inline distT="0" distB="0" distL="0" distR="0" wp14:anchorId="0AC2FDE0" wp14:editId="75922A1A">
             <wp:extent cx="2133785" cy="823031"/>
@@ -1502,7 +2393,7 @@
                     <pic:cNvPicPr/>
                   </pic:nvPicPr>
                   <pic:blipFill>
-                    <a:blip r:embed="rId20"/>
+                    <a:blip r:embed="rId21"/>
                     <a:stretch>
                       <a:fillRect/>
                     </a:stretch>

</xml_diff>

<commit_message>
Proje 2: Kapak sayfası eklendi ve rapor son kontrolle güncellendi
</commit_message>
<xml_diff>
--- a/BLM4522_Proje2/Rapor1.docx
+++ b/BLM4522_Proje2/Rapor1.docx
@@ -163,9 +163,13 @@
           <w:sz w:val="28"/>
           <w:szCs w:val="28"/>
         </w:rPr>
-        <w:t xml:space="preserve">BLM 4522 – Proje </w:t>
-      </w:r>
-      <w:r>
+        <w:t>BLM 4522 – Proje 2: Yedekleme ve Felaketten Kurtarma</w:t>
+      </w:r>
+    </w:p>
+    <w:p>
+      <w:pPr>
+        <w:spacing w:after="360" w:line="360" w:lineRule="auto"/>
+        <w:jc w:val="center"/>
         <w:rPr>
           <w:rFonts w:cs="Arial"/>
           <w:b/>
@@ -173,8 +177,7 @@
           <w:sz w:val="28"/>
           <w:szCs w:val="28"/>
         </w:rPr>
-        <w:t>2</w:t>
-      </w:r>
+      </w:pPr>
       <w:r>
         <w:rPr>
           <w:rFonts w:cs="Arial"/>
@@ -183,8 +186,9 @@
           <w:sz w:val="28"/>
           <w:szCs w:val="28"/>
         </w:rPr>
-        <w:t xml:space="preserve">: </w:t>
-      </w:r>
+        <w:t xml:space="preserve"> </w:t>
+      </w:r>
+      <w:proofErr w:type="gramStart"/>
       <w:r>
         <w:rPr>
           <w:rFonts w:cs="Arial"/>
@@ -193,13 +197,10 @@
           <w:sz w:val="28"/>
           <w:szCs w:val="28"/>
         </w:rPr>
-        <w:t>Yedekleme ve Felaketten Kurtarma</w:t>
-      </w:r>
-    </w:p>
-    <w:p>
-      <w:pPr>
-        <w:spacing w:after="360" w:line="360" w:lineRule="auto"/>
-        <w:jc w:val="center"/>
+        <w:t>ve</w:t>
+      </w:r>
+      <w:proofErr w:type="gramEnd"/>
+      <w:r>
         <w:rPr>
           <w:rFonts w:cs="Arial"/>
           <w:b/>
@@ -207,7 +208,8 @@
           <w:sz w:val="28"/>
           <w:szCs w:val="28"/>
         </w:rPr>
-      </w:pPr>
+        <w:t xml:space="preserve"> Erişim Kontrolü</w:t>
+      </w:r>
       <w:r>
         <w:rPr>
           <w:rFonts w:cs="Arial"/>
@@ -216,38 +218,6 @@
           <w:sz w:val="28"/>
           <w:szCs w:val="28"/>
         </w:rPr>
-        <w:t xml:space="preserve"> </w:t>
-      </w:r>
-      <w:proofErr w:type="gramStart"/>
-      <w:r>
-        <w:rPr>
-          <w:rFonts w:cs="Arial"/>
-          <w:b/>
-          <w:bCs/>
-          <w:sz w:val="28"/>
-          <w:szCs w:val="28"/>
-        </w:rPr>
-        <w:t>ve</w:t>
-      </w:r>
-      <w:proofErr w:type="gramEnd"/>
-      <w:r>
-        <w:rPr>
-          <w:rFonts w:cs="Arial"/>
-          <w:b/>
-          <w:bCs/>
-          <w:sz w:val="28"/>
-          <w:szCs w:val="28"/>
-        </w:rPr>
-        <w:t xml:space="preserve"> Erişim Kontrolü</w:t>
-      </w:r>
-      <w:r>
-        <w:rPr>
-          <w:rFonts w:cs="Arial"/>
-          <w:b/>
-          <w:bCs/>
-          <w:sz w:val="28"/>
-          <w:szCs w:val="28"/>
-        </w:rPr>
         <w:t xml:space="preserve"> Raporu</w:t>
       </w:r>
     </w:p>
@@ -321,6 +291,7 @@
         <w:pStyle w:val="Balk1"/>
         <w:jc w:val="center"/>
       </w:pPr>
+      <w:bookmarkStart w:id="0" w:name="_Toc227625951"/>
       <w:r>
         <w:rPr>
           <w:rFonts w:asciiTheme="minorHAnsi" w:eastAsiaTheme="minorHAnsi" w:hAnsiTheme="minorHAnsi" w:cs="Arial"/>
@@ -397,6 +368,7 @@
         </w:rPr>
         <w:t>-Sistemleri-Projeleri</w:t>
       </w:r>
+      <w:bookmarkEnd w:id="0"/>
     </w:p>
     <w:p>
       <w:pPr>
@@ -406,6 +378,994 @@
     </w:p>
     <w:p/>
     <w:p/>
+    <w:p/>
+    <w:sdt>
+      <w:sdtPr>
+        <w:rPr>
+          <w:rFonts w:eastAsia="Calibri"/>
+          <w:b w:val="0"/>
+          <w:bCs w:val="0"/>
+          <w:color w:val="auto"/>
+          <w:szCs w:val="22"/>
+          <w:lang w:val="tr-TR" w:eastAsia="en-US"/>
+        </w:rPr>
+        <w:id w:val="-1039284817"/>
+        <w:docPartObj>
+          <w:docPartGallery w:val="Table of Contents"/>
+          <w:docPartUnique/>
+        </w:docPartObj>
+      </w:sdtPr>
+      <w:sdtEndPr>
+        <w:rPr>
+          <w:rFonts w:asciiTheme="minorHAnsi" w:eastAsiaTheme="minorHAnsi" w:hAnsiTheme="minorHAnsi" w:cstheme="minorBidi"/>
+          <w:kern w:val="2"/>
+          <w:szCs w:val="24"/>
+          <w14:ligatures w14:val="standardContextual"/>
+        </w:rPr>
+      </w:sdtEndPr>
+      <w:sdtContent>
+        <w:p>
+          <w:pPr>
+            <w:pStyle w:val="TBal"/>
+            <w:ind w:firstLine="0"/>
+            <w:jc w:val="left"/>
+          </w:pPr>
+        </w:p>
+        <w:p>
+          <w:pPr>
+            <w:pStyle w:val="T1"/>
+            <w:tabs>
+              <w:tab w:val="right" w:leader="dot" w:pos="9062"/>
+            </w:tabs>
+            <w:rPr>
+              <w:rFonts w:asciiTheme="minorHAnsi" w:eastAsiaTheme="minorEastAsia" w:hAnsiTheme="minorHAnsi" w:cstheme="minorBidi"/>
+              <w:b w:val="0"/>
+              <w:noProof/>
+              <w:kern w:val="2"/>
+              <w:szCs w:val="24"/>
+              <w:lang w:val="tr-TR" w:eastAsia="tr-TR"/>
+              <w14:ligatures w14:val="standardContextual"/>
+            </w:rPr>
+          </w:pPr>
+          <w:r>
+            <w:fldChar w:fldCharType="begin"/>
+          </w:r>
+          <w:r>
+            <w:instrText xml:space="preserve"> TOC \o "1-3" \h \z \u </w:instrText>
+          </w:r>
+          <w:r>
+            <w:fldChar w:fldCharType="separate"/>
+          </w:r>
+          <w:hyperlink w:anchor="_Toc227625951" w:history="1">
+            <w:r>
+              <w:rPr>
+                <w:rStyle w:val="Kpr"/>
+                <w:rFonts w:eastAsiaTheme="minorHAnsi"/>
+                <w:noProof/>
+              </w:rPr>
+              <w:t>https://github.com/senemarici/BLM4522--Ag-Tabanli-Paralel-Dagitim-Sistemleri-Projeleri</w:t>
+            </w:r>
+            <w:r>
+              <w:rPr>
+                <w:noProof/>
+                <w:webHidden/>
+              </w:rPr>
+              <w:tab/>
+            </w:r>
+            <w:r>
+              <w:rPr>
+                <w:noProof/>
+                <w:webHidden/>
+              </w:rPr>
+              <w:fldChar w:fldCharType="begin"/>
+            </w:r>
+            <w:r>
+              <w:rPr>
+                <w:noProof/>
+                <w:webHidden/>
+              </w:rPr>
+              <w:instrText xml:space="preserve"> PAGEREF _Toc227625951 \h </w:instrText>
+            </w:r>
+            <w:r>
+              <w:rPr>
+                <w:noProof/>
+                <w:webHidden/>
+              </w:rPr>
+            </w:r>
+            <w:r>
+              <w:rPr>
+                <w:noProof/>
+                <w:webHidden/>
+              </w:rPr>
+              <w:fldChar w:fldCharType="separate"/>
+            </w:r>
+            <w:r>
+              <w:rPr>
+                <w:noProof/>
+                <w:webHidden/>
+              </w:rPr>
+              <w:t>1</w:t>
+            </w:r>
+            <w:r>
+              <w:rPr>
+                <w:noProof/>
+                <w:webHidden/>
+              </w:rPr>
+              <w:fldChar w:fldCharType="end"/>
+            </w:r>
+          </w:hyperlink>
+        </w:p>
+        <w:p>
+          <w:pPr>
+            <w:pStyle w:val="T1"/>
+            <w:tabs>
+              <w:tab w:val="right" w:leader="dot" w:pos="9062"/>
+            </w:tabs>
+            <w:rPr>
+              <w:rFonts w:asciiTheme="minorHAnsi" w:eastAsiaTheme="minorEastAsia" w:hAnsiTheme="minorHAnsi" w:cstheme="minorBidi"/>
+              <w:b w:val="0"/>
+              <w:noProof/>
+              <w:kern w:val="2"/>
+              <w:szCs w:val="24"/>
+              <w:lang w:val="tr-TR" w:eastAsia="tr-TR"/>
+              <w14:ligatures w14:val="standardContextual"/>
+            </w:rPr>
+          </w:pPr>
+          <w:hyperlink w:anchor="_Toc227625952" w:history="1">
+            <w:r>
+              <w:rPr>
+                <w:rStyle w:val="Kpr"/>
+                <w:bCs/>
+                <w:noProof/>
+              </w:rPr>
+              <w:t>Proje 2: Yedekleme ve Felaketten Kurtarma</w:t>
+            </w:r>
+            <w:r>
+              <w:rPr>
+                <w:noProof/>
+                <w:webHidden/>
+              </w:rPr>
+              <w:tab/>
+            </w:r>
+            <w:r>
+              <w:rPr>
+                <w:noProof/>
+                <w:webHidden/>
+              </w:rPr>
+              <w:fldChar w:fldCharType="begin"/>
+            </w:r>
+            <w:r>
+              <w:rPr>
+                <w:noProof/>
+                <w:webHidden/>
+              </w:rPr>
+              <w:instrText xml:space="preserve"> PAGEREF _Toc227625952 \h </w:instrText>
+            </w:r>
+            <w:r>
+              <w:rPr>
+                <w:noProof/>
+                <w:webHidden/>
+              </w:rPr>
+            </w:r>
+            <w:r>
+              <w:rPr>
+                <w:noProof/>
+                <w:webHidden/>
+              </w:rPr>
+              <w:fldChar w:fldCharType="separate"/>
+            </w:r>
+            <w:r>
+              <w:rPr>
+                <w:noProof/>
+                <w:webHidden/>
+              </w:rPr>
+              <w:t>3</w:t>
+            </w:r>
+            <w:r>
+              <w:rPr>
+                <w:noProof/>
+                <w:webHidden/>
+              </w:rPr>
+              <w:fldChar w:fldCharType="end"/>
+            </w:r>
+          </w:hyperlink>
+        </w:p>
+        <w:p>
+          <w:pPr>
+            <w:pStyle w:val="T2"/>
+            <w:rPr>
+              <w:rFonts w:asciiTheme="minorHAnsi" w:eastAsiaTheme="minorEastAsia" w:hAnsiTheme="minorHAnsi" w:cstheme="minorBidi"/>
+              <w:b w:val="0"/>
+              <w:noProof/>
+              <w:kern w:val="2"/>
+              <w:u w:val="none"/>
+              <w:lang w:eastAsia="tr-TR"/>
+              <w14:ligatures w14:val="standardContextual"/>
+            </w:rPr>
+          </w:pPr>
+          <w:hyperlink w:anchor="_Toc227625953" w:history="1">
+            <w:r>
+              <w:rPr>
+                <w:rStyle w:val="Kpr"/>
+                <w:noProof/>
+              </w:rPr>
+              <w:t>Adım 1: Veri Kaynağı Kurulumu ve Tablo Yapılarının Doğrulanması</w:t>
+            </w:r>
+            <w:r>
+              <w:rPr>
+                <w:noProof/>
+                <w:webHidden/>
+              </w:rPr>
+              <w:tab/>
+            </w:r>
+            <w:r>
+              <w:rPr>
+                <w:noProof/>
+                <w:webHidden/>
+              </w:rPr>
+              <w:fldChar w:fldCharType="begin"/>
+            </w:r>
+            <w:r>
+              <w:rPr>
+                <w:noProof/>
+                <w:webHidden/>
+              </w:rPr>
+              <w:instrText xml:space="preserve"> PAGEREF _Toc227625953 \h </w:instrText>
+            </w:r>
+            <w:r>
+              <w:rPr>
+                <w:noProof/>
+                <w:webHidden/>
+              </w:rPr>
+            </w:r>
+            <w:r>
+              <w:rPr>
+                <w:noProof/>
+                <w:webHidden/>
+              </w:rPr>
+              <w:fldChar w:fldCharType="separate"/>
+            </w:r>
+            <w:r>
+              <w:rPr>
+                <w:noProof/>
+                <w:webHidden/>
+              </w:rPr>
+              <w:t>3</w:t>
+            </w:r>
+            <w:r>
+              <w:rPr>
+                <w:noProof/>
+                <w:webHidden/>
+              </w:rPr>
+              <w:fldChar w:fldCharType="end"/>
+            </w:r>
+          </w:hyperlink>
+        </w:p>
+        <w:p>
+          <w:pPr>
+            <w:pStyle w:val="T2"/>
+            <w:rPr>
+              <w:rFonts w:asciiTheme="minorHAnsi" w:eastAsiaTheme="minorEastAsia" w:hAnsiTheme="minorHAnsi" w:cstheme="minorBidi"/>
+              <w:b w:val="0"/>
+              <w:noProof/>
+              <w:kern w:val="2"/>
+              <w:u w:val="none"/>
+              <w:lang w:eastAsia="tr-TR"/>
+              <w14:ligatures w14:val="standardContextual"/>
+            </w:rPr>
+          </w:pPr>
+          <w:hyperlink w:anchor="_Toc227625954" w:history="1">
+            <w:r>
+              <w:rPr>
+                <w:rStyle w:val="Kpr"/>
+                <w:noProof/>
+              </w:rPr>
+              <w:t>Adım 2: Manuel Tam Yedek (Full Backup) ve Doğrulama Testi</w:t>
+            </w:r>
+            <w:r>
+              <w:rPr>
+                <w:noProof/>
+                <w:webHidden/>
+              </w:rPr>
+              <w:tab/>
+            </w:r>
+            <w:r>
+              <w:rPr>
+                <w:noProof/>
+                <w:webHidden/>
+              </w:rPr>
+              <w:fldChar w:fldCharType="begin"/>
+            </w:r>
+            <w:r>
+              <w:rPr>
+                <w:noProof/>
+                <w:webHidden/>
+              </w:rPr>
+              <w:instrText xml:space="preserve"> PAGEREF _Toc227625954 \h </w:instrText>
+            </w:r>
+            <w:r>
+              <w:rPr>
+                <w:noProof/>
+                <w:webHidden/>
+              </w:rPr>
+            </w:r>
+            <w:r>
+              <w:rPr>
+                <w:noProof/>
+                <w:webHidden/>
+              </w:rPr>
+              <w:fldChar w:fldCharType="separate"/>
+            </w:r>
+            <w:r>
+              <w:rPr>
+                <w:noProof/>
+                <w:webHidden/>
+              </w:rPr>
+              <w:t>4</w:t>
+            </w:r>
+            <w:r>
+              <w:rPr>
+                <w:noProof/>
+                <w:webHidden/>
+              </w:rPr>
+              <w:fldChar w:fldCharType="end"/>
+            </w:r>
+          </w:hyperlink>
+        </w:p>
+        <w:p>
+          <w:pPr>
+            <w:pStyle w:val="T2"/>
+            <w:rPr>
+              <w:rFonts w:asciiTheme="minorHAnsi" w:eastAsiaTheme="minorEastAsia" w:hAnsiTheme="minorHAnsi" w:cstheme="minorBidi"/>
+              <w:b w:val="0"/>
+              <w:noProof/>
+              <w:kern w:val="2"/>
+              <w:u w:val="none"/>
+              <w:lang w:eastAsia="tr-TR"/>
+              <w14:ligatures w14:val="standardContextual"/>
+            </w:rPr>
+          </w:pPr>
+          <w:hyperlink w:anchor="_Toc227625955" w:history="1">
+            <w:r>
+              <w:rPr>
+                <w:rStyle w:val="Kpr"/>
+                <w:noProof/>
+              </w:rPr>
+              <w:t>Adım 3: Fark (Differential) Yedeği Alma ve Karşılaştığım Sorun</w:t>
+            </w:r>
+            <w:r>
+              <w:rPr>
+                <w:noProof/>
+                <w:webHidden/>
+              </w:rPr>
+              <w:tab/>
+            </w:r>
+            <w:r>
+              <w:rPr>
+                <w:noProof/>
+                <w:webHidden/>
+              </w:rPr>
+              <w:fldChar w:fldCharType="begin"/>
+            </w:r>
+            <w:r>
+              <w:rPr>
+                <w:noProof/>
+                <w:webHidden/>
+              </w:rPr>
+              <w:instrText xml:space="preserve"> PAGEREF _Toc227625955 \h </w:instrText>
+            </w:r>
+            <w:r>
+              <w:rPr>
+                <w:noProof/>
+                <w:webHidden/>
+              </w:rPr>
+            </w:r>
+            <w:r>
+              <w:rPr>
+                <w:noProof/>
+                <w:webHidden/>
+              </w:rPr>
+              <w:fldChar w:fldCharType="separate"/>
+            </w:r>
+            <w:r>
+              <w:rPr>
+                <w:noProof/>
+                <w:webHidden/>
+              </w:rPr>
+              <w:t>5</w:t>
+            </w:r>
+            <w:r>
+              <w:rPr>
+                <w:noProof/>
+                <w:webHidden/>
+              </w:rPr>
+              <w:fldChar w:fldCharType="end"/>
+            </w:r>
+          </w:hyperlink>
+        </w:p>
+        <w:p>
+          <w:pPr>
+            <w:pStyle w:val="T2"/>
+            <w:rPr>
+              <w:rFonts w:asciiTheme="minorHAnsi" w:eastAsiaTheme="minorEastAsia" w:hAnsiTheme="minorHAnsi" w:cstheme="minorBidi"/>
+              <w:b w:val="0"/>
+              <w:noProof/>
+              <w:kern w:val="2"/>
+              <w:u w:val="none"/>
+              <w:lang w:eastAsia="tr-TR"/>
+              <w14:ligatures w14:val="standardContextual"/>
+            </w:rPr>
+          </w:pPr>
+          <w:hyperlink w:anchor="_Toc227625956" w:history="1">
+            <w:r>
+              <w:rPr>
+                <w:rStyle w:val="Kpr"/>
+                <w:noProof/>
+              </w:rPr>
+              <w:t>Adım 4: Otomatik Yedekleme Stratejisi ve Alternatif Çözüm</w:t>
+            </w:r>
+            <w:r>
+              <w:rPr>
+                <w:noProof/>
+                <w:webHidden/>
+              </w:rPr>
+              <w:tab/>
+            </w:r>
+            <w:r>
+              <w:rPr>
+                <w:noProof/>
+                <w:webHidden/>
+              </w:rPr>
+              <w:fldChar w:fldCharType="begin"/>
+            </w:r>
+            <w:r>
+              <w:rPr>
+                <w:noProof/>
+                <w:webHidden/>
+              </w:rPr>
+              <w:instrText xml:space="preserve"> PAGEREF _Toc227625956 \h </w:instrText>
+            </w:r>
+            <w:r>
+              <w:rPr>
+                <w:noProof/>
+                <w:webHidden/>
+              </w:rPr>
+            </w:r>
+            <w:r>
+              <w:rPr>
+                <w:noProof/>
+                <w:webHidden/>
+              </w:rPr>
+              <w:fldChar w:fldCharType="separate"/>
+            </w:r>
+            <w:r>
+              <w:rPr>
+                <w:noProof/>
+                <w:webHidden/>
+              </w:rPr>
+              <w:t>6</w:t>
+            </w:r>
+            <w:r>
+              <w:rPr>
+                <w:noProof/>
+                <w:webHidden/>
+              </w:rPr>
+              <w:fldChar w:fldCharType="end"/>
+            </w:r>
+          </w:hyperlink>
+        </w:p>
+        <w:p>
+          <w:pPr>
+            <w:pStyle w:val="T2"/>
+            <w:rPr>
+              <w:rFonts w:asciiTheme="minorHAnsi" w:eastAsiaTheme="minorEastAsia" w:hAnsiTheme="minorHAnsi" w:cstheme="minorBidi"/>
+              <w:b w:val="0"/>
+              <w:noProof/>
+              <w:kern w:val="2"/>
+              <w:u w:val="none"/>
+              <w:lang w:eastAsia="tr-TR"/>
+              <w14:ligatures w14:val="standardContextual"/>
+            </w:rPr>
+          </w:pPr>
+          <w:hyperlink w:anchor="_Toc227625957" w:history="1">
+            <w:r>
+              <w:rPr>
+                <w:rStyle w:val="Kpr"/>
+                <w:noProof/>
+              </w:rPr>
+              <w:t>Adım 5: Kurtarma Modu Değişimi ve Karşılaşılan Log Hatası</w:t>
+            </w:r>
+            <w:r>
+              <w:rPr>
+                <w:noProof/>
+                <w:webHidden/>
+              </w:rPr>
+              <w:tab/>
+            </w:r>
+            <w:r>
+              <w:rPr>
+                <w:noProof/>
+                <w:webHidden/>
+              </w:rPr>
+              <w:fldChar w:fldCharType="begin"/>
+            </w:r>
+            <w:r>
+              <w:rPr>
+                <w:noProof/>
+                <w:webHidden/>
+              </w:rPr>
+              <w:instrText xml:space="preserve"> PAGEREF _Toc227625957 \h </w:instrText>
+            </w:r>
+            <w:r>
+              <w:rPr>
+                <w:noProof/>
+                <w:webHidden/>
+              </w:rPr>
+            </w:r>
+            <w:r>
+              <w:rPr>
+                <w:noProof/>
+                <w:webHidden/>
+              </w:rPr>
+              <w:fldChar w:fldCharType="separate"/>
+            </w:r>
+            <w:r>
+              <w:rPr>
+                <w:noProof/>
+                <w:webHidden/>
+              </w:rPr>
+              <w:t>7</w:t>
+            </w:r>
+            <w:r>
+              <w:rPr>
+                <w:noProof/>
+                <w:webHidden/>
+              </w:rPr>
+              <w:fldChar w:fldCharType="end"/>
+            </w:r>
+          </w:hyperlink>
+        </w:p>
+        <w:p>
+          <w:pPr>
+            <w:pStyle w:val="T2"/>
+            <w:rPr>
+              <w:rFonts w:asciiTheme="minorHAnsi" w:eastAsiaTheme="minorEastAsia" w:hAnsiTheme="minorHAnsi" w:cstheme="minorBidi"/>
+              <w:b w:val="0"/>
+              <w:noProof/>
+              <w:kern w:val="2"/>
+              <w:u w:val="none"/>
+              <w:lang w:eastAsia="tr-TR"/>
+              <w14:ligatures w14:val="standardContextual"/>
+            </w:rPr>
+          </w:pPr>
+          <w:hyperlink w:anchor="_Toc227625958" w:history="1">
+            <w:r>
+              <w:rPr>
+                <w:rStyle w:val="Kpr"/>
+                <w:noProof/>
+              </w:rPr>
+              <w:t>Adım 6: Felaket Senaryosu ve Kurtarma İşlemi</w:t>
+            </w:r>
+            <w:r>
+              <w:rPr>
+                <w:noProof/>
+                <w:webHidden/>
+              </w:rPr>
+              <w:tab/>
+            </w:r>
+            <w:r>
+              <w:rPr>
+                <w:noProof/>
+                <w:webHidden/>
+              </w:rPr>
+              <w:fldChar w:fldCharType="begin"/>
+            </w:r>
+            <w:r>
+              <w:rPr>
+                <w:noProof/>
+                <w:webHidden/>
+              </w:rPr>
+              <w:instrText xml:space="preserve"> PAGEREF _Toc227625958 \h </w:instrText>
+            </w:r>
+            <w:r>
+              <w:rPr>
+                <w:noProof/>
+                <w:webHidden/>
+              </w:rPr>
+            </w:r>
+            <w:r>
+              <w:rPr>
+                <w:noProof/>
+                <w:webHidden/>
+              </w:rPr>
+              <w:fldChar w:fldCharType="separate"/>
+            </w:r>
+            <w:r>
+              <w:rPr>
+                <w:noProof/>
+                <w:webHidden/>
+              </w:rPr>
+              <w:t>8</w:t>
+            </w:r>
+            <w:r>
+              <w:rPr>
+                <w:noProof/>
+                <w:webHidden/>
+              </w:rPr>
+              <w:fldChar w:fldCharType="end"/>
+            </w:r>
+          </w:hyperlink>
+        </w:p>
+        <w:p>
+          <w:pPr>
+            <w:pStyle w:val="T2"/>
+            <w:rPr>
+              <w:rFonts w:asciiTheme="minorHAnsi" w:eastAsiaTheme="minorEastAsia" w:hAnsiTheme="minorHAnsi" w:cstheme="minorBidi"/>
+              <w:b w:val="0"/>
+              <w:noProof/>
+              <w:kern w:val="2"/>
+              <w:u w:val="none"/>
+              <w:lang w:eastAsia="tr-TR"/>
+              <w14:ligatures w14:val="standardContextual"/>
+            </w:rPr>
+          </w:pPr>
+          <w:hyperlink w:anchor="_Toc227625959" w:history="1">
+            <w:r>
+              <w:rPr>
+                <w:rStyle w:val="Kpr"/>
+                <w:noProof/>
+              </w:rPr>
+              <w:t>Adım 7: Yedekleme Planı Tablosu</w:t>
+            </w:r>
+            <w:r>
+              <w:rPr>
+                <w:noProof/>
+                <w:webHidden/>
+              </w:rPr>
+              <w:tab/>
+            </w:r>
+            <w:r>
+              <w:rPr>
+                <w:noProof/>
+                <w:webHidden/>
+              </w:rPr>
+              <w:fldChar w:fldCharType="begin"/>
+            </w:r>
+            <w:r>
+              <w:rPr>
+                <w:noProof/>
+                <w:webHidden/>
+              </w:rPr>
+              <w:instrText xml:space="preserve"> PAGEREF _Toc227625959 \h </w:instrText>
+            </w:r>
+            <w:r>
+              <w:rPr>
+                <w:noProof/>
+                <w:webHidden/>
+              </w:rPr>
+            </w:r>
+            <w:r>
+              <w:rPr>
+                <w:noProof/>
+                <w:webHidden/>
+              </w:rPr>
+              <w:fldChar w:fldCharType="separate"/>
+            </w:r>
+            <w:r>
+              <w:rPr>
+                <w:noProof/>
+                <w:webHidden/>
+              </w:rPr>
+              <w:t>10</w:t>
+            </w:r>
+            <w:r>
+              <w:rPr>
+                <w:noProof/>
+                <w:webHidden/>
+              </w:rPr>
+              <w:fldChar w:fldCharType="end"/>
+            </w:r>
+          </w:hyperlink>
+        </w:p>
+        <w:p>
+          <w:pPr>
+            <w:pStyle w:val="T2"/>
+            <w:rPr>
+              <w:rFonts w:asciiTheme="minorHAnsi" w:eastAsiaTheme="minorEastAsia" w:hAnsiTheme="minorHAnsi" w:cstheme="minorBidi"/>
+              <w:b w:val="0"/>
+              <w:noProof/>
+              <w:kern w:val="2"/>
+              <w:u w:val="none"/>
+              <w:lang w:eastAsia="tr-TR"/>
+              <w14:ligatures w14:val="standardContextual"/>
+            </w:rPr>
+          </w:pPr>
+          <w:hyperlink w:anchor="_Toc227625960" w:history="1">
+            <w:r>
+              <w:rPr>
+                <w:rStyle w:val="Kpr"/>
+                <w:noProof/>
+              </w:rPr>
+              <w:t>Adım 8: Tam Felaket Senaryosu - Veritabanı Silme ve Full Restore</w:t>
+            </w:r>
+            <w:r>
+              <w:rPr>
+                <w:noProof/>
+                <w:webHidden/>
+              </w:rPr>
+              <w:tab/>
+            </w:r>
+            <w:r>
+              <w:rPr>
+                <w:noProof/>
+                <w:webHidden/>
+              </w:rPr>
+              <w:fldChar w:fldCharType="begin"/>
+            </w:r>
+            <w:r>
+              <w:rPr>
+                <w:noProof/>
+                <w:webHidden/>
+              </w:rPr>
+              <w:instrText xml:space="preserve"> PAGEREF _Toc227625960 \h </w:instrText>
+            </w:r>
+            <w:r>
+              <w:rPr>
+                <w:noProof/>
+                <w:webHidden/>
+              </w:rPr>
+            </w:r>
+            <w:r>
+              <w:rPr>
+                <w:noProof/>
+                <w:webHidden/>
+              </w:rPr>
+              <w:fldChar w:fldCharType="separate"/>
+            </w:r>
+            <w:r>
+              <w:rPr>
+                <w:noProof/>
+                <w:webHidden/>
+              </w:rPr>
+              <w:t>11</w:t>
+            </w:r>
+            <w:r>
+              <w:rPr>
+                <w:noProof/>
+                <w:webHidden/>
+              </w:rPr>
+              <w:fldChar w:fldCharType="end"/>
+            </w:r>
+          </w:hyperlink>
+        </w:p>
+        <w:p>
+          <w:pPr>
+            <w:pStyle w:val="T2"/>
+            <w:rPr>
+              <w:rFonts w:asciiTheme="minorHAnsi" w:eastAsiaTheme="minorEastAsia" w:hAnsiTheme="minorHAnsi" w:cstheme="minorBidi"/>
+              <w:b w:val="0"/>
+              <w:noProof/>
+              <w:kern w:val="2"/>
+              <w:u w:val="none"/>
+              <w:lang w:eastAsia="tr-TR"/>
+              <w14:ligatures w14:val="standardContextual"/>
+            </w:rPr>
+          </w:pPr>
+          <w:hyperlink w:anchor="_Toc227625961" w:history="1">
+            <w:r>
+              <w:rPr>
+                <w:rStyle w:val="Kpr"/>
+                <w:noProof/>
+              </w:rPr>
+              <w:t>Adım 9:  SQL Server Agent Alternatifi Olarak Görev Zamanlayıcı Yapılandırması</w:t>
+            </w:r>
+            <w:r>
+              <w:rPr>
+                <w:noProof/>
+                <w:webHidden/>
+              </w:rPr>
+              <w:tab/>
+            </w:r>
+            <w:r>
+              <w:rPr>
+                <w:noProof/>
+                <w:webHidden/>
+              </w:rPr>
+              <w:fldChar w:fldCharType="begin"/>
+            </w:r>
+            <w:r>
+              <w:rPr>
+                <w:noProof/>
+                <w:webHidden/>
+              </w:rPr>
+              <w:instrText xml:space="preserve"> PAGEREF _Toc227625961 \h </w:instrText>
+            </w:r>
+            <w:r>
+              <w:rPr>
+                <w:noProof/>
+                <w:webHidden/>
+              </w:rPr>
+            </w:r>
+            <w:r>
+              <w:rPr>
+                <w:noProof/>
+                <w:webHidden/>
+              </w:rPr>
+              <w:fldChar w:fldCharType="separate"/>
+            </w:r>
+            <w:r>
+              <w:rPr>
+                <w:noProof/>
+                <w:webHidden/>
+              </w:rPr>
+              <w:t>12</w:t>
+            </w:r>
+            <w:r>
+              <w:rPr>
+                <w:noProof/>
+                <w:webHidden/>
+              </w:rPr>
+              <w:fldChar w:fldCharType="end"/>
+            </w:r>
+          </w:hyperlink>
+        </w:p>
+        <w:p>
+          <w:pPr>
+            <w:pStyle w:val="T2"/>
+            <w:rPr>
+              <w:rFonts w:asciiTheme="minorHAnsi" w:eastAsiaTheme="minorEastAsia" w:hAnsiTheme="minorHAnsi" w:cstheme="minorBidi"/>
+              <w:b w:val="0"/>
+              <w:noProof/>
+              <w:kern w:val="2"/>
+              <w:u w:val="none"/>
+              <w:lang w:eastAsia="tr-TR"/>
+              <w14:ligatures w14:val="standardContextual"/>
+            </w:rPr>
+          </w:pPr>
+          <w:hyperlink w:anchor="_Toc227625962" w:history="1">
+            <w:r>
+              <w:rPr>
+                <w:rStyle w:val="Kpr"/>
+                <w:noProof/>
+              </w:rPr>
+              <w:t>Adım 10: Yedekleme Stratejisi ve Verimlilik Analizi</w:t>
+            </w:r>
+            <w:r>
+              <w:rPr>
+                <w:noProof/>
+                <w:webHidden/>
+              </w:rPr>
+              <w:tab/>
+            </w:r>
+            <w:r>
+              <w:rPr>
+                <w:noProof/>
+                <w:webHidden/>
+              </w:rPr>
+              <w:fldChar w:fldCharType="begin"/>
+            </w:r>
+            <w:r>
+              <w:rPr>
+                <w:noProof/>
+                <w:webHidden/>
+              </w:rPr>
+              <w:instrText xml:space="preserve"> PAGEREF _Toc227625962 \h </w:instrText>
+            </w:r>
+            <w:r>
+              <w:rPr>
+                <w:noProof/>
+                <w:webHidden/>
+              </w:rPr>
+            </w:r>
+            <w:r>
+              <w:rPr>
+                <w:noProof/>
+                <w:webHidden/>
+              </w:rPr>
+              <w:fldChar w:fldCharType="separate"/>
+            </w:r>
+            <w:r>
+              <w:rPr>
+                <w:noProof/>
+                <w:webHidden/>
+              </w:rPr>
+              <w:t>13</w:t>
+            </w:r>
+            <w:r>
+              <w:rPr>
+                <w:noProof/>
+                <w:webHidden/>
+              </w:rPr>
+              <w:fldChar w:fldCharType="end"/>
+            </w:r>
+          </w:hyperlink>
+        </w:p>
+        <w:p>
+          <w:pPr>
+            <w:pStyle w:val="T2"/>
+            <w:rPr>
+              <w:rFonts w:asciiTheme="minorHAnsi" w:eastAsiaTheme="minorEastAsia" w:hAnsiTheme="minorHAnsi" w:cstheme="minorBidi"/>
+              <w:b w:val="0"/>
+              <w:noProof/>
+              <w:kern w:val="2"/>
+              <w:u w:val="none"/>
+              <w:lang w:eastAsia="tr-TR"/>
+              <w14:ligatures w14:val="standardContextual"/>
+            </w:rPr>
+          </w:pPr>
+          <w:hyperlink w:anchor="_Toc227625963" w:history="1">
+            <w:r>
+              <w:rPr>
+                <w:rStyle w:val="Kpr"/>
+                <w:noProof/>
+              </w:rPr>
+              <w:t>Sonuç</w:t>
+            </w:r>
+            <w:r>
+              <w:rPr>
+                <w:noProof/>
+                <w:webHidden/>
+              </w:rPr>
+              <w:tab/>
+            </w:r>
+            <w:r>
+              <w:rPr>
+                <w:noProof/>
+                <w:webHidden/>
+              </w:rPr>
+              <w:fldChar w:fldCharType="begin"/>
+            </w:r>
+            <w:r>
+              <w:rPr>
+                <w:noProof/>
+                <w:webHidden/>
+              </w:rPr>
+              <w:instrText xml:space="preserve"> PAGEREF _Toc227625963 \h </w:instrText>
+            </w:r>
+            <w:r>
+              <w:rPr>
+                <w:noProof/>
+                <w:webHidden/>
+              </w:rPr>
+            </w:r>
+            <w:r>
+              <w:rPr>
+                <w:noProof/>
+                <w:webHidden/>
+              </w:rPr>
+              <w:fldChar w:fldCharType="separate"/>
+            </w:r>
+            <w:r>
+              <w:rPr>
+                <w:noProof/>
+                <w:webHidden/>
+              </w:rPr>
+              <w:t>14</w:t>
+            </w:r>
+            <w:r>
+              <w:rPr>
+                <w:noProof/>
+                <w:webHidden/>
+              </w:rPr>
+              <w:fldChar w:fldCharType="end"/>
+            </w:r>
+          </w:hyperlink>
+        </w:p>
+        <w:p>
+          <w:pPr>
+            <w:spacing w:after="200" w:line="276" w:lineRule="auto"/>
+            <w:jc w:val="both"/>
+          </w:pPr>
+          <w:r>
+            <w:rPr>
+              <w:b/>
+              <w:bCs/>
+            </w:rPr>
+            <w:fldChar w:fldCharType="end"/>
+          </w:r>
+        </w:p>
+      </w:sdtContent>
+    </w:sdt>
     <w:p>
       <w:pPr>
         <w:pStyle w:val="Balk1"/>
@@ -416,15 +1376,48 @@
           <w:color w:val="000000" w:themeColor="text1"/>
         </w:rPr>
       </w:pPr>
-      <w:r>
-        <w:rPr>
+    </w:p>
+    <w:p>
+      <w:pPr>
+        <w:rPr>
+          <w:rFonts w:asciiTheme="majorHAnsi" w:eastAsiaTheme="majorEastAsia" w:hAnsiTheme="majorHAnsi" w:cstheme="majorBidi"/>
           <w:b/>
           <w:bCs/>
           <w:color w:val="000000" w:themeColor="text1"/>
+          <w:sz w:val="40"/>
+          <w:szCs w:val="40"/>
+        </w:rPr>
+      </w:pPr>
+      <w:r>
+        <w:rPr>
+          <w:b/>
+          <w:bCs/>
+          <w:color w:val="000000" w:themeColor="text1"/>
+        </w:rPr>
+        <w:br w:type="page"/>
+      </w:r>
+    </w:p>
+    <w:p>
+      <w:pPr>
+        <w:pStyle w:val="Balk1"/>
+        <w:jc w:val="center"/>
+        <w:rPr>
+          <w:b/>
+          <w:bCs/>
+          <w:color w:val="000000" w:themeColor="text1"/>
+        </w:rPr>
+      </w:pPr>
+      <w:bookmarkStart w:id="1" w:name="_Toc227625952"/>
+      <w:r>
+        <w:rPr>
+          <w:b/>
+          <w:bCs/>
+          <w:color w:val="000000" w:themeColor="text1"/>
         </w:rPr>
         <w:lastRenderedPageBreak/>
         <w:t>Proje 2: Yedekleme ve Felaketten Kurtarma</w:t>
       </w:r>
+      <w:bookmarkEnd w:id="1"/>
     </w:p>
     <w:p>
       <w:r>
@@ -433,25 +1426,16 @@
     </w:p>
     <w:p>
       <w:pPr>
-        <w:rPr>
-          <w:b/>
-          <w:bCs/>
-        </w:rPr>
+        <w:pStyle w:val="Balk2"/>
       </w:pPr>
-      <w:r>
-        <w:rPr>
-          <w:b/>
-          <w:bCs/>
-        </w:rPr>
+      <w:bookmarkStart w:id="2" w:name="_Toc227625953"/>
+      <w:r>
         <w:t xml:space="preserve">Adım 1: </w:t>
       </w:r>
       <w:r>
-        <w:rPr>
-          <w:b/>
-          <w:bCs/>
-        </w:rPr>
         <w:t>Veri Kaynağı Kurulumu ve Tablo Yapılarının Doğrulanması</w:t>
       </w:r>
+      <w:bookmarkEnd w:id="2"/>
     </w:p>
     <w:p>
       <w:proofErr w:type="spellStart"/>
@@ -521,34 +1505,21 @@
     </w:p>
     <w:p>
       <w:pPr>
-        <w:rPr>
-          <w:b/>
-          <w:bCs/>
-        </w:rPr>
+        <w:pStyle w:val="Balk2"/>
       </w:pPr>
-      <w:r>
-        <w:rPr>
-          <w:b/>
-          <w:bCs/>
-        </w:rPr>
+      <w:bookmarkStart w:id="3" w:name="_Toc227625954"/>
+      <w:r>
         <w:t xml:space="preserve">Adım 2: Manuel Tam Yedek (Full </w:t>
       </w:r>
       <w:proofErr w:type="spellStart"/>
       <w:r>
-        <w:rPr>
-          <w:b/>
-          <w:bCs/>
-        </w:rPr>
         <w:t>Backup</w:t>
       </w:r>
       <w:proofErr w:type="spellEnd"/>
       <w:r>
-        <w:rPr>
-          <w:b/>
-          <w:bCs/>
-        </w:rPr>
         <w:t>) ve Doğrulama Testi</w:t>
       </w:r>
+      <w:bookmarkEnd w:id="3"/>
     </w:p>
     <w:p>
       <w:r>
@@ -612,41 +1583,36 @@
       </w:r>
     </w:p>
     <w:p/>
-    <w:p>
-      <w:r>
+    <w:p/>
+    <w:p/>
+    <w:p/>
+    <w:p/>
+    <w:p/>
+    <w:p/>
+    <w:p/>
+    <w:p>
+      <w:r>
+        <w:lastRenderedPageBreak/>
         <w:t>05.04.2026</w:t>
       </w:r>
     </w:p>
     <w:p>
       <w:pPr>
-        <w:rPr>
-          <w:b/>
-          <w:bCs/>
-        </w:rPr>
+        <w:pStyle w:val="Balk2"/>
       </w:pPr>
-      <w:r>
-        <w:rPr>
-          <w:b/>
-          <w:bCs/>
-        </w:rPr>
+      <w:bookmarkStart w:id="4" w:name="_Toc227625955"/>
+      <w:r>
         <w:t>Adım 3: Fark (</w:t>
       </w:r>
       <w:proofErr w:type="spellStart"/>
       <w:r>
-        <w:rPr>
-          <w:b/>
-          <w:bCs/>
-        </w:rPr>
         <w:t>Differential</w:t>
       </w:r>
       <w:proofErr w:type="spellEnd"/>
       <w:r>
-        <w:rPr>
-          <w:b/>
-          <w:bCs/>
-        </w:rPr>
         <w:t>) Yedeği Alma ve Karşılaştığım Sorun</w:t>
       </w:r>
+      <w:bookmarkEnd w:id="4"/>
     </w:p>
     <w:p>
       <w:proofErr w:type="spellStart"/>
@@ -685,7 +1651,6 @@
         <w:rPr>
           <w:noProof/>
         </w:rPr>
-        <w:lastRenderedPageBreak/>
         <mc:AlternateContent>
           <mc:Choice Requires="wps">
             <w:drawing>
@@ -860,9 +1825,9 @@
           <w:noProof/>
         </w:rPr>
         <w:drawing>
-          <wp:inline distT="0" distB="0" distL="0" distR="0" wp14:anchorId="0B061E99" wp14:editId="5E515999">
-            <wp:extent cx="5760720" cy="4980940"/>
-            <wp:effectExtent l="0" t="0" r="0" b="0"/>
+          <wp:inline distT="0" distB="0" distL="0" distR="0" wp14:anchorId="0B061E99" wp14:editId="5D651CAA">
+            <wp:extent cx="4565099" cy="3947160"/>
+            <wp:effectExtent l="0" t="0" r="6985" b="0"/>
             <wp:docPr id="512965887" name="Resim 1" descr="metin, ekran görüntüsü, yazılım, bilgisayar simgesi içeren bir resim&#10;&#10;Yapay zeka tarafından oluşturulmuş içerik yanlış olabilir."/>
             <wp:cNvGraphicFramePr>
               <a:graphicFrameLocks xmlns:a="http://schemas.openxmlformats.org/drawingml/2006/main" noChangeAspect="1"/>
@@ -883,7 +1848,7 @@
                   <pic:spPr>
                     <a:xfrm>
                       <a:off x="0" y="0"/>
-                      <a:ext cx="5760720" cy="4980940"/>
+                      <a:ext cx="4571140" cy="3952383"/>
                     </a:xfrm>
                     <a:prstGeom prst="rect">
                       <a:avLst/>
@@ -901,18 +1866,18 @@
     <w:p/>
     <w:p>
       <w:r>
-        <w:lastRenderedPageBreak/>
         <w:t>05.04.2026</w:t>
       </w:r>
     </w:p>
     <w:p>
-      <w:r>
-        <w:rPr>
-          <w:b/>
-          <w:bCs/>
-        </w:rPr>
+      <w:pPr>
+        <w:pStyle w:val="Balk2"/>
+      </w:pPr>
+      <w:bookmarkStart w:id="5" w:name="_Toc227625956"/>
+      <w:r>
         <w:t>Adım 4: Otomatik Yedekleme Stratejisi ve Alternatif Çözüm</w:t>
       </w:r>
+      <w:bookmarkEnd w:id="5"/>
     </w:p>
     <w:p>
       <w:r>
@@ -987,7 +1952,6 @@
     <w:p/>
     <w:p/>
     <w:p/>
-    <w:p/>
     <w:p>
       <w:r>
         <w:lastRenderedPageBreak/>
@@ -996,18 +1960,13 @@
     </w:p>
     <w:p>
       <w:pPr>
-        <w:rPr>
-          <w:b/>
-          <w:bCs/>
-        </w:rPr>
+        <w:pStyle w:val="Balk2"/>
       </w:pPr>
-      <w:r>
-        <w:rPr>
-          <w:b/>
-          <w:bCs/>
-        </w:rPr>
+      <w:bookmarkStart w:id="6" w:name="_Toc227625957"/>
+      <w:r>
         <w:t>Adım 5: Kurtarma Modu Değişimi ve Karşılaşılan Log Hatası</w:t>
       </w:r>
+      <w:bookmarkEnd w:id="6"/>
     </w:p>
     <w:p>
       <w:proofErr w:type="spellStart"/>
@@ -1229,32 +2188,28 @@
       </w:r>
     </w:p>
     <w:p/>
-    <w:p>
-      <w:r>
+    <w:p/>
+    <w:p/>
+    <w:p/>
+    <w:p/>
+    <w:p>
+      <w:r>
+        <w:lastRenderedPageBreak/>
         <w:t>06.04.2026</w:t>
       </w:r>
     </w:p>
     <w:p>
       <w:pPr>
-        <w:rPr>
-          <w:b/>
-          <w:bCs/>
-        </w:rPr>
+        <w:pStyle w:val="Balk2"/>
       </w:pPr>
-      <w:r>
-        <w:rPr>
-          <w:b/>
-          <w:bCs/>
-        </w:rPr>
+      <w:bookmarkStart w:id="7" w:name="_Toc227625958"/>
+      <w:r>
         <w:t xml:space="preserve">Adım 6: </w:t>
       </w:r>
       <w:r>
-        <w:rPr>
-          <w:b/>
-          <w:bCs/>
-        </w:rPr>
         <w:t>Felaket Senaryosu ve Kurtarma İşlemi</w:t>
       </w:r>
+      <w:bookmarkEnd w:id="7"/>
     </w:p>
     <w:p>
       <w:r>
@@ -1274,7 +2229,6 @@
         <w:rPr>
           <w:noProof/>
         </w:rPr>
-        <w:lastRenderedPageBreak/>
         <w:drawing>
           <wp:inline distT="0" distB="0" distL="0" distR="0" wp14:anchorId="3118AE11" wp14:editId="453A466F">
             <wp:extent cx="5760720" cy="5292725"/>
@@ -1319,9 +2273,6 @@
     <w:p/>
     <w:p/>
     <w:p/>
-    <w:p/>
-    <w:p/>
-    <w:p/>
     <w:p>
       <w:r>
         <w:lastRenderedPageBreak/>
@@ -1478,18 +2429,13 @@
     </w:p>
     <w:p>
       <w:pPr>
-        <w:rPr>
-          <w:b/>
-          <w:bCs/>
-        </w:rPr>
+        <w:pStyle w:val="Balk2"/>
       </w:pPr>
-      <w:r>
-        <w:rPr>
-          <w:b/>
-          <w:bCs/>
-        </w:rPr>
+      <w:bookmarkStart w:id="8" w:name="_Toc227625959"/>
+      <w:r>
         <w:t>Adım 7: Yedekleme Planı Tablosu</w:t>
       </w:r>
+      <w:bookmarkEnd w:id="8"/>
     </w:p>
     <w:tbl>
       <w:tblPr>
@@ -1715,57 +2661,32 @@
     </w:p>
     <w:p>
       <w:pPr>
-        <w:rPr>
-          <w:b/>
-          <w:bCs/>
-        </w:rPr>
+        <w:pStyle w:val="Balk2"/>
       </w:pPr>
-      <w:r>
-        <w:rPr>
-          <w:b/>
-          <w:bCs/>
-        </w:rPr>
+      <w:bookmarkStart w:id="9" w:name="_Toc227625960"/>
+      <w:r>
         <w:t xml:space="preserve">Adım 8: </w:t>
       </w:r>
       <w:r>
-        <w:rPr>
-          <w:b/>
-          <w:bCs/>
-        </w:rPr>
         <w:t xml:space="preserve">Tam Felaket </w:t>
       </w:r>
       <w:proofErr w:type="gramStart"/>
       <w:r>
-        <w:rPr>
-          <w:b/>
-          <w:bCs/>
-        </w:rPr>
         <w:t>Senaryosu -</w:t>
       </w:r>
       <w:proofErr w:type="gramEnd"/>
       <w:r>
-        <w:rPr>
-          <w:b/>
-          <w:bCs/>
-        </w:rPr>
         <w:t xml:space="preserve"> </w:t>
       </w:r>
       <w:proofErr w:type="spellStart"/>
       <w:r>
-        <w:rPr>
-          <w:b/>
-          <w:bCs/>
-        </w:rPr>
         <w:t>Veritabanı</w:t>
       </w:r>
       <w:proofErr w:type="spellEnd"/>
       <w:r>
-        <w:rPr>
-          <w:b/>
-          <w:bCs/>
-        </w:rPr>
         <w:t xml:space="preserve"> Silme ve Full Restore</w:t>
       </w:r>
+      <w:bookmarkEnd w:id="9"/>
     </w:p>
     <w:p>
       <w:r>
@@ -1929,41 +2850,24 @@
     </w:p>
     <w:p>
       <w:pPr>
-        <w:rPr>
-          <w:b/>
-          <w:bCs/>
-        </w:rPr>
+        <w:pStyle w:val="Balk2"/>
       </w:pPr>
-      <w:r>
-        <w:rPr>
-          <w:b/>
-          <w:bCs/>
-        </w:rPr>
+      <w:bookmarkStart w:id="10" w:name="_Toc227625961"/>
+      <w:r>
         <w:t xml:space="preserve">Adım </w:t>
       </w:r>
       <w:proofErr w:type="gramStart"/>
       <w:r>
-        <w:rPr>
-          <w:b/>
-          <w:bCs/>
-        </w:rPr>
         <w:t xml:space="preserve">9: </w:t>
       </w:r>
       <w:r>
-        <w:rPr>
-          <w:b/>
-          <w:bCs/>
-        </w:rPr>
         <w:t xml:space="preserve"> SQL</w:t>
       </w:r>
       <w:proofErr w:type="gramEnd"/>
       <w:r>
-        <w:rPr>
-          <w:b/>
-          <w:bCs/>
-        </w:rPr>
         <w:t xml:space="preserve"> Server Agent Alternatifi Olarak Görev Zamanlayıcı Yapılandırması</w:t>
       </w:r>
+      <w:bookmarkEnd w:id="10"/>
     </w:p>
     <w:p>
       <w:r>
@@ -2145,18 +3049,13 @@
     </w:p>
     <w:p>
       <w:pPr>
-        <w:rPr>
-          <w:b/>
-          <w:bCs/>
-        </w:rPr>
+        <w:pStyle w:val="Balk2"/>
       </w:pPr>
-      <w:r>
-        <w:rPr>
-          <w:b/>
-          <w:bCs/>
-        </w:rPr>
+      <w:bookmarkStart w:id="11" w:name="_Toc227625962"/>
+      <w:r>
         <w:t>Adım 10: Yedekleme Stratejisi ve Verimlilik Analizi</w:t>
       </w:r>
+      <w:bookmarkEnd w:id="11"/>
     </w:p>
     <w:p>
       <w:r>
@@ -2414,6 +3313,52 @@
         </w:drawing>
       </w:r>
     </w:p>
+    <w:p/>
+    <w:p>
+      <w:pPr>
+        <w:pStyle w:val="Balk2"/>
+      </w:pPr>
+      <w:bookmarkStart w:id="12" w:name="_Toc227625963"/>
+      <w:r>
+        <w:t>Sonuç</w:t>
+      </w:r>
+      <w:bookmarkEnd w:id="12"/>
+    </w:p>
+    <w:p>
+      <w:r>
+        <w:t xml:space="preserve">Bu projede </w:t>
+      </w:r>
+      <w:proofErr w:type="spellStart"/>
+      <w:r>
+        <w:t>veritabanı</w:t>
+      </w:r>
+      <w:proofErr w:type="spellEnd"/>
+      <w:r>
+        <w:t xml:space="preserve"> yedekleme ve felaketten kurtarma işlemlerini adım adım uyguladım. Full, </w:t>
+      </w:r>
+      <w:proofErr w:type="spellStart"/>
+      <w:r>
+        <w:t>differential</w:t>
+      </w:r>
+      <w:proofErr w:type="spellEnd"/>
+      <w:r>
+        <w:t xml:space="preserve"> ve log yedekleri alarak veri kaybını en aza indirecek bir yapı kurdum. Ayrıca farklı hatalarla karşılaşıp çözerek süreci daha iyi anladım.</w:t>
+      </w:r>
+    </w:p>
+    <w:p>
+      <w:r>
+        <w:t xml:space="preserve">Oluşturduğum felaket senaryolarında </w:t>
+      </w:r>
+      <w:proofErr w:type="spellStart"/>
+      <w:r>
+        <w:t>veritabanını</w:t>
+      </w:r>
+      <w:proofErr w:type="spellEnd"/>
+      <w:r>
+        <w:t xml:space="preserve"> başarıyla geri yükleyebildim ve sistemin güvenilir çalıştığını gördüm. Genel olarak, düzenli yedek almanın ve doğru strateji kurmanın veri güvenliği açısından ne kadar önemli olduğunu deneyimlemiş oldum.</w:t>
+      </w:r>
+    </w:p>
+    <w:p/>
     <w:sectPr>
       <w:pgSz w:w="11906" w:h="16838"/>
       <w:pgMar w:top="1417" w:right="1417" w:bottom="1417" w:left="1417" w:header="708" w:footer="708" w:gutter="0"/>
@@ -2620,8 +3565,8 @@
     <w:lsdException w:name="index 7" w:semiHidden="1" w:unhideWhenUsed="1"/>
     <w:lsdException w:name="index 8" w:semiHidden="1" w:unhideWhenUsed="1"/>
     <w:lsdException w:name="index 9" w:semiHidden="1" w:unhideWhenUsed="1"/>
-    <w:lsdException w:name="toc 1" w:semiHidden="1" w:uiPriority="39" w:unhideWhenUsed="1"/>
-    <w:lsdException w:name="toc 2" w:semiHidden="1" w:uiPriority="39" w:unhideWhenUsed="1"/>
+    <w:lsdException w:name="toc 1" w:semiHidden="1" w:uiPriority="39" w:unhideWhenUsed="1" w:qFormat="1"/>
+    <w:lsdException w:name="toc 2" w:semiHidden="1" w:uiPriority="39" w:unhideWhenUsed="1" w:qFormat="1"/>
     <w:lsdException w:name="toc 3" w:semiHidden="1" w:uiPriority="39" w:unhideWhenUsed="1"/>
     <w:lsdException w:name="toc 4" w:semiHidden="1" w:uiPriority="39" w:unhideWhenUsed="1"/>
     <w:lsdException w:name="toc 5" w:semiHidden="1" w:uiPriority="39" w:unhideWhenUsed="1"/>
@@ -3009,10 +3954,9 @@
     <w:next w:val="Normal"/>
     <w:link w:val="Balk2Char"/>
     <w:uiPriority w:val="9"/>
-    <w:semiHidden/>
     <w:unhideWhenUsed/>
     <w:qFormat/>
-    <w:rsid w:val="00641875"/>
+    <w:rsid w:val="0087436A"/>
     <w:pPr>
       <w:keepNext/>
       <w:keepLines/>
@@ -3021,8 +3965,8 @@
     </w:pPr>
     <w:rPr>
       <w:rFonts w:asciiTheme="majorHAnsi" w:eastAsiaTheme="majorEastAsia" w:hAnsiTheme="majorHAnsi" w:cstheme="majorBidi"/>
-      <w:color w:val="0F4761" w:themeColor="accent1" w:themeShade="BF"/>
-      <w:sz w:val="32"/>
+      <w:color w:val="000000" w:themeColor="text1"/>
+      <w:sz w:val="28"/>
       <w:szCs w:val="32"/>
     </w:rPr>
   </w:style>
@@ -3032,7 +3976,6 @@
     <w:next w:val="Normal"/>
     <w:link w:val="Balk3Char"/>
     <w:uiPriority w:val="9"/>
-    <w:semiHidden/>
     <w:unhideWhenUsed/>
     <w:qFormat/>
     <w:rsid w:val="00641875"/>
@@ -3184,7 +4127,6 @@
   <w:style w:type="character" w:default="1" w:styleId="VarsaylanParagrafYazTipi">
     <w:name w:val="Default Paragraph Font"/>
     <w:uiPriority w:val="1"/>
-    <w:semiHidden/>
     <w:unhideWhenUsed/>
   </w:style>
   <w:style w:type="table" w:default="1" w:styleId="NormalTablo">
@@ -3226,12 +4168,11 @@
     <w:basedOn w:val="VarsaylanParagrafYazTipi"/>
     <w:link w:val="Balk2"/>
     <w:uiPriority w:val="9"/>
-    <w:semiHidden/>
-    <w:rsid w:val="00641875"/>
+    <w:rsid w:val="0087436A"/>
     <w:rPr>
       <w:rFonts w:asciiTheme="majorHAnsi" w:eastAsiaTheme="majorEastAsia" w:hAnsiTheme="majorHAnsi" w:cstheme="majorBidi"/>
-      <w:color w:val="0F4761" w:themeColor="accent1" w:themeShade="BF"/>
-      <w:sz w:val="32"/>
+      <w:color w:val="000000" w:themeColor="text1"/>
+      <w:sz w:val="28"/>
       <w:szCs w:val="32"/>
     </w:rPr>
   </w:style>
@@ -3561,6 +4502,107 @@
       </w:tcPr>
     </w:tblStylePr>
   </w:style>
+  <w:style w:type="paragraph" w:styleId="TBal">
+    <w:name w:val="TOC Heading"/>
+    <w:basedOn w:val="Balk1"/>
+    <w:next w:val="Normal"/>
+    <w:uiPriority w:val="39"/>
+    <w:unhideWhenUsed/>
+    <w:qFormat/>
+    <w:rsid w:val="0087436A"/>
+    <w:pPr>
+      <w:spacing w:before="480" w:after="0" w:line="276" w:lineRule="auto"/>
+      <w:ind w:left="432" w:hanging="432"/>
+      <w:jc w:val="center"/>
+      <w:outlineLvl w:val="9"/>
+    </w:pPr>
+    <w:rPr>
+      <w:rFonts w:ascii="Arial" w:eastAsia="MS Gothic" w:hAnsi="Arial" w:cs="Times New Roman"/>
+      <w:b/>
+      <w:bCs/>
+      <w:color w:val="000000" w:themeColor="text1"/>
+      <w:kern w:val="0"/>
+      <w:sz w:val="24"/>
+      <w:szCs w:val="28"/>
+      <w:lang w:val="en-US" w:eastAsia="ja-JP"/>
+      <w14:ligatures w14:val="none"/>
+    </w:rPr>
+  </w:style>
+  <w:style w:type="paragraph" w:styleId="T2">
+    <w:name w:val="toc 2"/>
+    <w:basedOn w:val="Normal"/>
+    <w:next w:val="Normal"/>
+    <w:link w:val="T2Char"/>
+    <w:autoRedefine/>
+    <w:uiPriority w:val="39"/>
+    <w:unhideWhenUsed/>
+    <w:qFormat/>
+    <w:rsid w:val="0087436A"/>
+    <w:pPr>
+      <w:tabs>
+        <w:tab w:val="right" w:leader="dot" w:pos="9071"/>
+      </w:tabs>
+      <w:spacing w:after="100" w:line="276" w:lineRule="auto"/>
+      <w:ind w:left="216"/>
+      <w:jc w:val="both"/>
+    </w:pPr>
+    <w:rPr>
+      <w:rFonts w:ascii="Arial" w:eastAsia="MS Mincho" w:hAnsi="Arial" w:cs="Arial"/>
+      <w:b/>
+      <w:kern w:val="0"/>
+      <w:u w:val="single"/>
+      <w:lang w:eastAsia="ja-JP"/>
+      <w14:ligatures w14:val="none"/>
+    </w:rPr>
+  </w:style>
+  <w:style w:type="paragraph" w:styleId="T1">
+    <w:name w:val="toc 1"/>
+    <w:basedOn w:val="Normal"/>
+    <w:next w:val="Normal"/>
+    <w:autoRedefine/>
+    <w:uiPriority w:val="39"/>
+    <w:unhideWhenUsed/>
+    <w:qFormat/>
+    <w:rsid w:val="0087436A"/>
+    <w:pPr>
+      <w:spacing w:after="100" w:line="276" w:lineRule="auto"/>
+      <w:jc w:val="both"/>
+    </w:pPr>
+    <w:rPr>
+      <w:rFonts w:ascii="Arial" w:eastAsia="MS Mincho" w:hAnsi="Arial" w:cs="Arial"/>
+      <w:b/>
+      <w:kern w:val="0"/>
+      <w:szCs w:val="22"/>
+      <w:lang w:val="en-US" w:eastAsia="ja-JP"/>
+      <w14:ligatures w14:val="none"/>
+    </w:rPr>
+  </w:style>
+  <w:style w:type="character" w:customStyle="1" w:styleId="T2Char">
+    <w:name w:val="İÇT 2 Char"/>
+    <w:basedOn w:val="VarsaylanParagrafYazTipi"/>
+    <w:link w:val="T2"/>
+    <w:uiPriority w:val="39"/>
+    <w:rsid w:val="0087436A"/>
+    <w:rPr>
+      <w:rFonts w:ascii="Arial" w:eastAsia="MS Mincho" w:hAnsi="Arial" w:cs="Arial"/>
+      <w:b/>
+      <w:kern w:val="0"/>
+      <w:u w:val="single"/>
+      <w:lang w:eastAsia="ja-JP"/>
+      <w14:ligatures w14:val="none"/>
+    </w:rPr>
+  </w:style>
+  <w:style w:type="character" w:styleId="Kpr">
+    <w:name w:val="Hyperlink"/>
+    <w:basedOn w:val="VarsaylanParagrafYazTipi"/>
+    <w:uiPriority w:val="99"/>
+    <w:unhideWhenUsed/>
+    <w:rsid w:val="0087436A"/>
+    <w:rPr>
+      <w:color w:val="467886" w:themeColor="hyperlink"/>
+      <w:u w:val="single"/>
+    </w:rPr>
+  </w:style>
 </w:styles>
 </file>
 

</xml_diff>